<commit_message>
docs(report): balance team workload allocation
</commit_message>
<xml_diff>
--- a/Gold红酒销售管理系统大作业文档.docx
+++ b/Gold红酒销售管理系统大作业文档.docx
@@ -590,7 +590,7 @@
       <w:r>
         <w:fldChar w:fldCharType="separate"/>
       </w:r>
-      <w:hyperlink w:anchor="_Toc235133830" w:history="1">
+      <w:hyperlink w:anchor="_Toc235135515" w:history="1">
         <w:r>
           <w:rPr>
             <w:rStyle w:val="af5"/>
@@ -617,7 +617,7 @@
             <w:noProof/>
             <w:webHidden/>
           </w:rPr>
-          <w:instrText xml:space="preserve"> PAGEREF _Toc235133830 \h </w:instrText>
+          <w:instrText xml:space="preserve"> PAGEREF _Toc235135515 \h </w:instrText>
         </w:r>
         <w:r>
           <w:rPr>
@@ -661,7 +661,7 @@
           <w14:ligatures w14:val="standardContextual"/>
         </w:rPr>
       </w:pPr>
-      <w:hyperlink w:anchor="_Toc235133831" w:history="1">
+      <w:hyperlink w:anchor="_Toc235135516" w:history="1">
         <w:r>
           <w:rPr>
             <w:rStyle w:val="af5"/>
@@ -688,7 +688,7 @@
             <w:noProof/>
             <w:webHidden/>
           </w:rPr>
-          <w:instrText xml:space="preserve"> PAGEREF _Toc235133831 \h </w:instrText>
+          <w:instrText xml:space="preserve"> PAGEREF _Toc235135516 \h </w:instrText>
         </w:r>
         <w:r>
           <w:rPr>
@@ -732,7 +732,7 @@
           <w14:ligatures w14:val="standardContextual"/>
         </w:rPr>
       </w:pPr>
-      <w:hyperlink w:anchor="_Toc235133832" w:history="1">
+      <w:hyperlink w:anchor="_Toc235135517" w:history="1">
         <w:r>
           <w:rPr>
             <w:rStyle w:val="af5"/>
@@ -759,7 +759,7 @@
             <w:noProof/>
             <w:webHidden/>
           </w:rPr>
-          <w:instrText xml:space="preserve"> PAGEREF _Toc235133832 \h </w:instrText>
+          <w:instrText xml:space="preserve"> PAGEREF _Toc235135517 \h </w:instrText>
         </w:r>
         <w:r>
           <w:rPr>
@@ -803,7 +803,7 @@
           <w14:ligatures w14:val="standardContextual"/>
         </w:rPr>
       </w:pPr>
-      <w:hyperlink w:anchor="_Toc235133833" w:history="1">
+      <w:hyperlink w:anchor="_Toc235135518" w:history="1">
         <w:r>
           <w:rPr>
             <w:rStyle w:val="af5"/>
@@ -830,7 +830,7 @@
             <w:noProof/>
             <w:webHidden/>
           </w:rPr>
-          <w:instrText xml:space="preserve"> PAGEREF _Toc235133833 \h </w:instrText>
+          <w:instrText xml:space="preserve"> PAGEREF _Toc235135518 \h </w:instrText>
         </w:r>
         <w:r>
           <w:rPr>
@@ -874,7 +874,7 @@
           <w14:ligatures w14:val="standardContextual"/>
         </w:rPr>
       </w:pPr>
-      <w:hyperlink w:anchor="_Toc235133834" w:history="1">
+      <w:hyperlink w:anchor="_Toc235135519" w:history="1">
         <w:r>
           <w:rPr>
             <w:rStyle w:val="af5"/>
@@ -901,7 +901,7 @@
             <w:noProof/>
             <w:webHidden/>
           </w:rPr>
-          <w:instrText xml:space="preserve"> PAGEREF _Toc235133834 \h </w:instrText>
+          <w:instrText xml:space="preserve"> PAGEREF _Toc235135519 \h </w:instrText>
         </w:r>
         <w:r>
           <w:rPr>
@@ -945,7 +945,7 @@
           <w14:ligatures w14:val="standardContextual"/>
         </w:rPr>
       </w:pPr>
-      <w:hyperlink w:anchor="_Toc235133835" w:history="1">
+      <w:hyperlink w:anchor="_Toc235135520" w:history="1">
         <w:r>
           <w:rPr>
             <w:rStyle w:val="af5"/>
@@ -972,7 +972,7 @@
             <w:noProof/>
             <w:webHidden/>
           </w:rPr>
-          <w:instrText xml:space="preserve"> PAGEREF _Toc235133835 \h </w:instrText>
+          <w:instrText xml:space="preserve"> PAGEREF _Toc235135520 \h </w:instrText>
         </w:r>
         <w:r>
           <w:rPr>
@@ -1021,7 +1021,7 @@
       <w:pPr>
         <w:pStyle w:val="11"/>
       </w:pPr>
-      <w:bookmarkStart w:id="0" w:name="_Toc235133830"/>
+      <w:bookmarkStart w:id="0" w:name="_Toc235135515"/>
       <w:r>
         <w:t xml:space="preserve">1 </w:t>
       </w:r>
@@ -1088,7 +1088,7 @@
           <w:noProof/>
         </w:rPr>
         <w:drawing>
-          <wp:inline distT="0" distB="0" distL="0" distR="0" wp14:anchorId="34EE6C24" wp14:editId="39B77646">
+          <wp:inline distT="0" distB="0" distL="0" distR="0" wp14:anchorId="7F9065A9" wp14:editId="61990A37">
             <wp:extent cx="5303520" cy="3489158"/>
             <wp:effectExtent l="0" t="0" r="0" b="0"/>
             <wp:docPr id="1" name="Picture 1" descr="图 1-1  系统主要类图" title="图 1-1  系统主要类图"/>
@@ -3838,7 +3838,7 @@
       <w:pPr>
         <w:pStyle w:val="11"/>
       </w:pPr>
-      <w:bookmarkStart w:id="1" w:name="_Toc235133831"/>
+      <w:bookmarkStart w:id="1" w:name="_Toc235135516"/>
       <w:r>
         <w:t xml:space="preserve">2 </w:t>
       </w:r>
@@ -11318,7 +11318,7 @@
       <w:pPr>
         <w:pStyle w:val="11"/>
       </w:pPr>
-      <w:bookmarkStart w:id="2" w:name="_Toc235133832"/>
+      <w:bookmarkStart w:id="2" w:name="_Toc235135517"/>
       <w:r>
         <w:t xml:space="preserve">3 </w:t>
       </w:r>
@@ -11366,7 +11366,7 @@
           <w:noProof/>
         </w:rPr>
         <w:drawing>
-          <wp:inline distT="0" distB="0" distL="0" distR="0" wp14:anchorId="4E412E90" wp14:editId="35A42547">
+          <wp:inline distT="0" distB="0" distL="0" distR="0" wp14:anchorId="4729C9B4" wp14:editId="292BE38C">
             <wp:extent cx="5303520" cy="2930893"/>
             <wp:effectExtent l="0" t="0" r="0" b="0"/>
             <wp:docPr id="2" name="Picture 2" descr="图 3-1  系统功能结构" title="图 3-1  系统功能结构"/>
@@ -11561,7 +11561,7 @@
           <w:noProof/>
         </w:rPr>
         <w:drawing>
-          <wp:inline distT="0" distB="0" distL="0" distR="0" wp14:anchorId="7536DBE6" wp14:editId="549EEEDB">
+          <wp:inline distT="0" distB="0" distL="0" distR="0" wp14:anchorId="13C52D95" wp14:editId="0E7257B1">
             <wp:extent cx="5303520" cy="2946400"/>
             <wp:effectExtent l="0" t="0" r="0" b="0"/>
             <wp:docPr id="3" name="Picture 3" descr="图 3-2  购买结算与取消订单流程" title="图 3-2  购买结算与取消订单流程"/>
@@ -11827,7 +11827,7 @@
       <w:pPr>
         <w:pStyle w:val="11"/>
       </w:pPr>
-      <w:bookmarkStart w:id="3" w:name="_Toc235133833"/>
+      <w:bookmarkStart w:id="3" w:name="_Toc235135518"/>
       <w:r>
         <w:t xml:space="preserve">4 </w:t>
       </w:r>
@@ -12824,7 +12824,7 @@
       <w:pPr>
         <w:pStyle w:val="11"/>
       </w:pPr>
-      <w:bookmarkStart w:id="4" w:name="_Toc235133834"/>
+      <w:bookmarkStart w:id="4" w:name="_Toc235135519"/>
       <w:r>
         <w:t xml:space="preserve">5 </w:t>
       </w:r>
@@ -12932,7 +12932,7 @@
           <w:noProof/>
         </w:rPr>
         <w:drawing>
-          <wp:inline distT="0" distB="0" distL="0" distR="0" wp14:anchorId="703E1B67" wp14:editId="19AE2213">
+          <wp:inline distT="0" distB="0" distL="0" distR="0" wp14:anchorId="539ADB5F" wp14:editId="76DE9C95">
             <wp:extent cx="5303520" cy="1038606"/>
             <wp:effectExtent l="0" t="0" r="0" b="0"/>
             <wp:docPr id="4" name="Picture 4" descr="图 5-1  系统启动与主菜单" title="图 5-1  系统启动与主菜单"/>
@@ -13031,7 +13031,7 @@
           <w:noProof/>
         </w:rPr>
         <w:drawing>
-          <wp:inline distT="0" distB="0" distL="0" distR="0" wp14:anchorId="485DFCDB" wp14:editId="58BA421C">
+          <wp:inline distT="0" distB="0" distL="0" distR="0" wp14:anchorId="5529EE7F" wp14:editId="44AF6D68">
             <wp:extent cx="5303520" cy="1264006"/>
             <wp:effectExtent l="0" t="0" r="0" b="0"/>
             <wp:docPr id="5" name="Picture 5" descr="图 5-2  红酒信息查询结果" title="图 5-2  红酒信息查询结果"/>
@@ -13118,7 +13118,7 @@
           <w:noProof/>
         </w:rPr>
         <w:drawing>
-          <wp:inline distT="0" distB="0" distL="0" distR="0" wp14:anchorId="7C87233B" wp14:editId="675F8053">
+          <wp:inline distT="0" distB="0" distL="0" distR="0" wp14:anchorId="1904FE82" wp14:editId="6FA47EE4">
             <wp:extent cx="5303520" cy="662940"/>
             <wp:effectExtent l="0" t="0" r="0" b="0"/>
             <wp:docPr id="6" name="Picture 6" descr="图 5-3  新增演示客户" title="图 5-3  新增演示客户"/>
@@ -13217,7 +13217,7 @@
           <w:noProof/>
         </w:rPr>
         <w:drawing>
-          <wp:inline distT="0" distB="0" distL="0" distR="0" wp14:anchorId="55CACD96" wp14:editId="603DE0BC">
+          <wp:inline distT="0" distB="0" distL="0" distR="0" wp14:anchorId="14A4DD7A" wp14:editId="13D1537C">
             <wp:extent cx="5303520" cy="662940"/>
             <wp:effectExtent l="0" t="0" r="0" b="0"/>
             <wp:docPr id="7" name="Picture 7" descr="图 5-4  创建购买订单并计算折扣" title="图 5-4  创建购买订单并计算折扣"/>
@@ -13340,7 +13340,7 @@
           <w:noProof/>
         </w:rPr>
         <w:drawing>
-          <wp:inline distT="0" distB="0" distL="0" distR="0" wp14:anchorId="40E3860E" wp14:editId="739AA74B">
+          <wp:inline distT="0" distB="0" distL="0" distR="0" wp14:anchorId="607C7E6F" wp14:editId="230B3F9E">
             <wp:extent cx="5303520" cy="1489405"/>
             <wp:effectExtent l="0" t="0" r="0" b="0"/>
             <wp:docPr id="8" name="Picture 8" descr="图 5-5  订单主表与订单明细" title="图 5-5  订单主表与订单明细"/>
@@ -13427,7 +13427,7 @@
           <w:noProof/>
         </w:rPr>
         <w:drawing>
-          <wp:inline distT="0" distB="0" distL="0" distR="0" wp14:anchorId="0F10CAC8" wp14:editId="124008BE">
+          <wp:inline distT="0" distB="0" distL="0" distR="0" wp14:anchorId="01945B55" wp14:editId="33807192">
             <wp:extent cx="5303520" cy="662940"/>
             <wp:effectExtent l="0" t="0" r="0" b="0"/>
             <wp:docPr id="9" name="Picture 9" descr="图 5-6  取消订单并恢复库存" title="图 5-6  取消订单并恢复库存"/>
@@ -13514,7 +13514,7 @@
           <w:noProof/>
         </w:rPr>
         <w:drawing>
-          <wp:inline distT="0" distB="0" distL="0" distR="0" wp14:anchorId="3D9C0956" wp14:editId="261EF771">
+          <wp:inline distT="0" distB="0" distL="0" distR="0" wp14:anchorId="6191AF87" wp14:editId="2D07A9F2">
             <wp:extent cx="5303520" cy="2240737"/>
             <wp:effectExtent l="0" t="0" r="0" b="0"/>
             <wp:docPr id="10" name="Picture 10" descr="图 5-7  销售统计和库存不足查询" title="图 5-7  销售统计和库存不足查询"/>
@@ -13595,7 +13595,7 @@
       <w:pPr>
         <w:pStyle w:val="11"/>
       </w:pPr>
-      <w:bookmarkStart w:id="5" w:name="_Toc235133835"/>
+      <w:bookmarkStart w:id="5" w:name="_Toc235135520"/>
       <w:r>
         <w:t xml:space="preserve">6 </w:t>
       </w:r>
@@ -13813,7 +13813,43 @@
               <w:rPr>
                 <w:sz w:val="18"/>
               </w:rPr>
-              <w:t>确定</w:t>
+              <w:t>负责</w:t>
+            </w:r>
+            <w:r>
+              <w:rPr>
+                <w:sz w:val="18"/>
+              </w:rPr>
+              <w:t xml:space="preserve"> Main</w:t>
+            </w:r>
+            <w:r>
+              <w:rPr>
+                <w:sz w:val="18"/>
+              </w:rPr>
+              <w:t>、</w:t>
+            </w:r>
+            <w:r>
+              <w:rPr>
+                <w:sz w:val="18"/>
+              </w:rPr>
+              <w:t>BaseDao</w:t>
+            </w:r>
+            <w:r>
+              <w:rPr>
+                <w:sz w:val="18"/>
+              </w:rPr>
+              <w:t>、</w:t>
+            </w:r>
+            <w:r>
+              <w:rPr>
+                <w:sz w:val="18"/>
+              </w:rPr>
+              <w:t>DBUtil</w:t>
+            </w:r>
+            <w:r>
+              <w:rPr>
+                <w:sz w:val="18"/>
+              </w:rPr>
+              <w:t>；确定</w:t>
             </w:r>
             <w:r>
               <w:rPr>
@@ -13825,19 +13861,7 @@
               <w:rPr>
                 <w:sz w:val="18"/>
               </w:rPr>
-              <w:t>技术方案；搭建分层目录；维护</w:t>
-            </w:r>
-            <w:r>
-              <w:rPr>
-                <w:sz w:val="18"/>
-              </w:rPr>
-              <w:t xml:space="preserve"> GitHub </w:t>
-            </w:r>
-            <w:r>
-              <w:rPr>
-                <w:sz w:val="18"/>
-              </w:rPr>
-              <w:t>仓库、分支与合并；组织全流程联调和最终文档整合</w:t>
+              <w:t>技术方案；搭建分层目录；维护仓库并组织联调和文档整合</w:t>
             </w:r>
           </w:p>
         </w:tc>
@@ -14355,13 +14379,25 @@
               <w:rPr>
                 <w:sz w:val="18"/>
               </w:rPr>
-              <w:t xml:space="preserve"> OrderService </w:t>
-            </w:r>
-            <w:r>
-              <w:rPr>
-                <w:sz w:val="18"/>
-              </w:rPr>
-              <w:t>核心创建订单流程；实现库存校验、四档会员折扣、</w:t>
+              <w:t xml:space="preserve"> SaleOrder</w:t>
+            </w:r>
+            <w:r>
+              <w:rPr>
+                <w:sz w:val="18"/>
+              </w:rPr>
+              <w:t>、</w:t>
+            </w:r>
+            <w:r>
+              <w:rPr>
+                <w:sz w:val="18"/>
+              </w:rPr>
+              <w:t>OrderService</w:t>
+            </w:r>
+            <w:r>
+              <w:rPr>
+                <w:sz w:val="18"/>
+              </w:rPr>
+              <w:t>；实现库存校验、四档会员折扣、</w:t>
             </w:r>
             <w:r>
               <w:rPr>
@@ -14373,7 +14409,7 @@
               <w:rPr>
                 <w:sz w:val="18"/>
               </w:rPr>
-              <w:t>金额计算、事务提交与回滚</w:t>
+              <w:t>金额计算、订单事务提交与回滚</w:t>
             </w:r>
           </w:p>
         </w:tc>
@@ -14397,7 +14433,7 @@
               <w:rPr>
                 <w:sz w:val="18"/>
               </w:rPr>
-              <w:t>12%</w:t>
+              <w:t>11%</w:t>
             </w:r>
           </w:p>
         </w:tc>
@@ -14480,7 +14516,7 @@
               <w:rPr>
                 <w:sz w:val="18"/>
               </w:rPr>
-              <w:t xml:space="preserve"> SaleOrder</w:t>
+              <w:t xml:space="preserve"> SaleOrderItem</w:t>
             </w:r>
             <w:r>
               <w:rPr>
@@ -14492,25 +14528,25 @@
               <w:rPr>
                 <w:sz w:val="18"/>
               </w:rPr>
-              <w:t xml:space="preserve">SaleOrderItem </w:t>
-            </w:r>
-            <w:r>
-              <w:rPr>
-                <w:sz w:val="18"/>
-              </w:rPr>
-              <w:t>及对应</w:t>
-            </w:r>
-            <w:r>
-              <w:rPr>
-                <w:sz w:val="18"/>
-              </w:rPr>
-              <w:t xml:space="preserve"> DAO</w:t>
-            </w:r>
-            <w:r>
-              <w:rPr>
-                <w:sz w:val="18"/>
-              </w:rPr>
-              <w:t>；实现订单详情、客户订单、状态查询和取消订单后的库存恢复</w:t>
+              <w:t>SaleOrderDao</w:t>
+            </w:r>
+            <w:r>
+              <w:rPr>
+                <w:sz w:val="18"/>
+              </w:rPr>
+              <w:t>、</w:t>
+            </w:r>
+            <w:r>
+              <w:rPr>
+                <w:sz w:val="18"/>
+              </w:rPr>
+              <w:t>SaleOrderItemDao</w:t>
+            </w:r>
+            <w:r>
+              <w:rPr>
+                <w:sz w:val="18"/>
+              </w:rPr>
+              <w:t>；实现订单详情、条件查询及订单明细的数据访问</w:t>
             </w:r>
           </w:p>
         </w:tc>
@@ -14712,7 +14748,7 @@
               <w:rPr>
                 <w:sz w:val="18"/>
               </w:rPr>
-              <w:t>公共工具与控制台体验</w:t>
+              <w:t>公共工具模块</w:t>
             </w:r>
           </w:p>
         </w:tc>
@@ -14772,7 +14808,7 @@
               <w:rPr>
                 <w:sz w:val="18"/>
               </w:rPr>
-              <w:t>；完善非法输入重试、取消操作、</w:t>
+              <w:t>；完善非法输入循环重试、日期格式校验、</w:t>
             </w:r>
             <w:r>
               <w:rPr>
@@ -14784,7 +14820,7 @@
               <w:rPr>
                 <w:sz w:val="18"/>
               </w:rPr>
-              <w:t>编码和中英文表格对齐；检查运行脚本</w:t>
+              <w:t>编码和中英文表格对齐</w:t>
             </w:r>
           </w:p>
         </w:tc>
@@ -14861,7 +14897,7 @@
               <w:rPr>
                 <w:sz w:val="18"/>
               </w:rPr>
-              <w:t>测试与交付资料</w:t>
+              <w:t>控制台与测试交付</w:t>
             </w:r>
           </w:p>
         </w:tc>
@@ -14885,7 +14921,31 @@
               <w:rPr>
                 <w:sz w:val="18"/>
               </w:rPr>
-              <w:t>整理手工测试用例和答辩演示流程；执行模块回归与边界测试；核对</w:t>
+              <w:t>负责</w:t>
+            </w:r>
+            <w:r>
+              <w:rPr>
+                <w:sz w:val="18"/>
+              </w:rPr>
+              <w:t xml:space="preserve"> ConsoleMenu</w:t>
+            </w:r>
+            <w:r>
+              <w:rPr>
+                <w:sz w:val="18"/>
+              </w:rPr>
+              <w:t>、</w:t>
+            </w:r>
+            <w:r>
+              <w:rPr>
+                <w:sz w:val="18"/>
+              </w:rPr>
+              <w:t>CancelException</w:t>
+            </w:r>
+            <w:r>
+              <w:rPr>
+                <w:sz w:val="18"/>
+              </w:rPr>
+              <w:t>；串联菜单与取消流程；执行回归和边界测试；核对</w:t>
             </w:r>
             <w:r>
               <w:rPr>
@@ -14897,7 +14957,7 @@
               <w:rPr>
                 <w:sz w:val="18"/>
               </w:rPr>
-              <w:t>、数据库说明、课程报告格式和截图</w:t>
+              <w:t>、报告格式和截图</w:t>
             </w:r>
           </w:p>
         </w:tc>
@@ -14921,7 +14981,7 @@
               <w:rPr>
                 <w:sz w:val="18"/>
               </w:rPr>
-              <w:t>10%</w:t>
+              <w:t>11%</w:t>
             </w:r>
           </w:p>
         </w:tc>
@@ -15035,6 +15095,23 @@
     </w:lvl>
   </w:abstractNum>
   <w:abstractNum w:abstractNumId="1" w15:restartNumberingAfterBreak="0">
+    <w:nsid w:val="0BF1405F"/>
+    <w:multiLevelType w:val="singleLevel"/>
+    <w:tmpl w:val="8758E594"/>
+    <w:lvl w:ilvl="0">
+      <w:start w:val="1"/>
+      <w:numFmt w:val="bullet"/>
+      <w:lvlText w:val="•"/>
+      <w:lvlJc w:val="left"/>
+      <w:pPr>
+        <w:tabs>
+          <w:tab w:val="num" w:pos="720"/>
+        </w:tabs>
+        <w:ind w:left="720" w:hanging="360"/>
+      </w:pPr>
+    </w:lvl>
+  </w:abstractNum>
+  <w:abstractNum w:abstractNumId="2" w15:restartNumberingAfterBreak="0">
     <w:nsid w:val="3AC14C30"/>
     <w:multiLevelType w:val="multilevel"/>
     <w:tmpl w:val="3AC14C30"/>
@@ -15150,27 +15227,10 @@
       </w:pPr>
     </w:lvl>
   </w:abstractNum>
-  <w:abstractNum w:abstractNumId="2" w15:restartNumberingAfterBreak="0">
-    <w:nsid w:val="53187705"/>
+  <w:abstractNum w:abstractNumId="3" w15:restartNumberingAfterBreak="0">
+    <w:nsid w:val="72115003"/>
     <w:multiLevelType w:val="singleLevel"/>
-    <w:tmpl w:val="8092D24C"/>
-    <w:lvl w:ilvl="0">
-      <w:start w:val="1"/>
-      <w:numFmt w:val="bullet"/>
-      <w:lvlText w:val="•"/>
-      <w:lvlJc w:val="left"/>
-      <w:pPr>
-        <w:tabs>
-          <w:tab w:val="num" w:pos="720"/>
-        </w:tabs>
-        <w:ind w:left="720" w:hanging="360"/>
-      </w:pPr>
-    </w:lvl>
-  </w:abstractNum>
-  <w:abstractNum w:abstractNumId="3" w15:restartNumberingAfterBreak="0">
-    <w:nsid w:val="72DF1709"/>
-    <w:multiLevelType w:val="singleLevel"/>
-    <w:tmpl w:val="E06E7226"/>
+    <w:tmpl w:val="B846F234"/>
     <w:lvl w:ilvl="0">
       <w:start w:val="1"/>
       <w:numFmt w:val="decimal"/>
@@ -15184,10 +15244,10 @@
       </w:pPr>
     </w:lvl>
   </w:abstractNum>
-  <w:num w:numId="1" w16cid:durableId="1155337495">
+  <w:num w:numId="1" w16cid:durableId="1293946369">
     <w:abstractNumId w:val="3"/>
   </w:num>
-  <w:num w:numId="2" w16cid:durableId="1479567132">
+  <w:num w:numId="2" w16cid:durableId="1614707875">
     <w:abstractNumId w:val="3"/>
     <w:lvlOverride w:ilvl="0">
       <w:startOverride w:val="1"/>
@@ -15884,13 +15944,13 @@
     <w:next w:val="a"/>
     <w:autoRedefine/>
     <w:uiPriority w:val="39"/>
-    <w:rsid w:val="00033405"/>
+    <w:rsid w:val="002641B1"/>
   </w:style>
   <w:style w:type="character" w:styleId="af5">
     <w:name w:val="Hyperlink"/>
     <w:uiPriority w:val="99"/>
     <w:unhideWhenUsed/>
-    <w:rsid w:val="00033405"/>
+    <w:rsid w:val="002641B1"/>
     <w:rPr>
       <w:color w:val="0563C1"/>
       <w:u w:val="single"/>

</xml_diff>

<commit_message>
fix(docs): correct team member name
</commit_message>
<xml_diff>
--- a/Gold红酒销售管理系统大作业文档.docx
+++ b/Gold红酒销售管理系统大作业文档.docx
@@ -232,7 +232,7 @@
               <w:jc w:val="center"/>
             </w:pPr>
             <w:r>
-              <w:t>姓名：王福洪</w:t>
+              <w:t>姓名：王福淇</w:t>
             </w:r>
             <w:r>
               <w:t xml:space="preserve">    </w:t>
@@ -590,7 +590,7 @@
       <w:r>
         <w:fldChar w:fldCharType="separate"/>
       </w:r>
-      <w:hyperlink w:anchor="_Toc235135515" w:history="1">
+      <w:hyperlink w:anchor="_Toc235138655" w:history="1">
         <w:r>
           <w:rPr>
             <w:rStyle w:val="af5"/>
@@ -617,7 +617,7 @@
             <w:noProof/>
             <w:webHidden/>
           </w:rPr>
-          <w:instrText xml:space="preserve"> PAGEREF _Toc235135515 \h </w:instrText>
+          <w:instrText xml:space="preserve"> PAGEREF _Toc235138655 \h </w:instrText>
         </w:r>
         <w:r>
           <w:rPr>
@@ -661,7 +661,7 @@
           <w14:ligatures w14:val="standardContextual"/>
         </w:rPr>
       </w:pPr>
-      <w:hyperlink w:anchor="_Toc235135516" w:history="1">
+      <w:hyperlink w:anchor="_Toc235138656" w:history="1">
         <w:r>
           <w:rPr>
             <w:rStyle w:val="af5"/>
@@ -688,7 +688,7 @@
             <w:noProof/>
             <w:webHidden/>
           </w:rPr>
-          <w:instrText xml:space="preserve"> PAGEREF _Toc235135516 \h </w:instrText>
+          <w:instrText xml:space="preserve"> PAGEREF _Toc235138656 \h </w:instrText>
         </w:r>
         <w:r>
           <w:rPr>
@@ -732,7 +732,7 @@
           <w14:ligatures w14:val="standardContextual"/>
         </w:rPr>
       </w:pPr>
-      <w:hyperlink w:anchor="_Toc235135517" w:history="1">
+      <w:hyperlink w:anchor="_Toc235138657" w:history="1">
         <w:r>
           <w:rPr>
             <w:rStyle w:val="af5"/>
@@ -759,7 +759,7 @@
             <w:noProof/>
             <w:webHidden/>
           </w:rPr>
-          <w:instrText xml:space="preserve"> PAGEREF _Toc235135517 \h </w:instrText>
+          <w:instrText xml:space="preserve"> PAGEREF _Toc235138657 \h </w:instrText>
         </w:r>
         <w:r>
           <w:rPr>
@@ -803,7 +803,7 @@
           <w14:ligatures w14:val="standardContextual"/>
         </w:rPr>
       </w:pPr>
-      <w:hyperlink w:anchor="_Toc235135518" w:history="1">
+      <w:hyperlink w:anchor="_Toc235138658" w:history="1">
         <w:r>
           <w:rPr>
             <w:rStyle w:val="af5"/>
@@ -830,7 +830,7 @@
             <w:noProof/>
             <w:webHidden/>
           </w:rPr>
-          <w:instrText xml:space="preserve"> PAGEREF _Toc235135518 \h </w:instrText>
+          <w:instrText xml:space="preserve"> PAGEREF _Toc235138658 \h </w:instrText>
         </w:r>
         <w:r>
           <w:rPr>
@@ -874,7 +874,7 @@
           <w14:ligatures w14:val="standardContextual"/>
         </w:rPr>
       </w:pPr>
-      <w:hyperlink w:anchor="_Toc235135519" w:history="1">
+      <w:hyperlink w:anchor="_Toc235138659" w:history="1">
         <w:r>
           <w:rPr>
             <w:rStyle w:val="af5"/>
@@ -901,7 +901,7 @@
             <w:noProof/>
             <w:webHidden/>
           </w:rPr>
-          <w:instrText xml:space="preserve"> PAGEREF _Toc235135519 \h </w:instrText>
+          <w:instrText xml:space="preserve"> PAGEREF _Toc235138659 \h </w:instrText>
         </w:r>
         <w:r>
           <w:rPr>
@@ -945,7 +945,7 @@
           <w14:ligatures w14:val="standardContextual"/>
         </w:rPr>
       </w:pPr>
-      <w:hyperlink w:anchor="_Toc235135520" w:history="1">
+      <w:hyperlink w:anchor="_Toc235138660" w:history="1">
         <w:r>
           <w:rPr>
             <w:rStyle w:val="af5"/>
@@ -972,7 +972,7 @@
             <w:noProof/>
             <w:webHidden/>
           </w:rPr>
-          <w:instrText xml:space="preserve"> PAGEREF _Toc235135520 \h </w:instrText>
+          <w:instrText xml:space="preserve"> PAGEREF _Toc235138660 \h </w:instrText>
         </w:r>
         <w:r>
           <w:rPr>
@@ -1021,7 +1021,7 @@
       <w:pPr>
         <w:pStyle w:val="11"/>
       </w:pPr>
-      <w:bookmarkStart w:id="0" w:name="_Toc235135515"/>
+      <w:bookmarkStart w:id="0" w:name="_Toc235138655"/>
       <w:r>
         <w:t xml:space="preserve">1 </w:t>
       </w:r>
@@ -1088,7 +1088,7 @@
           <w:noProof/>
         </w:rPr>
         <w:drawing>
-          <wp:inline distT="0" distB="0" distL="0" distR="0" wp14:anchorId="7F9065A9" wp14:editId="61990A37">
+          <wp:inline distT="0" distB="0" distL="0" distR="0" wp14:anchorId="576A4616" wp14:editId="230FAB5C">
             <wp:extent cx="5303520" cy="3489158"/>
             <wp:effectExtent l="0" t="0" r="0" b="0"/>
             <wp:docPr id="1" name="Picture 1" descr="图 1-1  系统主要类图" title="图 1-1  系统主要类图"/>
@@ -1231,6 +1231,7 @@
                 <w:b/>
                 <w:sz w:val="18"/>
               </w:rPr>
+              <w:lastRenderedPageBreak/>
               <w:t>层次</w:t>
             </w:r>
           </w:p>
@@ -3131,6 +3132,7 @@
               <w:rPr>
                 <w:sz w:val="18"/>
               </w:rPr>
+              <w:lastRenderedPageBreak/>
               <w:t>业务</w:t>
             </w:r>
           </w:p>
@@ -3838,7 +3840,7 @@
       <w:pPr>
         <w:pStyle w:val="11"/>
       </w:pPr>
-      <w:bookmarkStart w:id="1" w:name="_Toc235135516"/>
+      <w:bookmarkStart w:id="1" w:name="_Toc235138656"/>
       <w:r>
         <w:t xml:space="preserve">2 </w:t>
       </w:r>
@@ -3887,6 +3889,7 @@
         <w:pStyle w:val="21"/>
       </w:pPr>
       <w:r>
+        <w:lastRenderedPageBreak/>
         <w:t xml:space="preserve">2.1 </w:t>
       </w:r>
       <w:r>
@@ -5662,6 +5665,7 @@
         <w:pStyle w:val="31"/>
       </w:pPr>
       <w:r>
+        <w:lastRenderedPageBreak/>
         <w:t xml:space="preserve">2.2.2 </w:t>
       </w:r>
       <w:r>
@@ -8707,6 +8711,7 @@
               <w:rPr>
                 <w:sz w:val="18"/>
               </w:rPr>
+              <w:lastRenderedPageBreak/>
               <w:t>7</w:t>
             </w:r>
           </w:p>
@@ -11318,7 +11323,7 @@
       <w:pPr>
         <w:pStyle w:val="11"/>
       </w:pPr>
-      <w:bookmarkStart w:id="2" w:name="_Toc235135517"/>
+      <w:bookmarkStart w:id="2" w:name="_Toc235138657"/>
       <w:r>
         <w:t xml:space="preserve">3 </w:t>
       </w:r>
@@ -11366,7 +11371,7 @@
           <w:noProof/>
         </w:rPr>
         <w:drawing>
-          <wp:inline distT="0" distB="0" distL="0" distR="0" wp14:anchorId="4729C9B4" wp14:editId="292BE38C">
+          <wp:inline distT="0" distB="0" distL="0" distR="0" wp14:anchorId="2B2DBB72" wp14:editId="147CC1C9">
             <wp:extent cx="5303520" cy="2930893"/>
             <wp:effectExtent l="0" t="0" r="0" b="0"/>
             <wp:docPr id="2" name="Picture 2" descr="图 3-1  系统功能结构" title="图 3-1  系统功能结构"/>
@@ -11474,6 +11479,7 @@
         <w:pStyle w:val="31"/>
       </w:pPr>
       <w:r>
+        <w:lastRenderedPageBreak/>
         <w:t xml:space="preserve">3.2.3 </w:t>
       </w:r>
       <w:r>
@@ -11561,7 +11567,7 @@
           <w:noProof/>
         </w:rPr>
         <w:drawing>
-          <wp:inline distT="0" distB="0" distL="0" distR="0" wp14:anchorId="13C52D95" wp14:editId="0E7257B1">
+          <wp:inline distT="0" distB="0" distL="0" distR="0" wp14:anchorId="1122E66F" wp14:editId="02EEDC76">
             <wp:extent cx="5303520" cy="2946400"/>
             <wp:effectExtent l="0" t="0" r="0" b="0"/>
             <wp:docPr id="3" name="Picture 3" descr="图 3-2  购买结算与取消订单流程" title="图 3-2  购买结算与取消订单流程"/>
@@ -11629,7 +11635,11 @@
         <w:t xml:space="preserve">Service </w:t>
       </w:r>
       <w:r>
-        <w:t>层先完成无副作用的规则判断和金额计算，再开启事务写入订单、订单明细并修改库存。任一步骤发生异常都会回滚。取消订单同样在一个事务中恢复所有明细库存并更新订单状态，从而保证订单与库存一致。</w:t>
+        <w:t>层先完成无副作用的规则判断和金额计算，再开启事务写入订单、订单明细并修改库存。任一步骤发生异常都</w:t>
+      </w:r>
+      <w:r>
+        <w:lastRenderedPageBreak/>
+        <w:t>会回滚。取消订单同样在一个事务中恢复所有明细库存并更新订单状态，从而保证订单与库存一致。</w:t>
       </w:r>
     </w:p>
     <w:p>
@@ -11827,7 +11837,7 @@
       <w:pPr>
         <w:pStyle w:val="11"/>
       </w:pPr>
-      <w:bookmarkStart w:id="3" w:name="_Toc235135518"/>
+      <w:bookmarkStart w:id="3" w:name="_Toc235138658"/>
       <w:r>
         <w:t xml:space="preserve">4 </w:t>
       </w:r>
@@ -11970,6 +11980,7 @@
         <w:pStyle w:val="21"/>
       </w:pPr>
       <w:r>
+        <w:lastRenderedPageBreak/>
         <w:t xml:space="preserve">4.2 </w:t>
       </w:r>
       <w:r>
@@ -12335,7 +12346,11 @@
         <w:t xml:space="preserve">OrderService </w:t>
       </w:r>
       <w:r>
-        <w:t>是系统最关键的业务类。创建订单时，订单主表写入、明细写入和库存扣减必须作为一个整体成功；取消订单时，库存恢复和状态更新也必须作为一个整体成功。因此代码关闭自动提交，成功时</w:t>
+        <w:t>是系统最关键的业务类。创建订单时，订单主表写入、明细写入和库存扣减必须作为一个整体成功；取消订单时，库存恢复和状态更新也必</w:t>
+      </w:r>
+      <w:r>
+        <w:lastRenderedPageBreak/>
+        <w:t>须作为一个整体成功。因此代码关闭自动提交，成功时</w:t>
       </w:r>
       <w:r>
         <w:t xml:space="preserve"> commit</w:t>
@@ -12660,6 +12675,7 @@
           <w:color w:val="1F2937"/>
           <w:sz w:val="18"/>
         </w:rPr>
+        <w:lastRenderedPageBreak/>
         <w:t>public String readString(String prompt) {</w:t>
       </w:r>
       <w:r>
@@ -12824,7 +12840,7 @@
       <w:pPr>
         <w:pStyle w:val="11"/>
       </w:pPr>
-      <w:bookmarkStart w:id="4" w:name="_Toc235135519"/>
+      <w:bookmarkStart w:id="4" w:name="_Toc235138659"/>
       <w:r>
         <w:t xml:space="preserve">5 </w:t>
       </w:r>
@@ -12932,7 +12948,7 @@
           <w:noProof/>
         </w:rPr>
         <w:drawing>
-          <wp:inline distT="0" distB="0" distL="0" distR="0" wp14:anchorId="539ADB5F" wp14:editId="76DE9C95">
+          <wp:inline distT="0" distB="0" distL="0" distR="0" wp14:anchorId="208C4DD2" wp14:editId="4192388C">
             <wp:extent cx="5303520" cy="1038606"/>
             <wp:effectExtent l="0" t="0" r="0" b="0"/>
             <wp:docPr id="4" name="Picture 4" descr="图 5-1  系统启动与主菜单" title="图 5-1  系统启动与主菜单"/>
@@ -13031,7 +13047,7 @@
           <w:noProof/>
         </w:rPr>
         <w:drawing>
-          <wp:inline distT="0" distB="0" distL="0" distR="0" wp14:anchorId="5529EE7F" wp14:editId="44AF6D68">
+          <wp:inline distT="0" distB="0" distL="0" distR="0" wp14:anchorId="219039BD" wp14:editId="3503CA33">
             <wp:extent cx="5303520" cy="1264006"/>
             <wp:effectExtent l="0" t="0" r="0" b="0"/>
             <wp:docPr id="5" name="Picture 5" descr="图 5-2  红酒信息查询结果" title="图 5-2  红酒信息查询结果"/>
@@ -13118,7 +13134,7 @@
           <w:noProof/>
         </w:rPr>
         <w:drawing>
-          <wp:inline distT="0" distB="0" distL="0" distR="0" wp14:anchorId="1904FE82" wp14:editId="6FA47EE4">
+          <wp:inline distT="0" distB="0" distL="0" distR="0" wp14:anchorId="6D70C564" wp14:editId="1A517661">
             <wp:extent cx="5303520" cy="662940"/>
             <wp:effectExtent l="0" t="0" r="0" b="0"/>
             <wp:docPr id="6" name="Picture 6" descr="图 5-3  新增演示客户" title="图 5-3  新增演示客户"/>
@@ -13217,7 +13233,7 @@
           <w:noProof/>
         </w:rPr>
         <w:drawing>
-          <wp:inline distT="0" distB="0" distL="0" distR="0" wp14:anchorId="14A4DD7A" wp14:editId="13D1537C">
+          <wp:inline distT="0" distB="0" distL="0" distR="0" wp14:anchorId="42373431" wp14:editId="5ADA042E">
             <wp:extent cx="5303520" cy="662940"/>
             <wp:effectExtent l="0" t="0" r="0" b="0"/>
             <wp:docPr id="7" name="Picture 7" descr="图 5-4  创建购买订单并计算折扣" title="图 5-4  创建购买订单并计算折扣"/>
@@ -13340,7 +13356,7 @@
           <w:noProof/>
         </w:rPr>
         <w:drawing>
-          <wp:inline distT="0" distB="0" distL="0" distR="0" wp14:anchorId="607C7E6F" wp14:editId="230B3F9E">
+          <wp:inline distT="0" distB="0" distL="0" distR="0" wp14:anchorId="78DF4461" wp14:editId="284F3E1E">
             <wp:extent cx="5303520" cy="1489405"/>
             <wp:effectExtent l="0" t="0" r="0" b="0"/>
             <wp:docPr id="8" name="Picture 8" descr="图 5-5  订单主表与订单明细" title="图 5-5  订单主表与订单明细"/>
@@ -13427,7 +13443,7 @@
           <w:noProof/>
         </w:rPr>
         <w:drawing>
-          <wp:inline distT="0" distB="0" distL="0" distR="0" wp14:anchorId="01945B55" wp14:editId="33807192">
+          <wp:inline distT="0" distB="0" distL="0" distR="0" wp14:anchorId="030EC890" wp14:editId="6930F09C">
             <wp:extent cx="5303520" cy="662940"/>
             <wp:effectExtent l="0" t="0" r="0" b="0"/>
             <wp:docPr id="9" name="Picture 9" descr="图 5-6  取消订单并恢复库存" title="图 5-6  取消订单并恢复库存"/>
@@ -13514,7 +13530,7 @@
           <w:noProof/>
         </w:rPr>
         <w:drawing>
-          <wp:inline distT="0" distB="0" distL="0" distR="0" wp14:anchorId="6191AF87" wp14:editId="2D07A9F2">
+          <wp:inline distT="0" distB="0" distL="0" distR="0" wp14:anchorId="158B88A3" wp14:editId="25059847">
             <wp:extent cx="5303520" cy="2240737"/>
             <wp:effectExtent l="0" t="0" r="0" b="0"/>
             <wp:docPr id="10" name="Picture 10" descr="图 5-7  销售统计和库存不足查询" title="图 5-7  销售统计和库存不足查询"/>
@@ -13595,7 +13611,7 @@
       <w:pPr>
         <w:pStyle w:val="11"/>
       </w:pPr>
-      <w:bookmarkStart w:id="5" w:name="_Toc235135520"/>
+      <w:bookmarkStart w:id="5" w:name="_Toc235138660"/>
       <w:r>
         <w:t xml:space="preserve">6 </w:t>
       </w:r>
@@ -14051,7 +14067,7 @@
               <w:rPr>
                 <w:sz w:val="18"/>
               </w:rPr>
-              <w:t>王福洪</w:t>
+              <w:t>王福淇</w:t>
             </w:r>
           </w:p>
         </w:tc>
@@ -15095,9 +15111,9 @@
     </w:lvl>
   </w:abstractNum>
   <w:abstractNum w:abstractNumId="1" w15:restartNumberingAfterBreak="0">
-    <w:nsid w:val="0BF1405F"/>
+    <w:nsid w:val="2D607516"/>
     <w:multiLevelType w:val="singleLevel"/>
-    <w:tmpl w:val="8758E594"/>
+    <w:tmpl w:val="46024166"/>
     <w:lvl w:ilvl="0">
       <w:start w:val="1"/>
       <w:numFmt w:val="bullet"/>
@@ -15228,9 +15244,9 @@
     </w:lvl>
   </w:abstractNum>
   <w:abstractNum w:abstractNumId="3" w15:restartNumberingAfterBreak="0">
-    <w:nsid w:val="72115003"/>
+    <w:nsid w:val="562E7D1E"/>
     <w:multiLevelType w:val="singleLevel"/>
-    <w:tmpl w:val="B846F234"/>
+    <w:tmpl w:val="97BEC6A6"/>
     <w:lvl w:ilvl="0">
       <w:start w:val="1"/>
       <w:numFmt w:val="decimal"/>
@@ -15244,10 +15260,10 @@
       </w:pPr>
     </w:lvl>
   </w:abstractNum>
-  <w:num w:numId="1" w16cid:durableId="1293946369">
+  <w:num w:numId="1" w16cid:durableId="1205404944">
     <w:abstractNumId w:val="3"/>
   </w:num>
-  <w:num w:numId="2" w16cid:durableId="1614707875">
+  <w:num w:numId="2" w16cid:durableId="2060127822">
     <w:abstractNumId w:val="3"/>
     <w:lvlOverride w:ilvl="0">
       <w:startOverride w:val="1"/>
@@ -15944,13 +15960,13 @@
     <w:next w:val="a"/>
     <w:autoRedefine/>
     <w:uiPriority w:val="39"/>
-    <w:rsid w:val="002641B1"/>
+    <w:rsid w:val="00D72D54"/>
   </w:style>
   <w:style w:type="character" w:styleId="af5">
     <w:name w:val="Hyperlink"/>
     <w:uiPriority w:val="99"/>
     <w:unhideWhenUsed/>
-    <w:rsid w:val="002641B1"/>
+    <w:rsid w:val="00D72D54"/>
     <w:rPr>
       <w:color w:val="0563C1"/>
       <w:u w:val="single"/>

</xml_diff>

<commit_message>
docs(report): add screenshot reproduction steps
</commit_message>
<xml_diff>
--- a/Gold红酒销售管理系统大作业文档.docx
+++ b/Gold红酒销售管理系统大作业文档.docx
@@ -590,7 +590,7 @@
       <w:r>
         <w:fldChar w:fldCharType="separate"/>
       </w:r>
-      <w:hyperlink w:anchor="_Toc235139837" w:history="1">
+      <w:hyperlink w:anchor="_Toc235141493" w:history="1">
         <w:r>
           <w:rPr>
             <w:rStyle w:val="af5"/>
@@ -617,7 +617,7 @@
             <w:noProof/>
             <w:webHidden/>
           </w:rPr>
-          <w:instrText xml:space="preserve"> PAGEREF _Toc235139837 \h </w:instrText>
+          <w:instrText xml:space="preserve"> PAGEREF _Toc235141493 \h </w:instrText>
         </w:r>
         <w:r>
           <w:rPr>
@@ -661,7 +661,7 @@
           <w14:ligatures w14:val="standardContextual"/>
         </w:rPr>
       </w:pPr>
-      <w:hyperlink w:anchor="_Toc235139838" w:history="1">
+      <w:hyperlink w:anchor="_Toc235141494" w:history="1">
         <w:r>
           <w:rPr>
             <w:rStyle w:val="af5"/>
@@ -688,7 +688,7 @@
             <w:noProof/>
             <w:webHidden/>
           </w:rPr>
-          <w:instrText xml:space="preserve"> PAGEREF _Toc235139838 \h </w:instrText>
+          <w:instrText xml:space="preserve"> PAGEREF _Toc235141494 \h </w:instrText>
         </w:r>
         <w:r>
           <w:rPr>
@@ -732,7 +732,7 @@
           <w14:ligatures w14:val="standardContextual"/>
         </w:rPr>
       </w:pPr>
-      <w:hyperlink w:anchor="_Toc235139839" w:history="1">
+      <w:hyperlink w:anchor="_Toc235141495" w:history="1">
         <w:r>
           <w:rPr>
             <w:rStyle w:val="af5"/>
@@ -759,7 +759,7 @@
             <w:noProof/>
             <w:webHidden/>
           </w:rPr>
-          <w:instrText xml:space="preserve"> PAGEREF _Toc235139839 \h </w:instrText>
+          <w:instrText xml:space="preserve"> PAGEREF _Toc235141495 \h </w:instrText>
         </w:r>
         <w:r>
           <w:rPr>
@@ -803,7 +803,7 @@
           <w14:ligatures w14:val="standardContextual"/>
         </w:rPr>
       </w:pPr>
-      <w:hyperlink w:anchor="_Toc235139840" w:history="1">
+      <w:hyperlink w:anchor="_Toc235141496" w:history="1">
         <w:r>
           <w:rPr>
             <w:rStyle w:val="af5"/>
@@ -830,7 +830,7 @@
             <w:noProof/>
             <w:webHidden/>
           </w:rPr>
-          <w:instrText xml:space="preserve"> PAGEREF _Toc235139840 \h </w:instrText>
+          <w:instrText xml:space="preserve"> PAGEREF _Toc235141496 \h </w:instrText>
         </w:r>
         <w:r>
           <w:rPr>
@@ -874,7 +874,7 @@
           <w14:ligatures w14:val="standardContextual"/>
         </w:rPr>
       </w:pPr>
-      <w:hyperlink w:anchor="_Toc235139841" w:history="1">
+      <w:hyperlink w:anchor="_Toc235141497" w:history="1">
         <w:r>
           <w:rPr>
             <w:rStyle w:val="af5"/>
@@ -901,7 +901,7 @@
             <w:noProof/>
             <w:webHidden/>
           </w:rPr>
-          <w:instrText xml:space="preserve"> PAGEREF _Toc235139841 \h </w:instrText>
+          <w:instrText xml:space="preserve"> PAGEREF _Toc235141497 \h </w:instrText>
         </w:r>
         <w:r>
           <w:rPr>
@@ -945,7 +945,7 @@
           <w14:ligatures w14:val="standardContextual"/>
         </w:rPr>
       </w:pPr>
-      <w:hyperlink w:anchor="_Toc235139842" w:history="1">
+      <w:hyperlink w:anchor="_Toc235141498" w:history="1">
         <w:r>
           <w:rPr>
             <w:rStyle w:val="af5"/>
@@ -972,7 +972,7 @@
             <w:noProof/>
             <w:webHidden/>
           </w:rPr>
-          <w:instrText xml:space="preserve"> PAGEREF _Toc235139842 \h </w:instrText>
+          <w:instrText xml:space="preserve"> PAGEREF _Toc235141498 \h </w:instrText>
         </w:r>
         <w:r>
           <w:rPr>
@@ -992,7 +992,7 @@
             <w:noProof/>
             <w:webHidden/>
           </w:rPr>
-          <w:t>16</w:t>
+          <w:t>17</w:t>
         </w:r>
         <w:r>
           <w:rPr>
@@ -1021,7 +1021,7 @@
       <w:pPr>
         <w:pStyle w:val="11"/>
       </w:pPr>
-      <w:bookmarkStart w:id="0" w:name="_Toc235139837"/>
+      <w:bookmarkStart w:id="0" w:name="_Toc235141493"/>
       <w:r>
         <w:t xml:space="preserve">1 </w:t>
       </w:r>
@@ -1088,7 +1088,7 @@
           <w:noProof/>
         </w:rPr>
         <w:drawing>
-          <wp:inline distT="0" distB="0" distL="0" distR="0" wp14:anchorId="30917280" wp14:editId="56E26BD2">
+          <wp:inline distT="0" distB="0" distL="0" distR="0" wp14:anchorId="29DCADDE" wp14:editId="1206EBF4">
             <wp:extent cx="5303520" cy="3489158"/>
             <wp:effectExtent l="0" t="0" r="0" b="0"/>
             <wp:docPr id="1" name="Picture 1" descr="图 1-1  系统主要类图" title="图 1-1  系统主要类图"/>
@@ -3838,7 +3838,7 @@
       <w:pPr>
         <w:pStyle w:val="11"/>
       </w:pPr>
-      <w:bookmarkStart w:id="1" w:name="_Toc235139838"/>
+      <w:bookmarkStart w:id="1" w:name="_Toc235141494"/>
       <w:r>
         <w:t xml:space="preserve">2 </w:t>
       </w:r>
@@ -11623,7 +11623,7 @@
       <w:pPr>
         <w:pStyle w:val="11"/>
       </w:pPr>
-      <w:bookmarkStart w:id="2" w:name="_Toc235139839"/>
+      <w:bookmarkStart w:id="2" w:name="_Toc235141495"/>
       <w:r>
         <w:t xml:space="preserve">3 </w:t>
       </w:r>
@@ -11671,7 +11671,7 @@
           <w:noProof/>
         </w:rPr>
         <w:drawing>
-          <wp:inline distT="0" distB="0" distL="0" distR="0" wp14:anchorId="474F3087" wp14:editId="440591B2">
+          <wp:inline distT="0" distB="0" distL="0" distR="0" wp14:anchorId="2E969C00" wp14:editId="62EB73DB">
             <wp:extent cx="5303520" cy="2930893"/>
             <wp:effectExtent l="0" t="0" r="0" b="0"/>
             <wp:docPr id="2" name="Picture 2" descr="图 3-1  系统功能结构" title="图 3-1  系统功能结构"/>
@@ -11866,7 +11866,7 @@
           <w:noProof/>
         </w:rPr>
         <w:drawing>
-          <wp:inline distT="0" distB="0" distL="0" distR="0" wp14:anchorId="24B32DA9" wp14:editId="08EB77A0">
+          <wp:inline distT="0" distB="0" distL="0" distR="0" wp14:anchorId="7DC879D0" wp14:editId="0EF617ED">
             <wp:extent cx="5303520" cy="2946400"/>
             <wp:effectExtent l="0" t="0" r="0" b="0"/>
             <wp:docPr id="3" name="Picture 3" descr="图 3-2  购买结算与取消订单流程" title="图 3-2  购买结算与取消订单流程"/>
@@ -12132,7 +12132,7 @@
       <w:pPr>
         <w:pStyle w:val="11"/>
       </w:pPr>
-      <w:bookmarkStart w:id="3" w:name="_Toc235139840"/>
+      <w:bookmarkStart w:id="3" w:name="_Toc235141496"/>
       <w:r>
         <w:t xml:space="preserve">4 </w:t>
       </w:r>
@@ -13129,7 +13129,7 @@
       <w:pPr>
         <w:pStyle w:val="11"/>
       </w:pPr>
-      <w:bookmarkStart w:id="4" w:name="_Toc235139841"/>
+      <w:bookmarkStart w:id="4" w:name="_Toc235141497"/>
       <w:r>
         <w:t xml:space="preserve">5 </w:t>
       </w:r>
@@ -13237,7 +13237,7 @@
           <w:noProof/>
         </w:rPr>
         <w:drawing>
-          <wp:inline distT="0" distB="0" distL="0" distR="0" wp14:anchorId="4C58F6B0" wp14:editId="0BFC954F">
+          <wp:inline distT="0" distB="0" distL="0" distR="0" wp14:anchorId="1200A037" wp14:editId="3D0F0B8A">
             <wp:extent cx="5303520" cy="1038606"/>
             <wp:effectExtent l="0" t="0" r="0" b="0"/>
             <wp:docPr id="4" name="Picture 4" descr="图 5-1  系统启动与主菜单" title="图 5-1  系统启动与主菜单"/>
@@ -13275,6 +13275,7 @@
     </w:p>
     <w:p>
       <w:pPr>
+        <w:keepNext/>
         <w:spacing w:before="80" w:after="160"/>
         <w:jc w:val="center"/>
       </w:pPr>
@@ -13295,6 +13296,97 @@
           <w:sz w:val="21"/>
         </w:rPr>
         <w:t>系统启动与主菜单</w:t>
+      </w:r>
+    </w:p>
+    <w:p>
+      <w:pPr>
+        <w:spacing w:after="120" w:line="276" w:lineRule="auto"/>
+        <w:ind w:left="160" w:right="160" w:firstLine="0"/>
+      </w:pPr>
+      <w:r>
+        <w:rPr>
+          <w:b/>
+          <w:color w:val="C00000"/>
+          <w:sz w:val="18"/>
+        </w:rPr>
+        <w:t>手动截图方法：</w:t>
+      </w:r>
+      <w:r>
+        <w:rPr>
+          <w:color w:val="C00000"/>
+          <w:sz w:val="18"/>
+        </w:rPr>
+        <w:t>如需按图</w:t>
+      </w:r>
+      <w:r>
+        <w:rPr>
+          <w:color w:val="C00000"/>
+          <w:sz w:val="18"/>
+        </w:rPr>
+        <w:t xml:space="preserve"> 5-1 </w:t>
+      </w:r>
+      <w:r>
+        <w:rPr>
+          <w:color w:val="C00000"/>
+          <w:sz w:val="18"/>
+        </w:rPr>
+        <w:t>至图</w:t>
+      </w:r>
+      <w:r>
+        <w:rPr>
+          <w:color w:val="C00000"/>
+          <w:sz w:val="18"/>
+        </w:rPr>
+        <w:t xml:space="preserve"> 5-7 </w:t>
+      </w:r>
+      <w:r>
+        <w:rPr>
+          <w:color w:val="C00000"/>
+          <w:sz w:val="18"/>
+        </w:rPr>
+        <w:t>的顺序复现，先备份需要保留的</w:t>
+      </w:r>
+      <w:r>
+        <w:rPr>
+          <w:color w:val="C00000"/>
+          <w:sz w:val="18"/>
+        </w:rPr>
+        <w:t xml:space="preserve"> wine.db</w:t>
+      </w:r>
+      <w:r>
+        <w:rPr>
+          <w:color w:val="C00000"/>
+          <w:sz w:val="18"/>
+        </w:rPr>
+        <w:t>，关闭程序后双击</w:t>
+      </w:r>
+      <w:r>
+        <w:rPr>
+          <w:color w:val="C00000"/>
+          <w:sz w:val="18"/>
+        </w:rPr>
+        <w:t xml:space="preserve"> reset-database.bat</w:t>
+      </w:r>
+      <w:r>
+        <w:rPr>
+          <w:color w:val="C00000"/>
+          <w:sz w:val="18"/>
+        </w:rPr>
+        <w:t>，再双击</w:t>
+      </w:r>
+      <w:r>
+        <w:rPr>
+          <w:color w:val="C00000"/>
+          <w:sz w:val="18"/>
+        </w:rPr>
+        <w:t xml:space="preserve"> run.bat</w:t>
+      </w:r>
+      <w:r>
+        <w:rPr>
+          <w:color w:val="C00000"/>
+          <w:sz w:val="18"/>
+        </w:rPr>
+        <w:t>；主菜单完整显示后截图。</w:t>
       </w:r>
     </w:p>
     <w:p>
@@ -13336,7 +13428,7 @@
           <w:noProof/>
         </w:rPr>
         <w:drawing>
-          <wp:inline distT="0" distB="0" distL="0" distR="0" wp14:anchorId="73F8A33B" wp14:editId="249AFCBB">
+          <wp:inline distT="0" distB="0" distL="0" distR="0" wp14:anchorId="053A7165" wp14:editId="2E1CF560">
             <wp:extent cx="5303520" cy="1264006"/>
             <wp:effectExtent l="0" t="0" r="0" b="0"/>
             <wp:docPr id="5" name="Picture 5" descr="图 5-2  红酒信息查询结果" title="图 5-2  红酒信息查询结果"/>
@@ -13374,6 +13466,7 @@
     </w:p>
     <w:p>
       <w:pPr>
+        <w:keepNext/>
         <w:spacing w:before="80" w:after="160"/>
         <w:jc w:val="center"/>
       </w:pPr>
@@ -13394,6 +13487,69 @@
           <w:sz w:val="21"/>
         </w:rPr>
         <w:t>红酒信息查询结果</w:t>
+      </w:r>
+    </w:p>
+    <w:p>
+      <w:pPr>
+        <w:spacing w:after="120" w:line="276" w:lineRule="auto"/>
+        <w:ind w:left="160" w:right="160" w:firstLine="0"/>
+      </w:pPr>
+      <w:r>
+        <w:rPr>
+          <w:b/>
+          <w:color w:val="C00000"/>
+          <w:sz w:val="18"/>
+        </w:rPr>
+        <w:t>手动截图方法：</w:t>
+      </w:r>
+      <w:r>
+        <w:rPr>
+          <w:color w:val="C00000"/>
+          <w:sz w:val="18"/>
+        </w:rPr>
+        <w:t>从主菜单输入</w:t>
+      </w:r>
+      <w:r>
+        <w:rPr>
+          <w:color w:val="C00000"/>
+          <w:sz w:val="18"/>
+        </w:rPr>
+        <w:t xml:space="preserve"> 1</w:t>
+      </w:r>
+      <w:r>
+        <w:rPr>
+          <w:color w:val="C00000"/>
+          <w:sz w:val="18"/>
+        </w:rPr>
+        <w:t>，在红酒信息管理菜单输入</w:t>
+      </w:r>
+      <w:r>
+        <w:rPr>
+          <w:color w:val="C00000"/>
+          <w:sz w:val="18"/>
+        </w:rPr>
+        <w:t xml:space="preserve"> 4</w:t>
+      </w:r>
+      <w:r>
+        <w:rPr>
+          <w:color w:val="C00000"/>
+          <w:sz w:val="18"/>
+        </w:rPr>
+        <w:t>；全部红酒表格显示后截图，再输入</w:t>
+      </w:r>
+      <w:r>
+        <w:rPr>
+          <w:color w:val="C00000"/>
+          <w:sz w:val="18"/>
+        </w:rPr>
+        <w:t xml:space="preserve"> 0 </w:t>
+      </w:r>
+      <w:r>
+        <w:rPr>
+          <w:color w:val="C00000"/>
+          <w:sz w:val="18"/>
+        </w:rPr>
+        <w:t>返回主菜单。</w:t>
       </w:r>
     </w:p>
     <w:p>
@@ -13423,7 +13579,7 @@
           <w:noProof/>
         </w:rPr>
         <w:drawing>
-          <wp:inline distT="0" distB="0" distL="0" distR="0" wp14:anchorId="68DE53CB" wp14:editId="344185FD">
+          <wp:inline distT="0" distB="0" distL="0" distR="0" wp14:anchorId="27FE3ADE" wp14:editId="5F252C11">
             <wp:extent cx="5303520" cy="662940"/>
             <wp:effectExtent l="0" t="0" r="0" b="0"/>
             <wp:docPr id="6" name="Picture 6" descr="图 5-3  新增演示客户" title="图 5-3  新增演示客户"/>
@@ -13461,6 +13617,7 @@
     </w:p>
     <w:p>
       <w:pPr>
+        <w:keepNext/>
         <w:spacing w:before="80" w:after="160"/>
         <w:jc w:val="center"/>
       </w:pPr>
@@ -13481,6 +13638,139 @@
           <w:sz w:val="21"/>
         </w:rPr>
         <w:t>新增演示客户</w:t>
+      </w:r>
+    </w:p>
+    <w:p>
+      <w:pPr>
+        <w:spacing w:after="120" w:line="276" w:lineRule="auto"/>
+        <w:ind w:left="160" w:right="160" w:firstLine="0"/>
+      </w:pPr>
+      <w:r>
+        <w:rPr>
+          <w:b/>
+          <w:color w:val="C00000"/>
+          <w:sz w:val="18"/>
+        </w:rPr>
+        <w:t>手动截图方法：</w:t>
+      </w:r>
+      <w:r>
+        <w:rPr>
+          <w:color w:val="C00000"/>
+          <w:sz w:val="18"/>
+        </w:rPr>
+        <w:t>从主菜单输入</w:t>
+      </w:r>
+      <w:r>
+        <w:rPr>
+          <w:color w:val="C00000"/>
+          <w:sz w:val="18"/>
+        </w:rPr>
+        <w:t xml:space="preserve"> 3</w:t>
+      </w:r>
+      <w:r>
+        <w:rPr>
+          <w:color w:val="C00000"/>
+          <w:sz w:val="18"/>
+        </w:rPr>
+        <w:t>，在客户信息管理菜单输入</w:t>
+      </w:r>
+      <w:r>
+        <w:rPr>
+          <w:color w:val="C00000"/>
+          <w:sz w:val="18"/>
+        </w:rPr>
+        <w:t xml:space="preserve"> 1</w:t>
+      </w:r>
+      <w:r>
+        <w:rPr>
+          <w:color w:val="C00000"/>
+          <w:sz w:val="18"/>
+        </w:rPr>
+        <w:t>；依次输入</w:t>
+      </w:r>
+      <w:r>
+        <w:rPr>
+          <w:color w:val="C00000"/>
+          <w:sz w:val="18"/>
+        </w:rPr>
+        <w:t>“</w:t>
+      </w:r>
+      <w:r>
+        <w:rPr>
+          <w:color w:val="C00000"/>
+          <w:sz w:val="18"/>
+        </w:rPr>
+        <w:t>演示客户、男、</w:t>
+      </w:r>
+      <w:r>
+        <w:rPr>
+          <w:color w:val="C00000"/>
+          <w:sz w:val="18"/>
+        </w:rPr>
+        <w:t>13900000006</w:t>
+      </w:r>
+      <w:r>
+        <w:rPr>
+          <w:color w:val="C00000"/>
+          <w:sz w:val="18"/>
+        </w:rPr>
+        <w:t>、安徽合肥、私享会员</w:t>
+      </w:r>
+      <w:r>
+        <w:rPr>
+          <w:color w:val="C00000"/>
+          <w:sz w:val="18"/>
+        </w:rPr>
+        <w:t>”</w:t>
+      </w:r>
+      <w:r>
+        <w:rPr>
+          <w:color w:val="C00000"/>
+          <w:sz w:val="18"/>
+        </w:rPr>
+        <w:t>，出现</w:t>
+      </w:r>
+      <w:r>
+        <w:rPr>
+          <w:color w:val="C00000"/>
+          <w:sz w:val="18"/>
+        </w:rPr>
+        <w:t>“</w:t>
+      </w:r>
+      <w:r>
+        <w:rPr>
+          <w:color w:val="C00000"/>
+          <w:sz w:val="18"/>
+        </w:rPr>
+        <w:t>保存成功。</w:t>
+      </w:r>
+      <w:r>
+        <w:rPr>
+          <w:color w:val="C00000"/>
+          <w:sz w:val="18"/>
+        </w:rPr>
+        <w:t>”</w:t>
+      </w:r>
+      <w:r>
+        <w:rPr>
+          <w:color w:val="C00000"/>
+          <w:sz w:val="18"/>
+        </w:rPr>
+        <w:t>后截图，再输入</w:t>
+      </w:r>
+      <w:r>
+        <w:rPr>
+          <w:color w:val="C00000"/>
+          <w:sz w:val="18"/>
+        </w:rPr>
+        <w:t xml:space="preserve"> 0 </w:t>
+      </w:r>
+      <w:r>
+        <w:rPr>
+          <w:color w:val="C00000"/>
+          <w:sz w:val="18"/>
+        </w:rPr>
+        <w:t>返回主菜单。</w:t>
       </w:r>
     </w:p>
     <w:p>
@@ -13522,7 +13812,7 @@
           <w:noProof/>
         </w:rPr>
         <w:drawing>
-          <wp:inline distT="0" distB="0" distL="0" distR="0" wp14:anchorId="50BDFC52" wp14:editId="2385C596">
+          <wp:inline distT="0" distB="0" distL="0" distR="0" wp14:anchorId="301864B7" wp14:editId="32DC8078">
             <wp:extent cx="5303520" cy="662940"/>
             <wp:effectExtent l="0" t="0" r="0" b="0"/>
             <wp:docPr id="7" name="Picture 7" descr="图 5-4  创建购买订单并计算折扣" title="图 5-4  创建购买订单并计算折扣"/>
@@ -13560,6 +13850,7 @@
     </w:p>
     <w:p>
       <w:pPr>
+        <w:keepNext/>
         <w:spacing w:before="80" w:after="160"/>
         <w:jc w:val="center"/>
       </w:pPr>
@@ -13580,6 +13871,139 @@
           <w:sz w:val="21"/>
         </w:rPr>
         <w:t>创建购买订单并计算折扣</w:t>
+      </w:r>
+    </w:p>
+    <w:p>
+      <w:pPr>
+        <w:spacing w:after="120" w:line="276" w:lineRule="auto"/>
+        <w:ind w:left="160" w:right="160" w:firstLine="0"/>
+      </w:pPr>
+      <w:r>
+        <w:rPr>
+          <w:b/>
+          <w:color w:val="C00000"/>
+          <w:sz w:val="18"/>
+        </w:rPr>
+        <w:t>手动截图方法：</w:t>
+      </w:r>
+      <w:r>
+        <w:rPr>
+          <w:color w:val="C00000"/>
+          <w:sz w:val="18"/>
+        </w:rPr>
+        <w:t>从主菜单输入</w:t>
+      </w:r>
+      <w:r>
+        <w:rPr>
+          <w:color w:val="C00000"/>
+          <w:sz w:val="18"/>
+        </w:rPr>
+        <w:t xml:space="preserve"> 4</w:t>
+      </w:r>
+      <w:r>
+        <w:rPr>
+          <w:color w:val="C00000"/>
+          <w:sz w:val="18"/>
+        </w:rPr>
+        <w:t>，在购买结算管理菜单输入</w:t>
+      </w:r>
+      <w:r>
+        <w:rPr>
+          <w:color w:val="C00000"/>
+          <w:sz w:val="18"/>
+        </w:rPr>
+        <w:t xml:space="preserve"> 1</w:t>
+      </w:r>
+      <w:r>
+        <w:rPr>
+          <w:color w:val="C00000"/>
+          <w:sz w:val="18"/>
+        </w:rPr>
+        <w:t>；客户编号输入</w:t>
+      </w:r>
+      <w:r>
+        <w:rPr>
+          <w:color w:val="C00000"/>
+          <w:sz w:val="18"/>
+        </w:rPr>
+        <w:t xml:space="preserve"> 6</w:t>
+      </w:r>
+      <w:r>
+        <w:rPr>
+          <w:color w:val="C00000"/>
+          <w:sz w:val="18"/>
+        </w:rPr>
+        <w:t>、红酒编号输入</w:t>
+      </w:r>
+      <w:r>
+        <w:rPr>
+          <w:color w:val="C00000"/>
+          <w:sz w:val="18"/>
+        </w:rPr>
+        <w:t xml:space="preserve"> 2</w:t>
+      </w:r>
+      <w:r>
+        <w:rPr>
+          <w:color w:val="C00000"/>
+          <w:sz w:val="18"/>
+        </w:rPr>
+        <w:t>、购买数量输入</w:t>
+      </w:r>
+      <w:r>
+        <w:rPr>
+          <w:color w:val="C00000"/>
+          <w:sz w:val="18"/>
+        </w:rPr>
+        <w:t xml:space="preserve"> 2</w:t>
+      </w:r>
+      <w:r>
+        <w:rPr>
+          <w:color w:val="C00000"/>
+          <w:sz w:val="18"/>
+        </w:rPr>
+        <w:t>、支付方式输入</w:t>
+      </w:r>
+      <w:r>
+        <w:rPr>
+          <w:color w:val="C00000"/>
+          <w:sz w:val="18"/>
+        </w:rPr>
+        <w:t>“</w:t>
+      </w:r>
+      <w:r>
+        <w:rPr>
+          <w:color w:val="C00000"/>
+          <w:sz w:val="18"/>
+        </w:rPr>
+        <w:t>支付宝</w:t>
+      </w:r>
+      <w:r>
+        <w:rPr>
+          <w:color w:val="C00000"/>
+          <w:sz w:val="18"/>
+        </w:rPr>
+        <w:t>”</w:t>
+      </w:r>
+      <w:r>
+        <w:rPr>
+          <w:color w:val="C00000"/>
+          <w:sz w:val="18"/>
+        </w:rPr>
+        <w:t>，出现订单创建成功及订单编号后截图，再输入</w:t>
+      </w:r>
+      <w:r>
+        <w:rPr>
+          <w:color w:val="C00000"/>
+          <w:sz w:val="18"/>
+        </w:rPr>
+        <w:t xml:space="preserve"> 0 </w:t>
+      </w:r>
+      <w:r>
+        <w:rPr>
+          <w:color w:val="C00000"/>
+          <w:sz w:val="18"/>
+        </w:rPr>
+        <w:t>返回主菜单。</w:t>
       </w:r>
     </w:p>
     <w:p>
@@ -13645,7 +14069,7 @@
           <w:noProof/>
         </w:rPr>
         <w:drawing>
-          <wp:inline distT="0" distB="0" distL="0" distR="0" wp14:anchorId="5DF9BF44" wp14:editId="512B813F">
+          <wp:inline distT="0" distB="0" distL="0" distR="0" wp14:anchorId="50395A14" wp14:editId="43418CFA">
             <wp:extent cx="5303520" cy="1489405"/>
             <wp:effectExtent l="0" t="0" r="0" b="0"/>
             <wp:docPr id="8" name="Picture 8" descr="图 5-5  订单主表与订单明细" title="图 5-5  订单主表与订单明细"/>
@@ -13683,6 +14107,7 @@
     </w:p>
     <w:p>
       <w:pPr>
+        <w:keepNext/>
         <w:spacing w:before="80" w:after="160"/>
         <w:jc w:val="center"/>
       </w:pPr>
@@ -13703,6 +14128,83 @@
           <w:sz w:val="21"/>
         </w:rPr>
         <w:t>订单主表与订单明细</w:t>
+      </w:r>
+    </w:p>
+    <w:p>
+      <w:pPr>
+        <w:spacing w:after="120" w:line="276" w:lineRule="auto"/>
+        <w:ind w:left="160" w:right="160" w:firstLine="0"/>
+      </w:pPr>
+      <w:r>
+        <w:rPr>
+          <w:b/>
+          <w:color w:val="C00000"/>
+          <w:sz w:val="18"/>
+        </w:rPr>
+        <w:t>手动截图方法：</w:t>
+      </w:r>
+      <w:r>
+        <w:rPr>
+          <w:color w:val="C00000"/>
+          <w:sz w:val="18"/>
+        </w:rPr>
+        <w:t>从主菜单输入</w:t>
+      </w:r>
+      <w:r>
+        <w:rPr>
+          <w:color w:val="C00000"/>
+          <w:sz w:val="18"/>
+        </w:rPr>
+        <w:t xml:space="preserve"> 5</w:t>
+      </w:r>
+      <w:r>
+        <w:rPr>
+          <w:color w:val="C00000"/>
+          <w:sz w:val="18"/>
+        </w:rPr>
+        <w:t>，在订单查询管理菜单输入</w:t>
+      </w:r>
+      <w:r>
+        <w:rPr>
+          <w:color w:val="C00000"/>
+          <w:sz w:val="18"/>
+        </w:rPr>
+        <w:t xml:space="preserve"> 2</w:t>
+      </w:r>
+      <w:r>
+        <w:rPr>
+          <w:color w:val="C00000"/>
+          <w:sz w:val="18"/>
+        </w:rPr>
+        <w:t>，订单编号输入</w:t>
+      </w:r>
+      <w:r>
+        <w:rPr>
+          <w:color w:val="C00000"/>
+          <w:sz w:val="18"/>
+        </w:rPr>
+        <w:t xml:space="preserve"> 2</w:t>
+      </w:r>
+      <w:r>
+        <w:rPr>
+          <w:color w:val="C00000"/>
+          <w:sz w:val="18"/>
+        </w:rPr>
+        <w:t>；订单主表和订单明细表均显示后截图，再输入</w:t>
+      </w:r>
+      <w:r>
+        <w:rPr>
+          <w:color w:val="C00000"/>
+          <w:sz w:val="18"/>
+        </w:rPr>
+        <w:t xml:space="preserve"> 0 </w:t>
+      </w:r>
+      <w:r>
+        <w:rPr>
+          <w:color w:val="C00000"/>
+          <w:sz w:val="18"/>
+        </w:rPr>
+        <w:t>返回主菜单。</w:t>
       </w:r>
     </w:p>
     <w:p>
@@ -13732,7 +14234,7 @@
           <w:noProof/>
         </w:rPr>
         <w:drawing>
-          <wp:inline distT="0" distB="0" distL="0" distR="0" wp14:anchorId="0D0A3D29" wp14:editId="5CD8F741">
+          <wp:inline distT="0" distB="0" distL="0" distR="0" wp14:anchorId="44CA393F" wp14:editId="1D030B58">
             <wp:extent cx="5303520" cy="662940"/>
             <wp:effectExtent l="0" t="0" r="0" b="0"/>
             <wp:docPr id="9" name="Picture 9" descr="图 5-6  取消订单并恢复库存" title="图 5-6  取消订单并恢复库存"/>
@@ -13770,6 +14272,7 @@
     </w:p>
     <w:p>
       <w:pPr>
+        <w:keepNext/>
         <w:spacing w:before="80" w:after="160"/>
         <w:jc w:val="center"/>
       </w:pPr>
@@ -13790,6 +14293,111 @@
           <w:sz w:val="21"/>
         </w:rPr>
         <w:t>取消订单并恢复库存</w:t>
+      </w:r>
+    </w:p>
+    <w:p>
+      <w:pPr>
+        <w:spacing w:after="120" w:line="276" w:lineRule="auto"/>
+        <w:ind w:left="160" w:right="160" w:firstLine="0"/>
+      </w:pPr>
+      <w:r>
+        <w:rPr>
+          <w:b/>
+          <w:color w:val="C00000"/>
+          <w:sz w:val="18"/>
+        </w:rPr>
+        <w:t>手动截图方法：</w:t>
+      </w:r>
+      <w:r>
+        <w:rPr>
+          <w:color w:val="C00000"/>
+          <w:sz w:val="18"/>
+        </w:rPr>
+        <w:t>从主菜单输入</w:t>
+      </w:r>
+      <w:r>
+        <w:rPr>
+          <w:color w:val="C00000"/>
+          <w:sz w:val="18"/>
+        </w:rPr>
+        <w:t xml:space="preserve"> 4</w:t>
+      </w:r>
+      <w:r>
+        <w:rPr>
+          <w:color w:val="C00000"/>
+          <w:sz w:val="18"/>
+        </w:rPr>
+        <w:t>，在购买结算管理菜单输入</w:t>
+      </w:r>
+      <w:r>
+        <w:rPr>
+          <w:color w:val="C00000"/>
+          <w:sz w:val="18"/>
+        </w:rPr>
+        <w:t xml:space="preserve"> 2</w:t>
+      </w:r>
+      <w:r>
+        <w:rPr>
+          <w:color w:val="C00000"/>
+          <w:sz w:val="18"/>
+        </w:rPr>
+        <w:t>，订单编号输入</w:t>
+      </w:r>
+      <w:r>
+        <w:rPr>
+          <w:color w:val="C00000"/>
+          <w:sz w:val="18"/>
+        </w:rPr>
+        <w:t xml:space="preserve"> 2</w:t>
+      </w:r>
+      <w:r>
+        <w:rPr>
+          <w:color w:val="C00000"/>
+          <w:sz w:val="18"/>
+        </w:rPr>
+        <w:t>；出现</w:t>
+      </w:r>
+      <w:r>
+        <w:rPr>
+          <w:color w:val="C00000"/>
+          <w:sz w:val="18"/>
+        </w:rPr>
+        <w:t>“</w:t>
+      </w:r>
+      <w:r>
+        <w:rPr>
+          <w:color w:val="C00000"/>
+          <w:sz w:val="18"/>
+        </w:rPr>
+        <w:t>订单已取消，库存已恢复。</w:t>
+      </w:r>
+      <w:r>
+        <w:rPr>
+          <w:color w:val="C00000"/>
+          <w:sz w:val="18"/>
+        </w:rPr>
+        <w:t>”</w:t>
+      </w:r>
+      <w:r>
+        <w:rPr>
+          <w:color w:val="C00000"/>
+          <w:sz w:val="18"/>
+        </w:rPr>
+        <w:t>后截图，再输入</w:t>
+      </w:r>
+      <w:r>
+        <w:rPr>
+          <w:color w:val="C00000"/>
+          <w:sz w:val="18"/>
+        </w:rPr>
+        <w:t xml:space="preserve"> 0 </w:t>
+      </w:r>
+      <w:r>
+        <w:rPr>
+          <w:color w:val="C00000"/>
+          <w:sz w:val="18"/>
+        </w:rPr>
+        <w:t>返回主菜单。</w:t>
       </w:r>
     </w:p>
     <w:p>
@@ -13819,7 +14427,7 @@
           <w:noProof/>
         </w:rPr>
         <w:drawing>
-          <wp:inline distT="0" distB="0" distL="0" distR="0" wp14:anchorId="0A925CA5" wp14:editId="2BF8EC3A">
+          <wp:inline distT="0" distB="0" distL="0" distR="0" wp14:anchorId="18D6E033" wp14:editId="0663C4F8">
             <wp:extent cx="5303520" cy="2240737"/>
             <wp:effectExtent l="0" t="0" r="0" b="0"/>
             <wp:docPr id="10" name="Picture 10" descr="图 5-7  销售统计和库存不足查询" title="图 5-7  销售统计和库存不足查询"/>
@@ -13857,6 +14465,7 @@
     </w:p>
     <w:p>
       <w:pPr>
+        <w:keepNext/>
         <w:spacing w:before="80" w:after="160"/>
         <w:jc w:val="center"/>
       </w:pPr>
@@ -13877,6 +14486,111 @@
           <w:sz w:val="21"/>
         </w:rPr>
         <w:t>销售统计和库存不足查询</w:t>
+      </w:r>
+    </w:p>
+    <w:p>
+      <w:pPr>
+        <w:spacing w:after="120" w:line="276" w:lineRule="auto"/>
+        <w:ind w:left="160" w:right="160" w:firstLine="0"/>
+      </w:pPr>
+      <w:r>
+        <w:rPr>
+          <w:b/>
+          <w:color w:val="C00000"/>
+          <w:sz w:val="18"/>
+        </w:rPr>
+        <w:t>手动截图方法：</w:t>
+      </w:r>
+      <w:r>
+        <w:rPr>
+          <w:color w:val="C00000"/>
+          <w:sz w:val="18"/>
+        </w:rPr>
+        <w:t>从主菜单输入</w:t>
+      </w:r>
+      <w:r>
+        <w:rPr>
+          <w:color w:val="C00000"/>
+          <w:sz w:val="18"/>
+        </w:rPr>
+        <w:t xml:space="preserve"> 6</w:t>
+      </w:r>
+      <w:r>
+        <w:rPr>
+          <w:color w:val="C00000"/>
+          <w:sz w:val="18"/>
+        </w:rPr>
+        <w:t>；依次执行选项</w:t>
+      </w:r>
+      <w:r>
+        <w:rPr>
+          <w:color w:val="C00000"/>
+          <w:sz w:val="18"/>
+        </w:rPr>
+        <w:t xml:space="preserve"> 1</w:t>
+      </w:r>
+      <w:r>
+        <w:rPr>
+          <w:color w:val="C00000"/>
+          <w:sz w:val="18"/>
+        </w:rPr>
+        <w:t>（开始日期输入</w:t>
+      </w:r>
+      <w:r>
+        <w:rPr>
+          <w:color w:val="C00000"/>
+          <w:sz w:val="18"/>
+        </w:rPr>
+        <w:t xml:space="preserve"> 2026-01-01</w:t>
+      </w:r>
+      <w:r>
+        <w:rPr>
+          <w:color w:val="C00000"/>
+          <w:sz w:val="18"/>
+        </w:rPr>
+        <w:t>，结束日期输入</w:t>
+      </w:r>
+      <w:r>
+        <w:rPr>
+          <w:color w:val="C00000"/>
+          <w:sz w:val="18"/>
+        </w:rPr>
+        <w:t xml:space="preserve"> 2026-12-31</w:t>
+      </w:r>
+      <w:r>
+        <w:rPr>
+          <w:color w:val="C00000"/>
+          <w:sz w:val="18"/>
+        </w:rPr>
+        <w:t>）、选项</w:t>
+      </w:r>
+      <w:r>
+        <w:rPr>
+          <w:color w:val="C00000"/>
+          <w:sz w:val="18"/>
+        </w:rPr>
+        <w:t xml:space="preserve"> 2 </w:t>
+      </w:r>
+      <w:r>
+        <w:rPr>
+          <w:color w:val="C00000"/>
+          <w:sz w:val="18"/>
+        </w:rPr>
+        <w:t>和选项</w:t>
+      </w:r>
+      <w:r>
+        <w:rPr>
+          <w:color w:val="C00000"/>
+          <w:sz w:val="18"/>
+        </w:rPr>
+        <w:t xml:space="preserve"> 4</w:t>
+      </w:r>
+      <w:r>
+        <w:rPr>
+          <w:color w:val="C00000"/>
+          <w:sz w:val="18"/>
+        </w:rPr>
+        <w:t>，三个查询结果均显示后截图。</w:t>
       </w:r>
     </w:p>
     <w:p>
@@ -13900,7 +14614,7 @@
       <w:pPr>
         <w:pStyle w:val="11"/>
       </w:pPr>
-      <w:bookmarkStart w:id="5" w:name="_Toc235139842"/>
+      <w:bookmarkStart w:id="5" w:name="_Toc235141498"/>
       <w:r>
         <w:t xml:space="preserve">6 </w:t>
       </w:r>
@@ -15400,13 +16114,13 @@
     </w:lvl>
   </w:abstractNum>
   <w:abstractNum w:abstractNumId="1" w15:restartNumberingAfterBreak="0">
-    <w:nsid w:val="075901FB"/>
+    <w:nsid w:val="0FC8150A"/>
     <w:multiLevelType w:val="singleLevel"/>
-    <w:tmpl w:val="6884253C"/>
+    <w:tmpl w:val="B50640EE"/>
     <w:lvl w:ilvl="0">
       <w:start w:val="1"/>
-      <w:numFmt w:val="bullet"/>
-      <w:lvlText w:val="•"/>
+      <w:numFmt w:val="decimal"/>
+      <w:lvlText w:val="%1."/>
       <w:lvlJc w:val="left"/>
       <w:pPr>
         <w:tabs>
@@ -15417,13 +16131,13 @@
     </w:lvl>
   </w:abstractNum>
   <w:abstractNum w:abstractNumId="2" w15:restartNumberingAfterBreak="0">
-    <w:nsid w:val="09D978DD"/>
+    <w:nsid w:val="2257222C"/>
     <w:multiLevelType w:val="singleLevel"/>
-    <w:tmpl w:val="1D862120"/>
+    <w:tmpl w:val="6160F376"/>
     <w:lvl w:ilvl="0">
       <w:start w:val="1"/>
-      <w:numFmt w:val="decimal"/>
-      <w:lvlText w:val="%1."/>
+      <w:numFmt w:val="bullet"/>
+      <w:lvlText w:val="•"/>
       <w:lvlJc w:val="left"/>
       <w:pPr>
         <w:tabs>
@@ -15549,11 +16263,11 @@
       </w:pPr>
     </w:lvl>
   </w:abstractNum>
-  <w:num w:numId="1" w16cid:durableId="423765405">
-    <w:abstractNumId w:val="2"/>
+  <w:num w:numId="1" w16cid:durableId="601306666">
+    <w:abstractNumId w:val="1"/>
   </w:num>
-  <w:num w:numId="2" w16cid:durableId="369964070">
-    <w:abstractNumId w:val="2"/>
+  <w:num w:numId="2" w16cid:durableId="416710644">
+    <w:abstractNumId w:val="1"/>
     <w:lvlOverride w:ilvl="0">
       <w:startOverride w:val="1"/>
     </w:lvlOverride>
@@ -16249,13 +16963,13 @@
     <w:next w:val="a"/>
     <w:autoRedefine/>
     <w:uiPriority w:val="39"/>
-    <w:rsid w:val="00667ED5"/>
+    <w:rsid w:val="00B25FB6"/>
   </w:style>
   <w:style w:type="character" w:styleId="af5">
     <w:name w:val="Hyperlink"/>
     <w:uiPriority w:val="99"/>
     <w:unhideWhenUsed/>
-    <w:rsid w:val="00667ED5"/>
+    <w:rsid w:val="00B25FB6"/>
     <w:rPr>
       <w:color w:val="0563C1"/>
       <w:u w:val="single"/>

</xml_diff>

<commit_message>
docs(report): redesign system diagrams
</commit_message>
<xml_diff>
--- a/Gold红酒销售管理系统大作业文档.docx
+++ b/Gold红酒销售管理系统大作业文档.docx
@@ -590,7 +590,7 @@
       <w:r>
         <w:fldChar w:fldCharType="separate"/>
       </w:r>
-      <w:hyperlink w:anchor="_Toc235141493" w:history="1">
+      <w:hyperlink w:anchor="_Toc235143181" w:history="1">
         <w:r>
           <w:rPr>
             <w:rStyle w:val="af5"/>
@@ -617,7 +617,7 @@
             <w:noProof/>
             <w:webHidden/>
           </w:rPr>
-          <w:instrText xml:space="preserve"> PAGEREF _Toc235141493 \h </w:instrText>
+          <w:instrText xml:space="preserve"> PAGEREF _Toc235143181 \h </w:instrText>
         </w:r>
         <w:r>
           <w:rPr>
@@ -661,7 +661,7 @@
           <w14:ligatures w14:val="standardContextual"/>
         </w:rPr>
       </w:pPr>
-      <w:hyperlink w:anchor="_Toc235141494" w:history="1">
+      <w:hyperlink w:anchor="_Toc235143182" w:history="1">
         <w:r>
           <w:rPr>
             <w:rStyle w:val="af5"/>
@@ -688,7 +688,7 @@
             <w:noProof/>
             <w:webHidden/>
           </w:rPr>
-          <w:instrText xml:space="preserve"> PAGEREF _Toc235141494 \h </w:instrText>
+          <w:instrText xml:space="preserve"> PAGEREF _Toc235143182 \h </w:instrText>
         </w:r>
         <w:r>
           <w:rPr>
@@ -732,7 +732,7 @@
           <w14:ligatures w14:val="standardContextual"/>
         </w:rPr>
       </w:pPr>
-      <w:hyperlink w:anchor="_Toc235141495" w:history="1">
+      <w:hyperlink w:anchor="_Toc235143183" w:history="1">
         <w:r>
           <w:rPr>
             <w:rStyle w:val="af5"/>
@@ -759,7 +759,7 @@
             <w:noProof/>
             <w:webHidden/>
           </w:rPr>
-          <w:instrText xml:space="preserve"> PAGEREF _Toc235141495 \h </w:instrText>
+          <w:instrText xml:space="preserve"> PAGEREF _Toc235143183 \h </w:instrText>
         </w:r>
         <w:r>
           <w:rPr>
@@ -803,7 +803,7 @@
           <w14:ligatures w14:val="standardContextual"/>
         </w:rPr>
       </w:pPr>
-      <w:hyperlink w:anchor="_Toc235141496" w:history="1">
+      <w:hyperlink w:anchor="_Toc235143184" w:history="1">
         <w:r>
           <w:rPr>
             <w:rStyle w:val="af5"/>
@@ -830,7 +830,7 @@
             <w:noProof/>
             <w:webHidden/>
           </w:rPr>
-          <w:instrText xml:space="preserve"> PAGEREF _Toc235141496 \h </w:instrText>
+          <w:instrText xml:space="preserve"> PAGEREF _Toc235143184 \h </w:instrText>
         </w:r>
         <w:r>
           <w:rPr>
@@ -874,7 +874,7 @@
           <w14:ligatures w14:val="standardContextual"/>
         </w:rPr>
       </w:pPr>
-      <w:hyperlink w:anchor="_Toc235141497" w:history="1">
+      <w:hyperlink w:anchor="_Toc235143185" w:history="1">
         <w:r>
           <w:rPr>
             <w:rStyle w:val="af5"/>
@@ -901,7 +901,7 @@
             <w:noProof/>
             <w:webHidden/>
           </w:rPr>
-          <w:instrText xml:space="preserve"> PAGEREF _Toc235141497 \h </w:instrText>
+          <w:instrText xml:space="preserve"> PAGEREF _Toc235143185 \h </w:instrText>
         </w:r>
         <w:r>
           <w:rPr>
@@ -945,7 +945,7 @@
           <w14:ligatures w14:val="standardContextual"/>
         </w:rPr>
       </w:pPr>
-      <w:hyperlink w:anchor="_Toc235141498" w:history="1">
+      <w:hyperlink w:anchor="_Toc235143186" w:history="1">
         <w:r>
           <w:rPr>
             <w:rStyle w:val="af5"/>
@@ -972,7 +972,7 @@
             <w:noProof/>
             <w:webHidden/>
           </w:rPr>
-          <w:instrText xml:space="preserve"> PAGEREF _Toc235141498 \h </w:instrText>
+          <w:instrText xml:space="preserve"> PAGEREF _Toc235143186 \h </w:instrText>
         </w:r>
         <w:r>
           <w:rPr>
@@ -1021,7 +1021,7 @@
       <w:pPr>
         <w:pStyle w:val="11"/>
       </w:pPr>
-      <w:bookmarkStart w:id="0" w:name="_Toc235141493"/>
+      <w:bookmarkStart w:id="0" w:name="_Toc235143181"/>
       <w:r>
         <w:t xml:space="preserve">1 </w:t>
       </w:r>
@@ -1088,8 +1088,8 @@
           <w:noProof/>
         </w:rPr>
         <w:drawing>
-          <wp:inline distT="0" distB="0" distL="0" distR="0" wp14:anchorId="29DCADDE" wp14:editId="1206EBF4">
-            <wp:extent cx="5303520" cy="3489158"/>
+          <wp:inline distT="0" distB="0" distL="0" distR="0" wp14:anchorId="0D6449FD" wp14:editId="5B772F92">
+            <wp:extent cx="5303520" cy="2984816"/>
             <wp:effectExtent l="0" t="0" r="0" b="0"/>
             <wp:docPr id="1" name="Picture 1" descr="图 1-1  系统主要类图" title="图 1-1  系统主要类图"/>
             <wp:cNvGraphicFramePr>
@@ -1111,7 +1111,7 @@
                   <pic:spPr>
                     <a:xfrm>
                       <a:off x="0" y="0"/>
-                      <a:ext cx="5303520" cy="3489158"/>
+                      <a:ext cx="5303520" cy="2984816"/>
                     </a:xfrm>
                     <a:prstGeom prst="rect">
                       <a:avLst/>
@@ -3838,7 +3838,7 @@
       <w:pPr>
         <w:pStyle w:val="11"/>
       </w:pPr>
-      <w:bookmarkStart w:id="1" w:name="_Toc235141494"/>
+      <w:bookmarkStart w:id="1" w:name="_Toc235143182"/>
       <w:r>
         <w:t xml:space="preserve">2 </w:t>
       </w:r>
@@ -11623,7 +11623,7 @@
       <w:pPr>
         <w:pStyle w:val="11"/>
       </w:pPr>
-      <w:bookmarkStart w:id="2" w:name="_Toc235141495"/>
+      <w:bookmarkStart w:id="2" w:name="_Toc235143183"/>
       <w:r>
         <w:t xml:space="preserve">3 </w:t>
       </w:r>
@@ -11671,8 +11671,8 @@
           <w:noProof/>
         </w:rPr>
         <w:drawing>
-          <wp:inline distT="0" distB="0" distL="0" distR="0" wp14:anchorId="2E969C00" wp14:editId="62EB73DB">
-            <wp:extent cx="5303520" cy="2930893"/>
+          <wp:inline distT="0" distB="0" distL="0" distR="0" wp14:anchorId="0668EAE1" wp14:editId="0207705D">
+            <wp:extent cx="5303520" cy="2984816"/>
             <wp:effectExtent l="0" t="0" r="0" b="0"/>
             <wp:docPr id="2" name="Picture 2" descr="图 3-1  系统功能结构" title="图 3-1  系统功能结构"/>
             <wp:cNvGraphicFramePr>
@@ -11694,7 +11694,7 @@
                   <pic:spPr>
                     <a:xfrm>
                       <a:off x="0" y="0"/>
-                      <a:ext cx="5303520" cy="2930893"/>
+                      <a:ext cx="5303520" cy="2984816"/>
                     </a:xfrm>
                     <a:prstGeom prst="rect">
                       <a:avLst/>
@@ -11866,7 +11866,7 @@
           <w:noProof/>
         </w:rPr>
         <w:drawing>
-          <wp:inline distT="0" distB="0" distL="0" distR="0" wp14:anchorId="7DC879D0" wp14:editId="0EF617ED">
+          <wp:inline distT="0" distB="0" distL="0" distR="0" wp14:anchorId="726E6338" wp14:editId="0FE14779">
             <wp:extent cx="5303520" cy="2946400"/>
             <wp:effectExtent l="0" t="0" r="0" b="0"/>
             <wp:docPr id="3" name="Picture 3" descr="图 3-2  购买结算与取消订单流程" title="图 3-2  购买结算与取消订单流程"/>
@@ -12132,7 +12132,7 @@
       <w:pPr>
         <w:pStyle w:val="11"/>
       </w:pPr>
-      <w:bookmarkStart w:id="3" w:name="_Toc235141496"/>
+      <w:bookmarkStart w:id="3" w:name="_Toc235143184"/>
       <w:r>
         <w:t xml:space="preserve">4 </w:t>
       </w:r>
@@ -13129,7 +13129,7 @@
       <w:pPr>
         <w:pStyle w:val="11"/>
       </w:pPr>
-      <w:bookmarkStart w:id="4" w:name="_Toc235141497"/>
+      <w:bookmarkStart w:id="4" w:name="_Toc235143185"/>
       <w:r>
         <w:t xml:space="preserve">5 </w:t>
       </w:r>
@@ -13237,7 +13237,7 @@
           <w:noProof/>
         </w:rPr>
         <w:drawing>
-          <wp:inline distT="0" distB="0" distL="0" distR="0" wp14:anchorId="1200A037" wp14:editId="3D0F0B8A">
+          <wp:inline distT="0" distB="0" distL="0" distR="0" wp14:anchorId="507F9531" wp14:editId="498B6765">
             <wp:extent cx="5303520" cy="1038606"/>
             <wp:effectExtent l="0" t="0" r="0" b="0"/>
             <wp:docPr id="4" name="Picture 4" descr="图 5-1  系统启动与主菜单" title="图 5-1  系统启动与主菜单"/>
@@ -13428,7 +13428,7 @@
           <w:noProof/>
         </w:rPr>
         <w:drawing>
-          <wp:inline distT="0" distB="0" distL="0" distR="0" wp14:anchorId="053A7165" wp14:editId="2E1CF560">
+          <wp:inline distT="0" distB="0" distL="0" distR="0" wp14:anchorId="040A6B6E" wp14:editId="1EC8175B">
             <wp:extent cx="5303520" cy="1264006"/>
             <wp:effectExtent l="0" t="0" r="0" b="0"/>
             <wp:docPr id="5" name="Picture 5" descr="图 5-2  红酒信息查询结果" title="图 5-2  红酒信息查询结果"/>
@@ -13579,7 +13579,7 @@
           <w:noProof/>
         </w:rPr>
         <w:drawing>
-          <wp:inline distT="0" distB="0" distL="0" distR="0" wp14:anchorId="27FE3ADE" wp14:editId="5F252C11">
+          <wp:inline distT="0" distB="0" distL="0" distR="0" wp14:anchorId="7D34C0F7" wp14:editId="6BDBCBCC">
             <wp:extent cx="5303520" cy="662940"/>
             <wp:effectExtent l="0" t="0" r="0" b="0"/>
             <wp:docPr id="6" name="Picture 6" descr="图 5-3  新增演示客户" title="图 5-3  新增演示客户"/>
@@ -13812,7 +13812,7 @@
           <w:noProof/>
         </w:rPr>
         <w:drawing>
-          <wp:inline distT="0" distB="0" distL="0" distR="0" wp14:anchorId="301864B7" wp14:editId="32DC8078">
+          <wp:inline distT="0" distB="0" distL="0" distR="0" wp14:anchorId="6A264BEA" wp14:editId="5A3B451F">
             <wp:extent cx="5303520" cy="662940"/>
             <wp:effectExtent l="0" t="0" r="0" b="0"/>
             <wp:docPr id="7" name="Picture 7" descr="图 5-4  创建购买订单并计算折扣" title="图 5-4  创建购买订单并计算折扣"/>
@@ -14069,7 +14069,7 @@
           <w:noProof/>
         </w:rPr>
         <w:drawing>
-          <wp:inline distT="0" distB="0" distL="0" distR="0" wp14:anchorId="50395A14" wp14:editId="43418CFA">
+          <wp:inline distT="0" distB="0" distL="0" distR="0" wp14:anchorId="2ED78C6E" wp14:editId="1E332D75">
             <wp:extent cx="5303520" cy="1489405"/>
             <wp:effectExtent l="0" t="0" r="0" b="0"/>
             <wp:docPr id="8" name="Picture 8" descr="图 5-5  订单主表与订单明细" title="图 5-5  订单主表与订单明细"/>
@@ -14234,7 +14234,7 @@
           <w:noProof/>
         </w:rPr>
         <w:drawing>
-          <wp:inline distT="0" distB="0" distL="0" distR="0" wp14:anchorId="44CA393F" wp14:editId="1D030B58">
+          <wp:inline distT="0" distB="0" distL="0" distR="0" wp14:anchorId="2C639EA6" wp14:editId="04CA022D">
             <wp:extent cx="5303520" cy="662940"/>
             <wp:effectExtent l="0" t="0" r="0" b="0"/>
             <wp:docPr id="9" name="Picture 9" descr="图 5-6  取消订单并恢复库存" title="图 5-6  取消订单并恢复库存"/>
@@ -14427,7 +14427,7 @@
           <w:noProof/>
         </w:rPr>
         <w:drawing>
-          <wp:inline distT="0" distB="0" distL="0" distR="0" wp14:anchorId="18D6E033" wp14:editId="0663C4F8">
+          <wp:inline distT="0" distB="0" distL="0" distR="0" wp14:anchorId="54C230D8" wp14:editId="38D8A6A9">
             <wp:extent cx="5303520" cy="2240737"/>
             <wp:effectExtent l="0" t="0" r="0" b="0"/>
             <wp:docPr id="10" name="Picture 10" descr="图 5-7  销售统计和库存不足查询" title="图 5-7  销售统计和库存不足查询"/>
@@ -14614,7 +14614,7 @@
       <w:pPr>
         <w:pStyle w:val="11"/>
       </w:pPr>
-      <w:bookmarkStart w:id="5" w:name="_Toc235141498"/>
+      <w:bookmarkStart w:id="5" w:name="_Toc235143186"/>
       <w:r>
         <w:t xml:space="preserve">6 </w:t>
       </w:r>
@@ -16114,26 +16114,9 @@
     </w:lvl>
   </w:abstractNum>
   <w:abstractNum w:abstractNumId="1" w15:restartNumberingAfterBreak="0">
-    <w:nsid w:val="0FC8150A"/>
+    <w:nsid w:val="19354A59"/>
     <w:multiLevelType w:val="singleLevel"/>
-    <w:tmpl w:val="B50640EE"/>
-    <w:lvl w:ilvl="0">
-      <w:start w:val="1"/>
-      <w:numFmt w:val="decimal"/>
-      <w:lvlText w:val="%1."/>
-      <w:lvlJc w:val="left"/>
-      <w:pPr>
-        <w:tabs>
-          <w:tab w:val="num" w:pos="720"/>
-        </w:tabs>
-        <w:ind w:left="720" w:hanging="360"/>
-      </w:pPr>
-    </w:lvl>
-  </w:abstractNum>
-  <w:abstractNum w:abstractNumId="2" w15:restartNumberingAfterBreak="0">
-    <w:nsid w:val="2257222C"/>
-    <w:multiLevelType w:val="singleLevel"/>
-    <w:tmpl w:val="6160F376"/>
+    <w:tmpl w:val="0764DC9A"/>
     <w:lvl w:ilvl="0">
       <w:start w:val="1"/>
       <w:numFmt w:val="bullet"/>
@@ -16147,7 +16130,7 @@
       </w:pPr>
     </w:lvl>
   </w:abstractNum>
-  <w:abstractNum w:abstractNumId="3" w15:restartNumberingAfterBreak="0">
+  <w:abstractNum w:abstractNumId="2" w15:restartNumberingAfterBreak="0">
     <w:nsid w:val="3AC14C30"/>
     <w:multiLevelType w:val="multilevel"/>
     <w:tmpl w:val="3AC14C30"/>
@@ -16263,11 +16246,28 @@
       </w:pPr>
     </w:lvl>
   </w:abstractNum>
-  <w:num w:numId="1" w16cid:durableId="601306666">
-    <w:abstractNumId w:val="1"/>
+  <w:abstractNum w:abstractNumId="3" w15:restartNumberingAfterBreak="0">
+    <w:nsid w:val="44042202"/>
+    <w:multiLevelType w:val="singleLevel"/>
+    <w:tmpl w:val="A3149E5A"/>
+    <w:lvl w:ilvl="0">
+      <w:start w:val="1"/>
+      <w:numFmt w:val="decimal"/>
+      <w:lvlText w:val="%1."/>
+      <w:lvlJc w:val="left"/>
+      <w:pPr>
+        <w:tabs>
+          <w:tab w:val="num" w:pos="720"/>
+        </w:tabs>
+        <w:ind w:left="720" w:hanging="360"/>
+      </w:pPr>
+    </w:lvl>
+  </w:abstractNum>
+  <w:num w:numId="1" w16cid:durableId="367334642">
+    <w:abstractNumId w:val="3"/>
   </w:num>
-  <w:num w:numId="2" w16cid:durableId="416710644">
-    <w:abstractNumId w:val="1"/>
+  <w:num w:numId="2" w16cid:durableId="1047608024">
+    <w:abstractNumId w:val="3"/>
     <w:lvlOverride w:ilvl="0">
       <w:startOverride w:val="1"/>
     </w:lvlOverride>
@@ -16963,13 +16963,13 @@
     <w:next w:val="a"/>
     <w:autoRedefine/>
     <w:uiPriority w:val="39"/>
-    <w:rsid w:val="00B25FB6"/>
+    <w:rsid w:val="00DE3F10"/>
   </w:style>
   <w:style w:type="character" w:styleId="af5">
     <w:name w:val="Hyperlink"/>
     <w:uiPriority w:val="99"/>
     <w:unhideWhenUsed/>
-    <w:rsid w:val="00B25FB6"/>
+    <w:rsid w:val="00DE3F10"/>
     <w:rPr>
       <w:color w:val="0563C1"/>
       <w:u w:val="single"/>

</xml_diff>

<commit_message>
docs(report): finalize assignment document
</commit_message>
<xml_diff>
--- a/Gold红酒销售管理系统大作业文档.docx
+++ b/Gold红酒销售管理系统大作业文档.docx
@@ -5,39 +5,31 @@
     <w:tbl>
       <w:tblPr>
         <w:tblStyle w:val="ae"/>
-        <w:tblW w:w="2700" w:type="dxa"/>
-        <w:tblLayout w:type="fixed"/>
-        <w:tblLook w:val="04A0" w:firstRow="1" w:lastRow="0" w:firstColumn="1" w:lastColumn="0" w:noHBand="0" w:noVBand="1"/>
+        <w:tblW w:w="0" w:type="auto"/>
+        <w:tblInd w:w="4093" w:type="dxa"/>
+        <w:tblLook w:val="0000" w:firstRow="0" w:lastRow="0" w:firstColumn="0" w:lastColumn="0" w:noHBand="0" w:noVBand="0"/>
       </w:tblPr>
       <w:tblGrid>
-        <w:gridCol w:w="1350"/>
-        <w:gridCol w:w="1350"/>
+        <w:gridCol w:w="1940"/>
+        <w:gridCol w:w="1940"/>
       </w:tblGrid>
       <w:tr>
         <w:trPr>
-          <w:cantSplit/>
+          <w:trHeight w:val="604"/>
         </w:trPr>
         <w:tc>
           <w:tcPr>
-            <w:tcW w:w="1350" w:type="dxa"/>
-            <w:tcMar>
-              <w:top w:w="90" w:type="dxa"/>
-              <w:left w:w="120" w:type="dxa"/>
-              <w:bottom w:w="90" w:type="dxa"/>
-              <w:right w:w="120" w:type="dxa"/>
-            </w:tcMar>
-            <w:vAlign w:val="center"/>
-          </w:tcPr>
-          <w:p>
-            <w:pPr>
-              <w:spacing w:line="276" w:lineRule="auto"/>
-              <w:ind w:firstLine="0"/>
-              <w:jc w:val="center"/>
-            </w:pPr>
-            <w:r>
-              <w:rPr>
-                <w:b/>
-                <w:sz w:val="32"/>
+            <w:tcW w:w="1940" w:type="dxa"/>
+          </w:tcPr>
+          <w:p>
+            <w:pPr>
+              <w:pStyle w:val="af3"/>
+            </w:pPr>
+            <w:r>
+              <w:rPr>
+                <w:rFonts w:hint="eastAsia"/>
+                <w:sz w:val="44"/>
+                <w:szCs w:val="44"/>
               </w:rPr>
               <w:t>成绩</w:t>
             </w:r>
@@ -45,20 +37,11 @@
         </w:tc>
         <w:tc>
           <w:tcPr>
-            <w:tcW w:w="1350" w:type="dxa"/>
-            <w:tcMar>
-              <w:top w:w="90" w:type="dxa"/>
-              <w:left w:w="120" w:type="dxa"/>
-              <w:bottom w:w="90" w:type="dxa"/>
-              <w:right w:w="120" w:type="dxa"/>
-            </w:tcMar>
-            <w:vAlign w:val="center"/>
-          </w:tcPr>
-          <w:p>
-            <w:pPr>
-              <w:spacing w:line="276" w:lineRule="auto"/>
-              <w:ind w:firstLine="0"/>
-              <w:jc w:val="center"/>
+            <w:tcW w:w="1940" w:type="dxa"/>
+          </w:tcPr>
+          <w:p>
+            <w:pPr>
+              <w:pStyle w:val="af3"/>
             </w:pPr>
           </w:p>
         </w:tc>
@@ -66,26 +49,42 @@
     </w:tbl>
     <w:p>
       <w:pPr>
-        <w:spacing w:after="480"/>
+        <w:pStyle w:val="af3"/>
       </w:pPr>
     </w:p>
     <w:p>
       <w:pPr>
-        <w:spacing w:after="400"/>
-        <w:jc w:val="center"/>
+        <w:pStyle w:val="af3"/>
       </w:pPr>
-      <w:r>
+    </w:p>
+    <w:p>
+      <w:pPr>
+        <w:ind w:firstLineChars="200" w:firstLine="1440"/>
         <w:rPr>
-          <w:sz w:val="68"/>
+          <w:rFonts w:cs="宋体"/>
+          <w:sz w:val="72"/>
+          <w:szCs w:val="72"/>
         </w:rPr>
-        <w:t xml:space="preserve">JAVA </w:t>
-      </w:r>
+      </w:pPr>
       <w:r>
         <w:rPr>
-          <w:sz w:val="68"/>
+          <w:rFonts w:cs="宋体" w:hint="eastAsia"/>
+          <w:sz w:val="72"/>
+          <w:szCs w:val="72"/>
         </w:rPr>
-        <w:t>高级编程大作业</w:t>
-      </w:r>
+        <w:t>JAVA高级编程大作业</w:t>
+      </w:r>
+    </w:p>
+    <w:p>
+      <w:pPr>
+        <w:pStyle w:val="af1"/>
+        <w:rPr>
+          <w:rFonts w:eastAsia="宋体"/>
+          <w:sz w:val="52"/>
+          <w:szCs w:val="52"/>
+          <w:lang w:eastAsia="zh-CN"/>
+        </w:rPr>
+      </w:pPr>
     </w:p>
     <w:p>
       <w:pPr>
@@ -97,432 +96,502 @@
           <w:b/>
           <w:sz w:val="40"/>
         </w:rPr>
-        <w:t xml:space="preserve">Gold </w:t>
-      </w:r>
-      <w:r>
+        <w:t>Gold 红酒销售管理系统</w:t>
+      </w:r>
+    </w:p>
+    <w:p/>
+    <w:p>
+      <w:pPr>
+        <w:pStyle w:val="af0"/>
+        <w:ind w:left="1260" w:firstLineChars="0" w:firstLine="420"/>
         <w:rPr>
-          <w:b/>
-          <w:sz w:val="40"/>
+          <w:sz w:val="28"/>
+          <w:szCs w:val="28"/>
+          <w:u w:val="single"/>
         </w:rPr>
-        <w:t>红酒销售管理系统</w:t>
+      </w:pPr>
+      <w:r>
+        <w:rPr>
+          <w:rFonts w:hint="eastAsia"/>
+          <w:sz w:val="28"/>
+          <w:szCs w:val="28"/>
+        </w:rPr>
+        <w:t>姓名：</w:t>
+      </w:r>
+      <w:r>
+        <w:rPr>
+          <w:rFonts w:hint="eastAsia"/>
+          <w:sz w:val="28"/>
+          <w:szCs w:val="28"/>
+          <w:u w:val="single"/>
+        </w:rPr>
+        <w:t xml:space="preserve">葛禹贡    </w:t>
+      </w:r>
+      <w:r>
+        <w:rPr>
+          <w:rFonts w:hint="eastAsia"/>
+          <w:sz w:val="28"/>
+          <w:szCs w:val="28"/>
+        </w:rPr>
+        <w:t>学号：</w:t>
+      </w:r>
+      <w:r>
+        <w:rPr>
+          <w:rFonts w:hint="eastAsia"/>
+          <w:sz w:val="28"/>
+          <w:szCs w:val="28"/>
+          <w:u w:val="single"/>
+        </w:rPr>
+        <w:t>20243121880</w:t>
       </w:r>
     </w:p>
     <w:p>
       <w:pPr>
-        <w:spacing w:after="80"/>
-        <w:jc w:val="center"/>
+        <w:pStyle w:val="af0"/>
+        <w:ind w:left="1260" w:firstLineChars="0" w:firstLine="420"/>
+        <w:rPr>
+          <w:sz w:val="28"/>
+          <w:szCs w:val="28"/>
+          <w:u w:val="single"/>
+        </w:rPr>
       </w:pPr>
       <w:r>
         <w:rPr>
-          <w:rFonts w:ascii="黑体" w:eastAsia="黑体" w:hAnsi="黑体"/>
-          <w:b/>
-          <w:sz w:val="30"/>
+          <w:rFonts w:hint="eastAsia"/>
+          <w:sz w:val="28"/>
+          <w:szCs w:val="28"/>
         </w:rPr>
-        <w:t>小组成员</w:t>
-      </w:r>
-    </w:p>
-    <w:tbl>
-      <w:tblPr>
-        <w:tblW w:w="8100" w:type="dxa"/>
-        <w:tblLayout w:type="fixed"/>
-        <w:tblLook w:val="04A0" w:firstRow="1" w:lastRow="0" w:firstColumn="1" w:lastColumn="0" w:noHBand="0" w:noVBand="1"/>
-      </w:tblPr>
-      <w:tblGrid>
-        <w:gridCol w:w="4050"/>
-        <w:gridCol w:w="4050"/>
-      </w:tblGrid>
-      <w:tr>
-        <w:tc>
-          <w:tcPr>
-            <w:tcW w:w="4050" w:type="dxa"/>
-            <w:tcBorders>
-              <w:top w:val="nil"/>
-              <w:left w:val="nil"/>
-              <w:bottom w:val="nil"/>
-              <w:right w:val="nil"/>
-            </w:tcBorders>
-            <w:tcMar>
-              <w:top w:w="90" w:type="dxa"/>
-              <w:left w:w="120" w:type="dxa"/>
-              <w:bottom w:w="90" w:type="dxa"/>
-              <w:right w:w="120" w:type="dxa"/>
-            </w:tcMar>
-            <w:vAlign w:val="center"/>
-          </w:tcPr>
-          <w:p>
-            <w:pPr>
-              <w:spacing w:after="40" w:line="240" w:lineRule="auto"/>
-              <w:ind w:firstLine="0"/>
-              <w:jc w:val="center"/>
-            </w:pPr>
-            <w:r>
-              <w:t>姓名：葛禹贡</w:t>
-            </w:r>
-            <w:r>
-              <w:t xml:space="preserve">    </w:t>
-            </w:r>
-            <w:r>
-              <w:t>学号：</w:t>
-            </w:r>
-            <w:r>
-              <w:t>____________</w:t>
-            </w:r>
-          </w:p>
-        </w:tc>
-        <w:tc>
-          <w:tcPr>
-            <w:tcW w:w="4050" w:type="dxa"/>
-            <w:tcBorders>
-              <w:top w:val="nil"/>
-              <w:left w:val="nil"/>
-              <w:bottom w:val="nil"/>
-              <w:right w:val="nil"/>
-            </w:tcBorders>
-            <w:tcMar>
-              <w:top w:w="90" w:type="dxa"/>
-              <w:left w:w="120" w:type="dxa"/>
-              <w:bottom w:w="90" w:type="dxa"/>
-              <w:right w:w="120" w:type="dxa"/>
-            </w:tcMar>
-            <w:vAlign w:val="center"/>
-          </w:tcPr>
-          <w:p>
-            <w:pPr>
-              <w:spacing w:after="40" w:line="240" w:lineRule="auto"/>
-              <w:ind w:firstLine="0"/>
-              <w:jc w:val="center"/>
-            </w:pPr>
-            <w:r>
-              <w:t>姓名：胡嘉祺</w:t>
-            </w:r>
-            <w:r>
-              <w:t xml:space="preserve">    </w:t>
-            </w:r>
-            <w:r>
-              <w:t>学号：</w:t>
-            </w:r>
-            <w:r>
-              <w:t>____________</w:t>
-            </w:r>
-          </w:p>
-        </w:tc>
-      </w:tr>
-      <w:tr>
-        <w:tc>
-          <w:tcPr>
-            <w:tcW w:w="4050" w:type="dxa"/>
-            <w:tcBorders>
-              <w:top w:val="nil"/>
-              <w:left w:val="nil"/>
-              <w:bottom w:val="nil"/>
-              <w:right w:val="nil"/>
-            </w:tcBorders>
-            <w:tcMar>
-              <w:top w:w="90" w:type="dxa"/>
-              <w:left w:w="120" w:type="dxa"/>
-              <w:bottom w:w="90" w:type="dxa"/>
-              <w:right w:w="120" w:type="dxa"/>
-            </w:tcMar>
-            <w:vAlign w:val="center"/>
-          </w:tcPr>
-          <w:p>
-            <w:pPr>
-              <w:spacing w:after="40" w:line="240" w:lineRule="auto"/>
-              <w:ind w:firstLine="0"/>
-              <w:jc w:val="center"/>
-            </w:pPr>
-            <w:r>
-              <w:t>姓名：王福淇</w:t>
-            </w:r>
-            <w:r>
-              <w:t xml:space="preserve">    </w:t>
-            </w:r>
-            <w:r>
-              <w:t>学号：</w:t>
-            </w:r>
-            <w:r>
-              <w:t>____________</w:t>
-            </w:r>
-          </w:p>
-        </w:tc>
-        <w:tc>
-          <w:tcPr>
-            <w:tcW w:w="4050" w:type="dxa"/>
-            <w:tcBorders>
-              <w:top w:val="nil"/>
-              <w:left w:val="nil"/>
-              <w:bottom w:val="nil"/>
-              <w:right w:val="nil"/>
-            </w:tcBorders>
-            <w:tcMar>
-              <w:top w:w="90" w:type="dxa"/>
-              <w:left w:w="120" w:type="dxa"/>
-              <w:bottom w:w="90" w:type="dxa"/>
-              <w:right w:w="120" w:type="dxa"/>
-            </w:tcMar>
-            <w:vAlign w:val="center"/>
-          </w:tcPr>
-          <w:p>
-            <w:pPr>
-              <w:spacing w:after="40" w:line="240" w:lineRule="auto"/>
-              <w:ind w:firstLine="0"/>
-              <w:jc w:val="center"/>
-            </w:pPr>
-            <w:r>
-              <w:t>姓名：赵靖羽</w:t>
-            </w:r>
-            <w:r>
-              <w:t xml:space="preserve">    </w:t>
-            </w:r>
-            <w:r>
-              <w:t>学号：</w:t>
-            </w:r>
-            <w:r>
-              <w:t>____________</w:t>
-            </w:r>
-          </w:p>
-        </w:tc>
-      </w:tr>
-      <w:tr>
-        <w:tc>
-          <w:tcPr>
-            <w:tcW w:w="4050" w:type="dxa"/>
-            <w:tcBorders>
-              <w:top w:val="nil"/>
-              <w:left w:val="nil"/>
-              <w:bottom w:val="nil"/>
-              <w:right w:val="nil"/>
-            </w:tcBorders>
-            <w:tcMar>
-              <w:top w:w="90" w:type="dxa"/>
-              <w:left w:w="120" w:type="dxa"/>
-              <w:bottom w:w="90" w:type="dxa"/>
-              <w:right w:w="120" w:type="dxa"/>
-            </w:tcMar>
-            <w:vAlign w:val="center"/>
-          </w:tcPr>
-          <w:p>
-            <w:pPr>
-              <w:spacing w:after="40" w:line="240" w:lineRule="auto"/>
-              <w:ind w:firstLine="0"/>
-              <w:jc w:val="center"/>
-            </w:pPr>
-            <w:r>
-              <w:t>姓名：冯天浩</w:t>
-            </w:r>
-            <w:r>
-              <w:t xml:space="preserve">    </w:t>
-            </w:r>
-            <w:r>
-              <w:t>学号：</w:t>
-            </w:r>
-            <w:r>
-              <w:t>____________</w:t>
-            </w:r>
-          </w:p>
-        </w:tc>
-        <w:tc>
-          <w:tcPr>
-            <w:tcW w:w="4050" w:type="dxa"/>
-            <w:tcBorders>
-              <w:top w:val="nil"/>
-              <w:left w:val="nil"/>
-              <w:bottom w:val="nil"/>
-              <w:right w:val="nil"/>
-            </w:tcBorders>
-            <w:tcMar>
-              <w:top w:w="90" w:type="dxa"/>
-              <w:left w:w="120" w:type="dxa"/>
-              <w:bottom w:w="90" w:type="dxa"/>
-              <w:right w:w="120" w:type="dxa"/>
-            </w:tcMar>
-            <w:vAlign w:val="center"/>
-          </w:tcPr>
-          <w:p>
-            <w:pPr>
-              <w:spacing w:after="40" w:line="240" w:lineRule="auto"/>
-              <w:ind w:firstLine="0"/>
-              <w:jc w:val="center"/>
-            </w:pPr>
-            <w:r>
-              <w:t>姓名：何依瞳</w:t>
-            </w:r>
-            <w:r>
-              <w:t xml:space="preserve">    </w:t>
-            </w:r>
-            <w:r>
-              <w:t>学号：</w:t>
-            </w:r>
-            <w:r>
-              <w:t>____________</w:t>
-            </w:r>
-          </w:p>
-        </w:tc>
-      </w:tr>
-      <w:tr>
-        <w:tc>
-          <w:tcPr>
-            <w:tcW w:w="4050" w:type="dxa"/>
-            <w:tcBorders>
-              <w:top w:val="nil"/>
-              <w:left w:val="nil"/>
-              <w:bottom w:val="nil"/>
-              <w:right w:val="nil"/>
-            </w:tcBorders>
-            <w:tcMar>
-              <w:top w:w="90" w:type="dxa"/>
-              <w:left w:w="120" w:type="dxa"/>
-              <w:bottom w:w="90" w:type="dxa"/>
-              <w:right w:w="120" w:type="dxa"/>
-            </w:tcMar>
-            <w:vAlign w:val="center"/>
-          </w:tcPr>
-          <w:p>
-            <w:pPr>
-              <w:spacing w:after="40" w:line="240" w:lineRule="auto"/>
-              <w:ind w:firstLine="0"/>
-              <w:jc w:val="center"/>
-            </w:pPr>
-            <w:r>
-              <w:t>姓名：蓝海洋</w:t>
-            </w:r>
-            <w:r>
-              <w:t xml:space="preserve">    </w:t>
-            </w:r>
-            <w:r>
-              <w:t>学号：</w:t>
-            </w:r>
-            <w:r>
-              <w:t>____________</w:t>
-            </w:r>
-          </w:p>
-        </w:tc>
-        <w:tc>
-          <w:tcPr>
-            <w:tcW w:w="4050" w:type="dxa"/>
-            <w:tcBorders>
-              <w:top w:val="nil"/>
-              <w:left w:val="nil"/>
-              <w:bottom w:val="nil"/>
-              <w:right w:val="nil"/>
-            </w:tcBorders>
-            <w:tcMar>
-              <w:top w:w="90" w:type="dxa"/>
-              <w:left w:w="120" w:type="dxa"/>
-              <w:bottom w:w="90" w:type="dxa"/>
-              <w:right w:w="120" w:type="dxa"/>
-            </w:tcMar>
-            <w:vAlign w:val="center"/>
-          </w:tcPr>
-          <w:p>
-            <w:pPr>
-              <w:spacing w:after="40" w:line="240" w:lineRule="auto"/>
-              <w:ind w:firstLine="0"/>
-              <w:jc w:val="center"/>
-            </w:pPr>
-            <w:r>
-              <w:t>姓名：曾欣欣</w:t>
-            </w:r>
-            <w:r>
-              <w:t xml:space="preserve">    </w:t>
-            </w:r>
-            <w:r>
-              <w:t>学号：</w:t>
-            </w:r>
-            <w:r>
-              <w:t>____________</w:t>
-            </w:r>
-          </w:p>
-        </w:tc>
-      </w:tr>
-      <w:tr>
-        <w:tc>
-          <w:tcPr>
-            <w:tcW w:w="4050" w:type="dxa"/>
-            <w:tcBorders>
-              <w:top w:val="nil"/>
-              <w:left w:val="nil"/>
-              <w:bottom w:val="nil"/>
-              <w:right w:val="nil"/>
-            </w:tcBorders>
-            <w:tcMar>
-              <w:top w:w="90" w:type="dxa"/>
-              <w:left w:w="120" w:type="dxa"/>
-              <w:bottom w:w="90" w:type="dxa"/>
-              <w:right w:w="120" w:type="dxa"/>
-            </w:tcMar>
-            <w:vAlign w:val="center"/>
-          </w:tcPr>
-          <w:p>
-            <w:pPr>
-              <w:spacing w:after="40" w:line="240" w:lineRule="auto"/>
-              <w:ind w:firstLine="0"/>
-              <w:jc w:val="center"/>
-            </w:pPr>
-            <w:r>
-              <w:t>姓名：张雅</w:t>
-            </w:r>
-            <w:r>
-              <w:t xml:space="preserve">    </w:t>
-            </w:r>
-            <w:r>
-              <w:t>学号：</w:t>
-            </w:r>
-            <w:r>
-              <w:t>____________</w:t>
-            </w:r>
-          </w:p>
-        </w:tc>
-        <w:tc>
-          <w:tcPr>
-            <w:tcW w:w="4050" w:type="dxa"/>
-            <w:tcBorders>
-              <w:top w:val="nil"/>
-              <w:left w:val="nil"/>
-              <w:bottom w:val="nil"/>
-              <w:right w:val="nil"/>
-            </w:tcBorders>
-            <w:tcMar>
-              <w:top w:w="90" w:type="dxa"/>
-              <w:left w:w="120" w:type="dxa"/>
-              <w:bottom w:w="90" w:type="dxa"/>
-              <w:right w:w="120" w:type="dxa"/>
-            </w:tcMar>
-            <w:vAlign w:val="center"/>
-          </w:tcPr>
-          <w:p>
-            <w:pPr>
-              <w:spacing w:after="40" w:line="240" w:lineRule="auto"/>
-              <w:ind w:firstLine="0"/>
-              <w:jc w:val="center"/>
-            </w:pPr>
-          </w:p>
-        </w:tc>
-      </w:tr>
-    </w:tbl>
-    <w:p>
-      <w:pPr>
-        <w:spacing w:before="280"/>
-        <w:jc w:val="center"/>
-      </w:pPr>
+        <w:t>姓名：</w:t>
+      </w:r>
       <w:r>
         <w:rPr>
-          <w:b/>
-          <w:sz w:val="32"/>
+          <w:rFonts w:hint="eastAsia"/>
+          <w:sz w:val="28"/>
+          <w:szCs w:val="28"/>
+          <w:u w:val="single"/>
         </w:rPr>
-        <w:t>大连理工大学</w:t>
+        <w:t xml:space="preserve">胡嘉祺    </w:t>
+      </w:r>
+      <w:r>
+        <w:rPr>
+          <w:rFonts w:hint="eastAsia"/>
+          <w:sz w:val="28"/>
+          <w:szCs w:val="28"/>
+        </w:rPr>
+        <w:t>学号：</w:t>
+      </w:r>
+      <w:r>
+        <w:rPr>
+          <w:rFonts w:hint="eastAsia"/>
+          <w:sz w:val="28"/>
+          <w:szCs w:val="28"/>
+          <w:u w:val="single"/>
+        </w:rPr>
+        <w:t>20241045179</w:t>
       </w:r>
     </w:p>
     <w:p>
       <w:pPr>
-        <w:jc w:val="center"/>
+        <w:pStyle w:val="af0"/>
+        <w:ind w:left="1260" w:firstLineChars="0" w:firstLine="420"/>
+        <w:rPr>
+          <w:sz w:val="28"/>
+          <w:szCs w:val="28"/>
+          <w:u w:val="single"/>
+        </w:rPr>
       </w:pPr>
       <w:r>
         <w:rPr>
-          <w:rFonts w:ascii="Times New Roman" w:eastAsia="Times New Roman" w:hAnsi="Times New Roman"/>
+          <w:rFonts w:hint="eastAsia"/>
+          <w:sz w:val="28"/>
+          <w:szCs w:val="28"/>
+        </w:rPr>
+        <w:t>姓名：</w:t>
+      </w:r>
+      <w:r>
+        <w:rPr>
+          <w:rFonts w:hint="eastAsia"/>
+          <w:sz w:val="28"/>
+          <w:szCs w:val="28"/>
+          <w:u w:val="single"/>
+        </w:rPr>
+        <w:t xml:space="preserve">王福淇    </w:t>
+      </w:r>
+      <w:r>
+        <w:rPr>
+          <w:rFonts w:hint="eastAsia"/>
+          <w:sz w:val="28"/>
+          <w:szCs w:val="28"/>
+        </w:rPr>
+        <w:t>学号：</w:t>
+      </w:r>
+      <w:r>
+        <w:rPr>
+          <w:rFonts w:hint="eastAsia"/>
+          <w:sz w:val="28"/>
+          <w:szCs w:val="28"/>
+          <w:u w:val="single"/>
+        </w:rPr>
+        <w:t>20242081208</w:t>
+      </w:r>
+    </w:p>
+    <w:p>
+      <w:pPr>
+        <w:pStyle w:val="af0"/>
+        <w:ind w:left="1260" w:firstLineChars="0" w:firstLine="420"/>
+        <w:rPr>
+          <w:sz w:val="28"/>
+          <w:szCs w:val="28"/>
+          <w:u w:val="single"/>
+        </w:rPr>
+      </w:pPr>
+      <w:r>
+        <w:rPr>
+          <w:rFonts w:hint="eastAsia"/>
+          <w:sz w:val="28"/>
+          <w:szCs w:val="28"/>
+        </w:rPr>
+        <w:t>姓名：</w:t>
+      </w:r>
+      <w:r>
+        <w:rPr>
+          <w:sz w:val="28"/>
+          <w:szCs w:val="28"/>
+          <w:u w:val="single"/>
+        </w:rPr>
+        <w:t>赵靖羽</w:t>
+      </w:r>
+      <w:r>
+        <w:rPr>
+          <w:rFonts w:hint="eastAsia"/>
+          <w:sz w:val="28"/>
+          <w:szCs w:val="28"/>
+          <w:u w:val="single"/>
+        </w:rPr>
+        <w:t xml:space="preserve">    </w:t>
+      </w:r>
+      <w:r>
+        <w:rPr>
+          <w:rFonts w:hint="eastAsia"/>
+          <w:sz w:val="28"/>
+          <w:szCs w:val="28"/>
+        </w:rPr>
+        <w:t>学号：</w:t>
+      </w:r>
+      <w:r>
+        <w:rPr>
+          <w:rFonts w:hint="eastAsia"/>
+          <w:sz w:val="28"/>
+          <w:szCs w:val="28"/>
+          <w:u w:val="single"/>
+        </w:rPr>
+        <w:t>20241045204</w:t>
+      </w:r>
+    </w:p>
+    <w:p>
+      <w:pPr>
+        <w:pStyle w:val="af0"/>
+        <w:ind w:left="1260" w:firstLineChars="0" w:firstLine="420"/>
+        <w:rPr>
+          <w:sz w:val="28"/>
+          <w:szCs w:val="28"/>
+          <w:u w:val="single"/>
+        </w:rPr>
+      </w:pPr>
+      <w:r>
+        <w:rPr>
+          <w:rFonts w:hint="eastAsia"/>
+          <w:sz w:val="28"/>
+          <w:szCs w:val="28"/>
+        </w:rPr>
+        <w:t>姓名：</w:t>
+      </w:r>
+      <w:r>
+        <w:rPr>
+          <w:rFonts w:hint="eastAsia"/>
+          <w:sz w:val="28"/>
+          <w:szCs w:val="28"/>
+          <w:u w:val="single"/>
+        </w:rPr>
+        <w:t xml:space="preserve">冯天浩    </w:t>
+      </w:r>
+      <w:r>
+        <w:rPr>
+          <w:rFonts w:hint="eastAsia"/>
+          <w:sz w:val="28"/>
+          <w:szCs w:val="28"/>
+        </w:rPr>
+        <w:t>学号：</w:t>
+      </w:r>
+      <w:r>
+        <w:rPr>
+          <w:rFonts w:hint="eastAsia"/>
+          <w:sz w:val="28"/>
+          <w:szCs w:val="28"/>
+          <w:u w:val="single"/>
+        </w:rPr>
+        <w:t>20242081440</w:t>
+      </w:r>
+    </w:p>
+    <w:p>
+      <w:pPr>
+        <w:pStyle w:val="af0"/>
+        <w:ind w:left="1260" w:firstLineChars="0" w:firstLine="420"/>
+        <w:rPr>
+          <w:sz w:val="28"/>
+          <w:szCs w:val="28"/>
+          <w:u w:val="single"/>
+        </w:rPr>
+      </w:pPr>
+      <w:r>
+        <w:rPr>
+          <w:rFonts w:hint="eastAsia"/>
+          <w:sz w:val="28"/>
+          <w:szCs w:val="28"/>
+        </w:rPr>
+        <w:t>姓名：</w:t>
+      </w:r>
+      <w:r>
+        <w:rPr>
+          <w:rFonts w:hint="eastAsia"/>
+          <w:sz w:val="28"/>
+          <w:szCs w:val="28"/>
+          <w:u w:val="single"/>
+        </w:rPr>
+        <w:t xml:space="preserve">何依瞳    </w:t>
+      </w:r>
+      <w:r>
+        <w:rPr>
+          <w:rFonts w:hint="eastAsia"/>
+          <w:sz w:val="28"/>
+          <w:szCs w:val="28"/>
+        </w:rPr>
+        <w:t>学号：</w:t>
+      </w:r>
+      <w:r>
+        <w:rPr>
+          <w:rFonts w:hint="eastAsia"/>
+          <w:sz w:val="28"/>
+          <w:szCs w:val="28"/>
+          <w:u w:val="single"/>
+        </w:rPr>
+        <w:t>20242081448</w:t>
+      </w:r>
+    </w:p>
+    <w:p>
+      <w:pPr>
+        <w:pStyle w:val="af0"/>
+        <w:ind w:left="1260" w:firstLineChars="0" w:firstLine="420"/>
+        <w:rPr>
+          <w:sz w:val="28"/>
+          <w:szCs w:val="28"/>
+          <w:u w:val="single"/>
+        </w:rPr>
+      </w:pPr>
+      <w:r>
+        <w:rPr>
+          <w:rFonts w:hint="eastAsia"/>
+          <w:sz w:val="28"/>
+          <w:szCs w:val="28"/>
+        </w:rPr>
+        <w:t>姓名：</w:t>
+      </w:r>
+      <w:r>
+        <w:rPr>
+          <w:rFonts w:hint="eastAsia"/>
+          <w:sz w:val="28"/>
+          <w:szCs w:val="28"/>
+          <w:u w:val="single"/>
+        </w:rPr>
+        <w:t xml:space="preserve">蓝海洋    </w:t>
+      </w:r>
+      <w:r>
+        <w:rPr>
+          <w:rFonts w:hint="eastAsia"/>
+          <w:sz w:val="28"/>
+          <w:szCs w:val="28"/>
+        </w:rPr>
+        <w:t>学号：</w:t>
+      </w:r>
+      <w:r>
+        <w:rPr>
+          <w:rFonts w:hint="eastAsia"/>
+          <w:sz w:val="28"/>
+          <w:szCs w:val="28"/>
+          <w:u w:val="single"/>
+        </w:rPr>
+        <w:t>20242081550</w:t>
+      </w:r>
+    </w:p>
+    <w:p>
+      <w:pPr>
+        <w:pStyle w:val="af0"/>
+        <w:ind w:left="1260" w:firstLineChars="0" w:firstLine="420"/>
+        <w:rPr>
+          <w:sz w:val="28"/>
+          <w:szCs w:val="28"/>
+          <w:u w:val="single"/>
+        </w:rPr>
+      </w:pPr>
+      <w:r>
+        <w:rPr>
+          <w:rFonts w:hint="eastAsia"/>
+          <w:sz w:val="28"/>
+          <w:szCs w:val="28"/>
+        </w:rPr>
+        <w:t>姓名：</w:t>
+      </w:r>
+      <w:r>
+        <w:rPr>
+          <w:rFonts w:hint="eastAsia"/>
+          <w:sz w:val="28"/>
+          <w:szCs w:val="28"/>
+          <w:u w:val="single"/>
+        </w:rPr>
+        <w:t xml:space="preserve">曾欣欣    </w:t>
+      </w:r>
+      <w:r>
+        <w:rPr>
+          <w:rFonts w:hint="eastAsia"/>
+          <w:sz w:val="28"/>
+          <w:szCs w:val="28"/>
+        </w:rPr>
+        <w:t>学号：</w:t>
+      </w:r>
+      <w:r>
+        <w:rPr>
+          <w:rFonts w:hint="eastAsia"/>
+          <w:sz w:val="28"/>
+          <w:szCs w:val="28"/>
+          <w:u w:val="single"/>
+        </w:rPr>
+        <w:t>20243121842</w:t>
+      </w:r>
+    </w:p>
+    <w:p>
+      <w:pPr>
+        <w:pStyle w:val="af0"/>
+        <w:ind w:left="1260" w:firstLineChars="0" w:firstLine="420"/>
+        <w:rPr>
+          <w:u w:val="single"/>
+        </w:rPr>
+      </w:pPr>
+      <w:r>
+        <w:rPr>
+          <w:rFonts w:hint="eastAsia"/>
+          <w:sz w:val="28"/>
+          <w:szCs w:val="28"/>
+        </w:rPr>
+        <w:t>姓名：</w:t>
+      </w:r>
+      <w:r>
+        <w:rPr>
+          <w:rFonts w:hint="eastAsia"/>
+          <w:sz w:val="28"/>
+          <w:szCs w:val="28"/>
+          <w:u w:val="single"/>
+        </w:rPr>
+        <w:t xml:space="preserve">张雅    </w:t>
+      </w:r>
+      <w:r>
+        <w:rPr>
+          <w:sz w:val="28"/>
+          <w:szCs w:val="28"/>
+          <w:u w:val="single"/>
+        </w:rPr>
+        <w:tab/>
+      </w:r>
+      <w:r>
+        <w:rPr>
+          <w:rFonts w:hint="eastAsia"/>
+          <w:sz w:val="28"/>
+          <w:szCs w:val="28"/>
+          <w:u w:val="single"/>
+        </w:rPr>
+        <w:t xml:space="preserve"> </w:t>
+      </w:r>
+      <w:r>
+        <w:rPr>
+          <w:rFonts w:hint="eastAsia"/>
+          <w:sz w:val="28"/>
+          <w:szCs w:val="28"/>
+        </w:rPr>
+        <w:t>学号：</w:t>
+      </w:r>
+      <w:r>
+        <w:rPr>
+          <w:rFonts w:hint="eastAsia"/>
+          <w:sz w:val="28"/>
+          <w:szCs w:val="28"/>
+          <w:u w:val="single"/>
+        </w:rPr>
+        <w:t>20243121552</w:t>
+      </w:r>
+    </w:p>
+    <w:p>
+      <w:pPr>
+        <w:pStyle w:val="af0"/>
+        <w:ind w:left="1260" w:firstLineChars="0" w:firstLine="420"/>
+        <w:rPr>
+          <w:u w:val="single"/>
+        </w:rPr>
+      </w:pPr>
+    </w:p>
+    <w:p>
+      <w:pPr>
+        <w:pStyle w:val="af0"/>
+        <w:ind w:firstLineChars="0" w:firstLine="0"/>
+      </w:pPr>
+      <w:r>
+        <w:rPr>
+          <w:rFonts w:hint="eastAsia"/>
+        </w:rPr>
+        <w:t xml:space="preserve">   </w:t>
+      </w:r>
+    </w:p>
+    <w:p>
+      <w:pPr>
+        <w:pStyle w:val="af2"/>
+      </w:pPr>
+      <w:r>
+        <w:rPr>
+          <w:rFonts w:hint="eastAsia"/>
+        </w:rPr>
+        <w:t>大连理工大学</w:t>
+      </w:r>
+    </w:p>
+    <w:p>
+      <w:pPr>
+        <w:pStyle w:val="af4"/>
+      </w:pPr>
+      <w:r>
+        <w:rPr>
+          <w:rFonts w:hint="eastAsia"/>
         </w:rPr>
         <w:t>Dalian University of Technology</w:t>
       </w:r>
+    </w:p>
+    <w:p>
+      <w:pPr>
+        <w:ind w:firstLineChars="200" w:firstLine="562"/>
+        <w:jc w:val="center"/>
+        <w:rPr>
+          <w:b/>
+          <w:sz w:val="28"/>
+          <w:szCs w:val="28"/>
+        </w:rPr>
+      </w:pPr>
+    </w:p>
+    <w:p>
+      <w:pPr>
+        <w:ind w:firstLineChars="200" w:firstLine="562"/>
+        <w:jc w:val="center"/>
+        <w:rPr>
+          <w:b/>
+          <w:sz w:val="28"/>
+          <w:szCs w:val="28"/>
+        </w:rPr>
+      </w:pPr>
     </w:p>
     <w:p>
       <w:pPr>
@@ -547,25 +616,7 @@
           <w:sz w:val="36"/>
         </w:rPr>
         <w:lastRenderedPageBreak/>
-        <w:t>目</w:t>
-      </w:r>
-      <w:r>
-        <w:rPr>
-          <w:rFonts w:ascii="黑体" w:eastAsia="黑体" w:hAnsi="黑体"/>
-          <w:b/>
-          <w:color w:val="000000"/>
-          <w:sz w:val="36"/>
-        </w:rPr>
-        <w:t xml:space="preserve">  </w:t>
-      </w:r>
-      <w:r>
-        <w:rPr>
-          <w:rFonts w:ascii="黑体" w:eastAsia="黑体" w:hAnsi="黑体"/>
-          <w:b/>
-          <w:color w:val="000000"/>
-          <w:sz w:val="36"/>
-        </w:rPr>
-        <w:t>录</w:t>
+        <w:t>目  录</w:t>
       </w:r>
     </w:p>
     <w:p>
@@ -590,7 +641,7 @@
       <w:r>
         <w:fldChar w:fldCharType="separate"/>
       </w:r>
-      <w:hyperlink w:anchor="_Toc235143181" w:history="1">
+      <w:hyperlink w:anchor="_Toc235194131" w:history="1">
         <w:r>
           <w:rPr>
             <w:rStyle w:val="af5"/>
@@ -617,7 +668,7 @@
             <w:noProof/>
             <w:webHidden/>
           </w:rPr>
-          <w:instrText xml:space="preserve"> PAGEREF _Toc235143181 \h </w:instrText>
+          <w:instrText xml:space="preserve"> PAGEREF _Toc235194131 \h </w:instrText>
         </w:r>
         <w:r>
           <w:rPr>
@@ -661,7 +712,7 @@
           <w14:ligatures w14:val="standardContextual"/>
         </w:rPr>
       </w:pPr>
-      <w:hyperlink w:anchor="_Toc235143182" w:history="1">
+      <w:hyperlink w:anchor="_Toc235194132" w:history="1">
         <w:r>
           <w:rPr>
             <w:rStyle w:val="af5"/>
@@ -688,7 +739,7 @@
             <w:noProof/>
             <w:webHidden/>
           </w:rPr>
-          <w:instrText xml:space="preserve"> PAGEREF _Toc235143182 \h </w:instrText>
+          <w:instrText xml:space="preserve"> PAGEREF _Toc235194132 \h </w:instrText>
         </w:r>
         <w:r>
           <w:rPr>
@@ -732,7 +783,7 @@
           <w14:ligatures w14:val="standardContextual"/>
         </w:rPr>
       </w:pPr>
-      <w:hyperlink w:anchor="_Toc235143183" w:history="1">
+      <w:hyperlink w:anchor="_Toc235194133" w:history="1">
         <w:r>
           <w:rPr>
             <w:rStyle w:val="af5"/>
@@ -759,7 +810,7 @@
             <w:noProof/>
             <w:webHidden/>
           </w:rPr>
-          <w:instrText xml:space="preserve"> PAGEREF _Toc235143183 \h </w:instrText>
+          <w:instrText xml:space="preserve"> PAGEREF _Toc235194133 \h </w:instrText>
         </w:r>
         <w:r>
           <w:rPr>
@@ -779,7 +830,7 @@
             <w:noProof/>
             <w:webHidden/>
           </w:rPr>
-          <w:t>8</w:t>
+          <w:t>7</w:t>
         </w:r>
         <w:r>
           <w:rPr>
@@ -803,7 +854,7 @@
           <w14:ligatures w14:val="standardContextual"/>
         </w:rPr>
       </w:pPr>
-      <w:hyperlink w:anchor="_Toc235143184" w:history="1">
+      <w:hyperlink w:anchor="_Toc235194134" w:history="1">
         <w:r>
           <w:rPr>
             <w:rStyle w:val="af5"/>
@@ -830,7 +881,7 @@
             <w:noProof/>
             <w:webHidden/>
           </w:rPr>
-          <w:instrText xml:space="preserve"> PAGEREF _Toc235143184 \h </w:instrText>
+          <w:instrText xml:space="preserve"> PAGEREF _Toc235194134 \h </w:instrText>
         </w:r>
         <w:r>
           <w:rPr>
@@ -850,7 +901,7 @@
             <w:noProof/>
             <w:webHidden/>
           </w:rPr>
-          <w:t>11</w:t>
+          <w:t>10</w:t>
         </w:r>
         <w:r>
           <w:rPr>
@@ -874,7 +925,7 @@
           <w14:ligatures w14:val="standardContextual"/>
         </w:rPr>
       </w:pPr>
-      <w:hyperlink w:anchor="_Toc235143185" w:history="1">
+      <w:hyperlink w:anchor="_Toc235194135" w:history="1">
         <w:r>
           <w:rPr>
             <w:rStyle w:val="af5"/>
@@ -901,7 +952,7 @@
             <w:noProof/>
             <w:webHidden/>
           </w:rPr>
-          <w:instrText xml:space="preserve"> PAGEREF _Toc235143185 \h </w:instrText>
+          <w:instrText xml:space="preserve"> PAGEREF _Toc235194135 \h </w:instrText>
         </w:r>
         <w:r>
           <w:rPr>
@@ -921,7 +972,7 @@
             <w:noProof/>
             <w:webHidden/>
           </w:rPr>
-          <w:t>14</w:t>
+          <w:t>13</w:t>
         </w:r>
         <w:r>
           <w:rPr>
@@ -945,7 +996,7 @@
           <w14:ligatures w14:val="standardContextual"/>
         </w:rPr>
       </w:pPr>
-      <w:hyperlink w:anchor="_Toc235143186" w:history="1">
+      <w:hyperlink w:anchor="_Toc235194136" w:history="1">
         <w:r>
           <w:rPr>
             <w:rStyle w:val="af5"/>
@@ -972,7 +1023,7 @@
             <w:noProof/>
             <w:webHidden/>
           </w:rPr>
-          <w:instrText xml:space="preserve"> PAGEREF _Toc235143186 \h </w:instrText>
+          <w:instrText xml:space="preserve"> PAGEREF _Toc235194136 \h </w:instrText>
         </w:r>
         <w:r>
           <w:rPr>
@@ -992,7 +1043,7 @@
             <w:noProof/>
             <w:webHidden/>
           </w:rPr>
-          <w:t>17</w:t>
+          <w:t>18</w:t>
         </w:r>
         <w:r>
           <w:rPr>
@@ -1021,60 +1072,16 @@
       <w:pPr>
         <w:pStyle w:val="11"/>
       </w:pPr>
-      <w:bookmarkStart w:id="0" w:name="_Toc235143181"/>
-      <w:r>
-        <w:t xml:space="preserve">1 </w:t>
-      </w:r>
-      <w:r>
-        <w:t>系统主要的类图</w:t>
+      <w:bookmarkStart w:id="0" w:name="_Toc235194131"/>
+      <w:r>
+        <w:lastRenderedPageBreak/>
+        <w:t>1 系统主要的类图</w:t>
       </w:r>
       <w:bookmarkEnd w:id="0"/>
     </w:p>
     <w:p>
       <w:r>
-        <w:t>系统主要类按实体层、数据访问层、业务层、界面层和公共工具层组织。图中列出五个核心实体类的主要字段、字段类型及关联关系：</w:t>
-      </w:r>
-      <w:r>
-        <w:t xml:space="preserve">Origin </w:t>
-      </w:r>
-      <w:r>
-        <w:t>与</w:t>
-      </w:r>
-      <w:r>
-        <w:t xml:space="preserve"> Wine </w:t>
-      </w:r>
-      <w:r>
-        <w:t>为一对多关系，</w:t>
-      </w:r>
-      <w:r>
-        <w:t xml:space="preserve">Customer </w:t>
-      </w:r>
-      <w:r>
-        <w:t>与</w:t>
-      </w:r>
-      <w:r>
-        <w:t xml:space="preserve"> SaleOrder </w:t>
-      </w:r>
-      <w:r>
-        <w:t>为一对多关系，</w:t>
-      </w:r>
-      <w:r>
-        <w:t xml:space="preserve">SaleOrder </w:t>
-      </w:r>
-      <w:r>
-        <w:t>通过</w:t>
-      </w:r>
-      <w:r>
-        <w:t xml:space="preserve"> SaleOrderItem </w:t>
-      </w:r>
-      <w:r>
-        <w:t>关联</w:t>
-      </w:r>
-      <w:r>
-        <w:t xml:space="preserve"> Wine</w:t>
-      </w:r>
-      <w:r>
-        <w:t>。</w:t>
+        <w:t>系统主要类按实体层、数据访问层、业务层、界面层和公共工具层组织。图中列出五个核心实体类的主要字段、字段类型及关联关系：Origin 与 Wine 为一对多关系，Customer 与 SaleOrder 为一对多关系，SaleOrder 通过 SaleOrderItem 关联 Wine。</w:t>
       </w:r>
     </w:p>
     <w:p>
@@ -1133,19 +1140,7 @@
         <w:rPr>
           <w:sz w:val="21"/>
         </w:rPr>
-        <w:t>图</w:t>
-      </w:r>
-      <w:r>
-        <w:rPr>
-          <w:sz w:val="21"/>
-        </w:rPr>
-        <w:t xml:space="preserve"> 1-1  </w:t>
-      </w:r>
-      <w:r>
-        <w:rPr>
-          <w:sz w:val="21"/>
-        </w:rPr>
-        <w:t>系统主要类图</w:t>
+        <w:t>图 1-1  系统主要类图</w:t>
       </w:r>
     </w:p>
     <w:p>
@@ -1153,39 +1148,12 @@
         <w:pStyle w:val="21"/>
       </w:pPr>
       <w:r>
-        <w:t xml:space="preserve">1.1 </w:t>
-      </w:r>
-      <w:r>
-        <w:t>每个类的具体作用</w:t>
+        <w:t>1.1 每个类的具体作用</w:t>
       </w:r>
     </w:p>
     <w:p>
       <w:r>
-        <w:t>除图中的实体类外，系统还为每个业务领域设置</w:t>
-      </w:r>
-      <w:r>
-        <w:t xml:space="preserve"> DAO </w:t>
-      </w:r>
-      <w:r>
-        <w:t>和</w:t>
-      </w:r>
-      <w:r>
-        <w:t xml:space="preserve"> Service</w:t>
-      </w:r>
-      <w:r>
-        <w:t>，并通过</w:t>
-      </w:r>
-      <w:r>
-        <w:t xml:space="preserve"> Main</w:t>
-      </w:r>
-      <w:r>
-        <w:t>、</w:t>
-      </w:r>
-      <w:r>
-        <w:t xml:space="preserve">ConsoleMenu </w:t>
-      </w:r>
-      <w:r>
-        <w:t>与公共工具类完成启动、交互和复用。各类的主要数据、依赖和具体作用如下表所示。</w:t>
+        <w:t>除图中的实体类外，系统还为每个业务领域设置 DAO 和 Service，并通过 Main、ConsoleMenu 与公共工具类完成启动、交互和复用。各类的主要数据、依赖和具体作用如下表所示。</w:t>
       </w:r>
     </w:p>
     <w:tbl>
@@ -1395,19 +1363,7 @@
               <w:rPr>
                 <w:sz w:val="18"/>
               </w:rPr>
-              <w:t>DBUtil</w:t>
-            </w:r>
-            <w:r>
-              <w:rPr>
-                <w:sz w:val="18"/>
-              </w:rPr>
-              <w:t>、</w:t>
-            </w:r>
-            <w:r>
-              <w:rPr>
-                <w:sz w:val="18"/>
-              </w:rPr>
-              <w:t>ConsoleMenu</w:t>
+              <w:t>DBUtil、ConsoleMenu</w:t>
             </w:r>
           </w:p>
         </w:tc>
@@ -1663,6 +1619,7 @@
               <w:rPr>
                 <w:sz w:val="18"/>
               </w:rPr>
+              <w:lastRenderedPageBreak/>
               <w:t>实体</w:t>
             </w:r>
           </w:p>
@@ -2038,19 +1995,7 @@
               <w:rPr>
                 <w:sz w:val="18"/>
               </w:rPr>
-              <w:t>为</w:t>
-            </w:r>
-            <w:r>
-              <w:rPr>
-                <w:sz w:val="18"/>
-              </w:rPr>
-              <w:t xml:space="preserve"> DAO </w:t>
-            </w:r>
-            <w:r>
-              <w:rPr>
-                <w:sz w:val="18"/>
-              </w:rPr>
-              <w:t>子类提供公共数据库连接</w:t>
+              <w:t>为 DAO 子类提供公共数据库连接</w:t>
             </w:r>
           </w:p>
         </w:tc>
@@ -2127,13 +2072,7 @@
               <w:rPr>
                 <w:sz w:val="18"/>
               </w:rPr>
-              <w:t xml:space="preserve">wine </w:t>
-            </w:r>
-            <w:r>
-              <w:rPr>
-                <w:sz w:val="18"/>
-              </w:rPr>
-              <w:t>表</w:t>
+              <w:t>wine 表</w:t>
             </w:r>
           </w:p>
         </w:tc>
@@ -2234,13 +2173,7 @@
               <w:rPr>
                 <w:sz w:val="18"/>
               </w:rPr>
-              <w:t xml:space="preserve">origin </w:t>
-            </w:r>
-            <w:r>
-              <w:rPr>
-                <w:sz w:val="18"/>
-              </w:rPr>
-              <w:t>表</w:t>
+              <w:t>origin 表</w:t>
             </w:r>
           </w:p>
         </w:tc>
@@ -2341,13 +2274,7 @@
               <w:rPr>
                 <w:sz w:val="18"/>
               </w:rPr>
-              <w:t xml:space="preserve">customer </w:t>
-            </w:r>
-            <w:r>
-              <w:rPr>
-                <w:sz w:val="18"/>
-              </w:rPr>
-              <w:t>表</w:t>
+              <w:t>customer 表</w:t>
             </w:r>
           </w:p>
         </w:tc>
@@ -2448,13 +2375,7 @@
               <w:rPr>
                 <w:sz w:val="18"/>
               </w:rPr>
-              <w:t xml:space="preserve">sale_order </w:t>
-            </w:r>
-            <w:r>
-              <w:rPr>
-                <w:sz w:val="18"/>
-              </w:rPr>
-              <w:t>表</w:t>
+              <w:t>sale_order 表</w:t>
             </w:r>
           </w:p>
         </w:tc>
@@ -2555,13 +2476,7 @@
               <w:rPr>
                 <w:sz w:val="18"/>
               </w:rPr>
-              <w:t xml:space="preserve">sale_order_item </w:t>
-            </w:r>
-            <w:r>
-              <w:rPr>
-                <w:sz w:val="18"/>
-              </w:rPr>
-              <w:t>表</w:t>
+              <w:t>sale_order_item 表</w:t>
             </w:r>
           </w:p>
         </w:tc>
@@ -2662,13 +2577,7 @@
               <w:rPr>
                 <w:sz w:val="18"/>
               </w:rPr>
-              <w:t>聚合</w:t>
-            </w:r>
-            <w:r>
-              <w:rPr>
-                <w:sz w:val="18"/>
-              </w:rPr>
-              <w:t xml:space="preserve"> SQL</w:t>
+              <w:t>聚合 SQL</w:t>
             </w:r>
           </w:p>
         </w:tc>
@@ -3072,13 +2981,7 @@
               <w:rPr>
                 <w:sz w:val="18"/>
               </w:rPr>
-              <w:t>四个</w:t>
-            </w:r>
-            <w:r>
-              <w:rPr>
-                <w:sz w:val="18"/>
-              </w:rPr>
-              <w:t xml:space="preserve"> DAO</w:t>
+              <w:t>四个 DAO</w:t>
             </w:r>
           </w:p>
         </w:tc>
@@ -3280,13 +3183,7 @@
               <w:rPr>
                 <w:sz w:val="18"/>
               </w:rPr>
-              <w:t>全部</w:t>
-            </w:r>
-            <w:r>
-              <w:rPr>
-                <w:sz w:val="18"/>
-              </w:rPr>
-              <w:t xml:space="preserve"> Service</w:t>
+              <w:t>全部 Service</w:t>
             </w:r>
           </w:p>
         </w:tc>
@@ -3387,19 +3284,7 @@
               <w:rPr>
                 <w:sz w:val="18"/>
               </w:rPr>
-              <w:t>JDBC</w:t>
-            </w:r>
-            <w:r>
-              <w:rPr>
-                <w:sz w:val="18"/>
-              </w:rPr>
-              <w:t>、</w:t>
-            </w:r>
-            <w:r>
-              <w:rPr>
-                <w:sz w:val="18"/>
-              </w:rPr>
-              <w:t>CSV</w:t>
+              <w:t>JDBC、CSV</w:t>
             </w:r>
           </w:p>
         </w:tc>
@@ -3452,6 +3337,7 @@
               <w:rPr>
                 <w:sz w:val="18"/>
               </w:rPr>
+              <w:lastRenderedPageBreak/>
               <w:t>工具</w:t>
             </w:r>
           </w:p>
@@ -3838,125 +3724,20 @@
       <w:pPr>
         <w:pStyle w:val="11"/>
       </w:pPr>
-      <w:bookmarkStart w:id="1" w:name="_Toc235143182"/>
-      <w:r>
-        <w:t xml:space="preserve">2 </w:t>
-      </w:r>
-      <w:r>
-        <w:t>系统数据库设计</w:t>
+      <w:bookmarkStart w:id="1" w:name="_Toc235194132"/>
+      <w:r>
+        <w:t>2 系统数据库设计</w:t>
       </w:r>
       <w:bookmarkEnd w:id="1"/>
     </w:p>
     <w:p>
       <w:r>
-        <w:t>系统使用</w:t>
-      </w:r>
-      <w:r>
-        <w:t xml:space="preserve"> SQLite </w:t>
-      </w:r>
-      <w:r>
-        <w:t>文件数据库</w:t>
-      </w:r>
-      <w:r>
-        <w:t xml:space="preserve"> wine.db </w:t>
-      </w:r>
-      <w:r>
-        <w:t>进行持久化，围绕产地、红酒、客户、订单和订单明细建立五张数据表。数据库主键采用自增整数，实体关系通过外键字段连接；金额字段在数据库中使用</w:t>
-      </w:r>
-      <w:r>
-        <w:t xml:space="preserve"> NUMERIC</w:t>
-      </w:r>
-      <w:r>
-        <w:t>，在</w:t>
-      </w:r>
-      <w:r>
-        <w:t xml:space="preserve"> Java </w:t>
-      </w:r>
-      <w:r>
-        <w:t>中使用</w:t>
-      </w:r>
-      <w:r>
-        <w:t xml:space="preserve"> BigDecimal</w:t>
-      </w:r>
-      <w:r>
-        <w:t>，避免浮点计算误差。</w:t>
+        <w:t>系统使用 SQLite 文件数据库 wine.db 进行持久化，围绕产地、红酒、客户、订单和订单明细建立五张数据表。数据库主键采用自增整数，实体关系通过外键字段连接；金额字段在数据库中使用 NUMERIC，在 Java 中使用 BigDecimal，避免浮点计算误差。</w:t>
       </w:r>
     </w:p>
     <w:p>
       <w:r>
-        <w:t>字段表中的</w:t>
-      </w:r>
-      <w:r>
-        <w:t>“</w:t>
-      </w:r>
-      <w:r>
-        <w:t>大小</w:t>
-      </w:r>
-      <w:r>
-        <w:t>”</w:t>
-      </w:r>
-      <w:r>
-        <w:t>表示业务数据的字符长度或数值精度，不是数据库文件占用空间。</w:t>
-      </w:r>
-      <w:r>
-        <w:t xml:space="preserve">SQLite </w:t>
-      </w:r>
-      <w:r>
-        <w:t>的</w:t>
-      </w:r>
-      <w:r>
-        <w:t xml:space="preserve"> INTEGER </w:t>
-      </w:r>
-      <w:r>
-        <w:t>使用可变长度存储，表中标记为</w:t>
-      </w:r>
-      <w:r>
-        <w:t>“</w:t>
-      </w:r>
-      <w:r>
-        <w:t>可变长度</w:t>
-      </w:r>
-      <w:r>
-        <w:t>”</w:t>
-      </w:r>
-      <w:r>
-        <w:t>；未声明长度上限的</w:t>
-      </w:r>
-      <w:r>
-        <w:t xml:space="preserve"> TEXT </w:t>
-      </w:r>
-      <w:r>
-        <w:t>标记为</w:t>
-      </w:r>
-      <w:r>
-        <w:t>“</w:t>
-      </w:r>
-      <w:r>
-        <w:t>不限制</w:t>
-      </w:r>
-      <w:r>
-        <w:t>”</w:t>
-      </w:r>
-      <w:r>
-        <w:t>；未声明精度和小数位的</w:t>
-      </w:r>
-      <w:r>
-        <w:t xml:space="preserve"> NUMERIC </w:t>
-      </w:r>
-      <w:r>
-        <w:t>标记为</w:t>
-      </w:r>
-      <w:r>
-        <w:t>“</w:t>
-      </w:r>
-      <w:r>
-        <w:t>未限定</w:t>
-      </w:r>
-      <w:r>
-        <w:t>”</w:t>
-      </w:r>
-      <w:r>
-        <w:t>；有明确格式要求的字段则填写实际字符数。</w:t>
+        <w:t>字段表中的“大小”表示业务数据的字符长度或数值精度，不是数据库文件占用空间。SQLite 的 INTEGER 使用可变长度存储，表中标记为“可变长度”；未声明长度上限的 TEXT 标记为“不限制”；未声明精度和小数位的 NUMERIC 标记为“未限定”；有明确格式要求的字段则填写实际字符数。</w:t>
       </w:r>
     </w:p>
     <w:p>
@@ -3964,10 +3745,7 @@
         <w:pStyle w:val="21"/>
       </w:pPr>
       <w:r>
-        <w:t xml:space="preserve">2.1 </w:t>
-      </w:r>
-      <w:r>
-        <w:t>数据表汇总</w:t>
+        <w:t>2.1 数据表汇总</w:t>
       </w:r>
     </w:p>
     <w:tbl>
@@ -4069,13 +3847,7 @@
               <w:rPr>
                 <w:sz w:val="21"/>
               </w:rPr>
-              <w:t>origin</w:t>
-            </w:r>
-            <w:r>
-              <w:rPr>
-                <w:sz w:val="21"/>
-              </w:rPr>
-              <w:t>（产地信息表）</w:t>
+              <w:t>origin（产地信息表）</w:t>
             </w:r>
           </w:p>
         </w:tc>
@@ -4130,13 +3902,7 @@
               <w:rPr>
                 <w:sz w:val="21"/>
               </w:rPr>
-              <w:t>wine</w:t>
-            </w:r>
-            <w:r>
-              <w:rPr>
-                <w:sz w:val="21"/>
-              </w:rPr>
-              <w:t>（红酒信息表）</w:t>
+              <w:t>wine（红酒信息表）</w:t>
             </w:r>
           </w:p>
         </w:tc>
@@ -4191,13 +3957,7 @@
               <w:rPr>
                 <w:sz w:val="21"/>
               </w:rPr>
-              <w:t>customer</w:t>
-            </w:r>
-            <w:r>
-              <w:rPr>
-                <w:sz w:val="21"/>
-              </w:rPr>
-              <w:t>（客户信息表）</w:t>
+              <w:t>customer（客户信息表）</w:t>
             </w:r>
           </w:p>
         </w:tc>
@@ -4252,13 +4012,7 @@
               <w:rPr>
                 <w:sz w:val="21"/>
               </w:rPr>
-              <w:t>sale_order</w:t>
-            </w:r>
-            <w:r>
-              <w:rPr>
-                <w:sz w:val="21"/>
-              </w:rPr>
-              <w:t>（订单表）</w:t>
+              <w:t>sale_order（订单表）</w:t>
             </w:r>
           </w:p>
         </w:tc>
@@ -4312,13 +4066,7 @@
               <w:rPr>
                 <w:sz w:val="21"/>
               </w:rPr>
-              <w:t>sale_order_item</w:t>
-            </w:r>
-            <w:r>
-              <w:rPr>
-                <w:sz w:val="21"/>
-              </w:rPr>
-              <w:t>（订单明细表）</w:t>
+              <w:t>sale_order_item（订单明细表）</w:t>
             </w:r>
           </w:p>
         </w:tc>
@@ -4354,10 +4102,8 @@
         <w:pStyle w:val="21"/>
       </w:pPr>
       <w:r>
-        <w:t xml:space="preserve">2.2 </w:t>
-      </w:r>
-      <w:r>
-        <w:t>各数据表字段设计</w:t>
+        <w:lastRenderedPageBreak/>
+        <w:t>2.2 各数据表字段设计</w:t>
       </w:r>
     </w:p>
     <w:p>
@@ -4365,13 +4111,7 @@
         <w:pStyle w:val="31"/>
       </w:pPr>
       <w:r>
-        <w:t xml:space="preserve">2.2.1 </w:t>
-      </w:r>
-      <w:r>
-        <w:t>产地信息表</w:t>
-      </w:r>
-      <w:r>
-        <w:t xml:space="preserve"> origin</w:t>
+        <w:t>2.2.1 产地信息表 origin</w:t>
       </w:r>
     </w:p>
     <w:tbl>
@@ -5006,25 +4746,7 @@
               <w:rPr>
                 <w:sz w:val="18"/>
               </w:rPr>
-              <w:t xml:space="preserve">1 </w:t>
-            </w:r>
-            <w:r>
-              <w:rPr>
-                <w:sz w:val="18"/>
-              </w:rPr>
-              <w:t>为国内，</w:t>
-            </w:r>
-            <w:r>
-              <w:rPr>
-                <w:sz w:val="18"/>
-              </w:rPr>
-              <w:t xml:space="preserve">0 </w:t>
-            </w:r>
-            <w:r>
-              <w:rPr>
-                <w:sz w:val="18"/>
-              </w:rPr>
-              <w:t>为国外</w:t>
+              <w:t>1 为国内，0 为国外</w:t>
             </w:r>
           </w:p>
         </w:tc>
@@ -5781,13 +5503,7 @@
         <w:pStyle w:val="31"/>
       </w:pPr>
       <w:r>
-        <w:t xml:space="preserve">2.2.2 </w:t>
-      </w:r>
-      <w:r>
-        <w:t>红酒信息表</w:t>
-      </w:r>
-      <w:r>
-        <w:t xml:space="preserve"> wine</w:t>
+        <w:t>2.2.2 红酒信息表 wine</w:t>
       </w:r>
     </w:p>
     <w:tbl>
@@ -6720,13 +6436,7 @@
               <w:rPr>
                 <w:sz w:val="18"/>
               </w:rPr>
-              <w:t xml:space="preserve">1900 </w:t>
-            </w:r>
-            <w:r>
-              <w:rPr>
-                <w:sz w:val="18"/>
-              </w:rPr>
-              <w:t>至当前年份</w:t>
+              <w:t>1900 至当前年份</w:t>
             </w:r>
           </w:p>
         </w:tc>
@@ -6875,13 +6585,7 @@
               <w:rPr>
                 <w:sz w:val="18"/>
               </w:rPr>
-              <w:t>外键，关联</w:t>
-            </w:r>
-            <w:r>
-              <w:rPr>
-                <w:sz w:val="18"/>
-              </w:rPr>
-              <w:t xml:space="preserve"> origin.id</w:t>
+              <w:t>外键，关联 origin.id</w:t>
             </w:r>
           </w:p>
         </w:tc>
@@ -7179,13 +6883,7 @@
               <w:rPr>
                 <w:sz w:val="18"/>
               </w:rPr>
-              <w:t>不得小于</w:t>
-            </w:r>
-            <w:r>
-              <w:rPr>
-                <w:sz w:val="18"/>
-              </w:rPr>
-              <w:t xml:space="preserve"> 0</w:t>
+              <w:t>不得小于 0</w:t>
             </w:r>
           </w:p>
         </w:tc>
@@ -7214,6 +6912,7 @@
               <w:rPr>
                 <w:sz w:val="18"/>
               </w:rPr>
+              <w:lastRenderedPageBreak/>
               <w:t>9</w:t>
             </w:r>
           </w:p>
@@ -7334,13 +7033,7 @@
               <w:rPr>
                 <w:sz w:val="18"/>
               </w:rPr>
-              <w:t>不得小于</w:t>
-            </w:r>
-            <w:r>
-              <w:rPr>
-                <w:sz w:val="18"/>
-              </w:rPr>
-              <w:t xml:space="preserve"> 0</w:t>
+              <w:t>不得小于 0</w:t>
             </w:r>
           </w:p>
         </w:tc>
@@ -7489,13 +7182,7 @@
               <w:rPr>
                 <w:sz w:val="18"/>
               </w:rPr>
-              <w:t>不得小于</w:t>
-            </w:r>
-            <w:r>
-              <w:rPr>
-                <w:sz w:val="18"/>
-              </w:rPr>
-              <w:t xml:space="preserve"> 0</w:t>
+              <w:t>不得小于 0</w:t>
             </w:r>
           </w:p>
         </w:tc>
@@ -7805,13 +7492,7 @@
         <w:pStyle w:val="31"/>
       </w:pPr>
       <w:r>
-        <w:t xml:space="preserve">2.2.3 </w:t>
-      </w:r>
-      <w:r>
-        <w:t>客户信息表</w:t>
-      </w:r>
-      <w:r>
-        <w:t xml:space="preserve"> customer</w:t>
+        <w:t>2.2.3 客户信息表 customer</w:t>
       </w:r>
     </w:p>
     <w:tbl>
@@ -8595,19 +8276,7 @@
               <w:rPr>
                 <w:sz w:val="18"/>
               </w:rPr>
-              <w:t>唯一，</w:t>
-            </w:r>
-            <w:r>
-              <w:rPr>
-                <w:sz w:val="18"/>
-              </w:rPr>
-              <w:t xml:space="preserve">11 </w:t>
-            </w:r>
-            <w:r>
-              <w:rPr>
-                <w:sz w:val="18"/>
-              </w:rPr>
-              <w:t>位数字</w:t>
+              <w:t>唯一，11 位数字</w:t>
             </w:r>
           </w:p>
         </w:tc>
@@ -9066,13 +8735,7 @@
         <w:pStyle w:val="31"/>
       </w:pPr>
       <w:r>
-        <w:t xml:space="preserve">2.2.4 </w:t>
-      </w:r>
-      <w:r>
-        <w:t>订单表</w:t>
-      </w:r>
-      <w:r>
-        <w:t xml:space="preserve"> sale_order</w:t>
+        <w:t>2.2.4 订单表 sale_order</w:t>
       </w:r>
     </w:p>
     <w:tbl>
@@ -9558,13 +9221,7 @@
               <w:rPr>
                 <w:sz w:val="18"/>
               </w:rPr>
-              <w:t>外键，关联</w:t>
-            </w:r>
-            <w:r>
-              <w:rPr>
-                <w:sz w:val="18"/>
-              </w:rPr>
-              <w:t xml:space="preserve"> customer.id</w:t>
+              <w:t>外键，关联 customer.id</w:t>
             </w:r>
           </w:p>
         </w:tc>
@@ -9891,6 +9548,7 @@
               <w:rPr>
                 <w:sz w:val="18"/>
               </w:rPr>
+              <w:lastRenderedPageBreak/>
               <w:t>5</w:t>
             </w:r>
           </w:p>
@@ -10309,43 +9967,7 @@
               <w:rPr>
                 <w:sz w:val="18"/>
               </w:rPr>
-              <w:t>现金</w:t>
-            </w:r>
-            <w:r>
-              <w:rPr>
-                <w:sz w:val="18"/>
-              </w:rPr>
-              <w:t>/</w:t>
-            </w:r>
-            <w:r>
-              <w:rPr>
-                <w:sz w:val="18"/>
-              </w:rPr>
-              <w:t>微信</w:t>
-            </w:r>
-            <w:r>
-              <w:rPr>
-                <w:sz w:val="18"/>
-              </w:rPr>
-              <w:t>/</w:t>
-            </w:r>
-            <w:r>
-              <w:rPr>
-                <w:sz w:val="18"/>
-              </w:rPr>
-              <w:t>支付宝</w:t>
-            </w:r>
-            <w:r>
-              <w:rPr>
-                <w:sz w:val="18"/>
-              </w:rPr>
-              <w:t>/</w:t>
-            </w:r>
-            <w:r>
-              <w:rPr>
-                <w:sz w:val="18"/>
-              </w:rPr>
-              <w:t>银行卡</w:t>
+              <w:t>现金/微信/支付宝/银行卡</w:t>
             </w:r>
           </w:p>
         </w:tc>
@@ -10506,13 +10128,7 @@
         <w:pStyle w:val="31"/>
       </w:pPr>
       <w:r>
-        <w:t xml:space="preserve">2.2.5 </w:t>
-      </w:r>
-      <w:r>
-        <w:t>订单明细表</w:t>
-      </w:r>
-      <w:r>
-        <w:t xml:space="preserve"> sale_order_item</w:t>
+        <w:t>2.2.5 订单明细表 sale_order_item</w:t>
       </w:r>
     </w:p>
     <w:tbl>
@@ -10998,13 +10614,7 @@
               <w:rPr>
                 <w:sz w:val="18"/>
               </w:rPr>
-              <w:t>外键，关联</w:t>
-            </w:r>
-            <w:r>
-              <w:rPr>
-                <w:sz w:val="18"/>
-              </w:rPr>
-              <w:t xml:space="preserve"> sale_order.id</w:t>
+              <w:t>外键，关联 sale_order.id</w:t>
             </w:r>
           </w:p>
         </w:tc>
@@ -11153,13 +10763,7 @@
               <w:rPr>
                 <w:sz w:val="18"/>
               </w:rPr>
-              <w:t>外键，关联</w:t>
-            </w:r>
-            <w:r>
-              <w:rPr>
-                <w:sz w:val="18"/>
-              </w:rPr>
-              <w:t xml:space="preserve"> wine.id</w:t>
+              <w:t>外键，关联 wine.id</w:t>
             </w:r>
           </w:p>
         </w:tc>
@@ -11308,13 +10912,7 @@
               <w:rPr>
                 <w:sz w:val="18"/>
               </w:rPr>
-              <w:t>必须大于</w:t>
-            </w:r>
-            <w:r>
-              <w:rPr>
-                <w:sz w:val="18"/>
-              </w:rPr>
-              <w:t xml:space="preserve"> 0</w:t>
+              <w:t>必须大于 0</w:t>
             </w:r>
           </w:p>
         </w:tc>
@@ -11623,12 +11221,9 @@
       <w:pPr>
         <w:pStyle w:val="11"/>
       </w:pPr>
-      <w:bookmarkStart w:id="2" w:name="_Toc235143183"/>
-      <w:r>
-        <w:t xml:space="preserve">3 </w:t>
-      </w:r>
-      <w:r>
-        <w:t>主要功能设计</w:t>
+      <w:bookmarkStart w:id="2" w:name="_Toc235194133"/>
+      <w:r>
+        <w:t>3 主要功能设计</w:t>
       </w:r>
       <w:bookmarkEnd w:id="2"/>
     </w:p>
@@ -11637,27 +11232,12 @@
         <w:pStyle w:val="21"/>
       </w:pPr>
       <w:r>
-        <w:t xml:space="preserve">3.1 </w:t>
-      </w:r>
-      <w:r>
-        <w:t>功能模块划分</w:t>
+        <w:t>3.1 功能模块划分</w:t>
       </w:r>
     </w:p>
     <w:p>
       <w:r>
-        <w:t>系统主菜单包含六个业务模块，每个模块内部使用循环菜单，用户完成一次操作后仍停留在当前模块。输入</w:t>
-      </w:r>
-      <w:r>
-        <w:t xml:space="preserve"> 0 </w:t>
-      </w:r>
-      <w:r>
-        <w:t>返回上一级，任意录入项输入</w:t>
-      </w:r>
-      <w:r>
-        <w:t xml:space="preserve"> q </w:t>
-      </w:r>
-      <w:r>
-        <w:t>可以取消当前操作，避免录入中途只能强制退出。</w:t>
+        <w:t>系统主菜单包含六个业务模块，每个模块内部使用循环菜单，用户完成一次操作后仍停留在当前模块。输入 0 返回上一级，任意录入项输入 q 可以取消当前操作，避免录入中途只能强制退出。</w:t>
       </w:r>
     </w:p>
     <w:p>
@@ -11670,6 +11250,7 @@
         <w:rPr>
           <w:noProof/>
         </w:rPr>
+        <w:lastRenderedPageBreak/>
         <w:drawing>
           <wp:inline distT="0" distB="0" distL="0" distR="0" wp14:anchorId="0668EAE1" wp14:editId="0207705D">
             <wp:extent cx="5303520" cy="2984816"/>
@@ -11716,19 +11297,7 @@
         <w:rPr>
           <w:sz w:val="21"/>
         </w:rPr>
-        <w:t>图</w:t>
-      </w:r>
-      <w:r>
-        <w:rPr>
-          <w:sz w:val="21"/>
-        </w:rPr>
-        <w:t xml:space="preserve"> 3-1  </w:t>
-      </w:r>
-      <w:r>
-        <w:rPr>
-          <w:sz w:val="21"/>
-        </w:rPr>
-        <w:t>系统功能结构</w:t>
+        <w:t>图 3-1  系统功能结构</w:t>
       </w:r>
     </w:p>
     <w:p>
@@ -11736,10 +11305,7 @@
         <w:pStyle w:val="21"/>
       </w:pPr>
       <w:r>
-        <w:t xml:space="preserve">3.2 </w:t>
-      </w:r>
-      <w:r>
-        <w:t>功能模块说明</w:t>
+        <w:t>3.2 功能模块说明</w:t>
       </w:r>
     </w:p>
     <w:p>
@@ -11747,10 +11313,7 @@
         <w:pStyle w:val="31"/>
       </w:pPr>
       <w:r>
-        <w:t xml:space="preserve">3.2.1 </w:t>
-      </w:r>
-      <w:r>
-        <w:t>红酒信息管理</w:t>
+        <w:t>3.2.1 红酒信息管理</w:t>
       </w:r>
     </w:p>
     <w:p>
@@ -11763,10 +11326,7 @@
         <w:pStyle w:val="31"/>
       </w:pPr>
       <w:r>
-        <w:t xml:space="preserve">3.2.2 </w:t>
-      </w:r>
-      <w:r>
-        <w:t>产地信息管理</w:t>
+        <w:t>3.2.2 产地信息管理</w:t>
       </w:r>
     </w:p>
     <w:p>
@@ -11779,21 +11339,12 @@
         <w:pStyle w:val="31"/>
       </w:pPr>
       <w:r>
-        <w:t xml:space="preserve">3.2.3 </w:t>
-      </w:r>
-      <w:r>
-        <w:t>客户信息管理</w:t>
+        <w:t>3.2.3 客户信息管理</w:t>
       </w:r>
     </w:p>
     <w:p>
       <w:r>
-        <w:t>维护姓名、性别、手机号、地址、会员等级和注册时间。手机号必须为</w:t>
-      </w:r>
-      <w:r>
-        <w:t xml:space="preserve"> 11 </w:t>
-      </w:r>
-      <w:r>
-        <w:t>位数字且不可重复，可按姓名或电话检索客户，并查询客户购买记录。</w:t>
+        <w:t>维护姓名、性别、手机号、地址、会员等级和注册时间。手机号必须为 11 位数字且不可重复，可按姓名或电话检索客户，并查询客户购买记录。</w:t>
       </w:r>
     </w:p>
     <w:p>
@@ -11801,10 +11352,7 @@
         <w:pStyle w:val="31"/>
       </w:pPr>
       <w:r>
-        <w:t xml:space="preserve">3.2.4 </w:t>
-      </w:r>
-      <w:r>
-        <w:t>购买结算管理</w:t>
+        <w:t>3.2.4 购买结算管理</w:t>
       </w:r>
     </w:p>
     <w:p>
@@ -11817,10 +11365,8 @@
         <w:pStyle w:val="31"/>
       </w:pPr>
       <w:r>
-        <w:t xml:space="preserve">3.2.5 </w:t>
-      </w:r>
-      <w:r>
-        <w:t>订单查询管理</w:t>
+        <w:lastRenderedPageBreak/>
+        <w:t>3.2.5 订单查询管理</w:t>
       </w:r>
     </w:p>
     <w:p>
@@ -11833,10 +11379,7 @@
         <w:pStyle w:val="31"/>
       </w:pPr>
       <w:r>
-        <w:t xml:space="preserve">3.2.6 </w:t>
-      </w:r>
-      <w:r>
-        <w:t>销售统计管理</w:t>
+        <w:t>3.2.6 销售统计管理</w:t>
       </w:r>
     </w:p>
     <w:p>
@@ -11849,10 +11392,7 @@
         <w:pStyle w:val="21"/>
       </w:pPr>
       <w:r>
-        <w:t xml:space="preserve">3.3 </w:t>
-      </w:r>
-      <w:r>
-        <w:t>购买结算与取消流程</w:t>
+        <w:t>3.3 购买结算与取消流程</w:t>
       </w:r>
     </w:p>
     <w:p>
@@ -11911,30 +11451,12 @@
         <w:rPr>
           <w:sz w:val="21"/>
         </w:rPr>
-        <w:t>图</w:t>
-      </w:r>
-      <w:r>
-        <w:rPr>
-          <w:sz w:val="21"/>
-        </w:rPr>
-        <w:t xml:space="preserve"> 3-2  </w:t>
-      </w:r>
-      <w:r>
-        <w:rPr>
-          <w:sz w:val="21"/>
-        </w:rPr>
-        <w:t>购买结算与取消订单流程</w:t>
+        <w:t>图 3-2  购买结算与取消订单流程</w:t>
       </w:r>
     </w:p>
     <w:p>
       <w:r>
-        <w:t>创建订单是系统中跨表最多的业务。</w:t>
-      </w:r>
-      <w:r>
-        <w:t xml:space="preserve">Service </w:t>
-      </w:r>
-      <w:r>
-        <w:t>层先完成无副作用的规则判断和金额计算，再开启事务写入订单、订单明细并修改库存。任一步骤发生异常都会回滚。取消订单同样在一个事务中恢复所有明细库存并更新订单状态，从而保证订单与库存一致。</w:t>
+        <w:t>创建订单是系统中跨表最多的业务。Service 层先完成无副作用的规则判断和金额计算，再开启事务写入订单、订单明细并修改库存。任一步骤发生异常都会回滚。取消订单同样在一个事务中恢复所有明细库存并更新订单状态，从而保证订单与库存一致。</w:t>
       </w:r>
     </w:p>
     <w:p>
@@ -11942,10 +11464,7 @@
         <w:pStyle w:val="21"/>
       </w:pPr>
       <w:r>
-        <w:t xml:space="preserve">3.4 </w:t>
-      </w:r>
-      <w:r>
-        <w:t>核心业务规则</w:t>
+        <w:t>3.4 核心业务规则</w:t>
       </w:r>
     </w:p>
     <w:p>
@@ -11957,19 +11476,7 @@
         <w:ind w:firstLine="0"/>
       </w:pPr>
       <w:r>
-        <w:t>红酒价格和库存不得小于</w:t>
-      </w:r>
-      <w:r>
-        <w:t xml:space="preserve"> 0</w:t>
-      </w:r>
-      <w:r>
-        <w:t>，年份必须在</w:t>
-      </w:r>
-      <w:r>
-        <w:t xml:space="preserve"> 1900 </w:t>
-      </w:r>
-      <w:r>
-        <w:t>年至当前年份之间。</w:t>
+        <w:t>红酒价格和库存不得小于 0，年份必须在 1900 年至当前年份之间。</w:t>
       </w:r>
     </w:p>
     <w:p>
@@ -11981,31 +11488,7 @@
         <w:ind w:firstLine="0"/>
       </w:pPr>
       <w:r>
-        <w:t>红酒状态只能为</w:t>
-      </w:r>
-      <w:r>
-        <w:t>“</w:t>
-      </w:r>
-      <w:r>
-        <w:t>上架</w:t>
-      </w:r>
-      <w:r>
-        <w:t>”</w:t>
-      </w:r>
-      <w:r>
-        <w:t>或</w:t>
-      </w:r>
-      <w:r>
-        <w:t>“</w:t>
-      </w:r>
-      <w:r>
-        <w:t>下架</w:t>
-      </w:r>
-      <w:r>
-        <w:t>”</w:t>
-      </w:r>
-      <w:r>
-        <w:t>，下架红酒不能购买。</w:t>
+        <w:t>红酒状态只能为“上架”或“下架”，下架红酒不能购买。</w:t>
       </w:r>
     </w:p>
     <w:p>
@@ -12017,13 +11500,7 @@
         <w:ind w:firstLine="0"/>
       </w:pPr>
       <w:r>
-        <w:t>购买数量必须大于</w:t>
-      </w:r>
-      <w:r>
-        <w:t xml:space="preserve"> 0</w:t>
-      </w:r>
-      <w:r>
-        <w:t>，且不得超过当前库存。</w:t>
+        <w:t>购买数量必须大于 0，且不得超过当前库存。</w:t>
       </w:r>
     </w:p>
     <w:p>
@@ -12035,31 +11512,8 @@
         <w:ind w:firstLine="0"/>
       </w:pPr>
       <w:r>
-        <w:t>普通客户、品鉴会员、窖藏会员、私享会员分别按</w:t>
-      </w:r>
-      <w:r>
-        <w:t xml:space="preserve"> 100%</w:t>
-      </w:r>
-      <w:r>
-        <w:t>、</w:t>
-      </w:r>
-      <w:r>
-        <w:t>95%</w:t>
-      </w:r>
-      <w:r>
-        <w:t>、</w:t>
-      </w:r>
-      <w:r>
-        <w:t>90%</w:t>
-      </w:r>
-      <w:r>
-        <w:t>、</w:t>
-      </w:r>
-      <w:r>
-        <w:t xml:space="preserve">85% </w:t>
-      </w:r>
-      <w:r>
-        <w:t>结算。</w:t>
+        <w:lastRenderedPageBreak/>
+        <w:t>普通客户、品鉴会员、窖藏会员、私享会员分别按 100%、95%、90%、85% 结算。</w:t>
       </w:r>
     </w:p>
     <w:p>
@@ -12107,13 +11561,7 @@
         <w:ind w:firstLine="0"/>
       </w:pPr>
       <w:r>
-        <w:t>日期使用</w:t>
-      </w:r>
-      <w:r>
-        <w:t xml:space="preserve"> yyyy-MM-dd </w:t>
-      </w:r>
-      <w:r>
-        <w:t>格式，统计开始日期不得晚于结束日期。</w:t>
+        <w:t>日期使用 yyyy-MM-dd 格式，统计开始日期不得晚于结束日期。</w:t>
       </w:r>
     </w:p>
     <w:p>
@@ -12132,12 +11580,9 @@
       <w:pPr>
         <w:pStyle w:val="11"/>
       </w:pPr>
-      <w:bookmarkStart w:id="3" w:name="_Toc235143184"/>
-      <w:r>
-        <w:t xml:space="preserve">4 </w:t>
-      </w:r>
-      <w:r>
-        <w:t>主要代码设计</w:t>
+      <w:bookmarkStart w:id="3" w:name="_Toc235194134"/>
+      <w:r>
+        <w:t>4 主要代码设计</w:t>
       </w:r>
       <w:bookmarkEnd w:id="3"/>
     </w:p>
@@ -12146,128 +11591,17 @@
         <w:pStyle w:val="21"/>
       </w:pPr>
       <w:r>
-        <w:t xml:space="preserve">4.1 </w:t>
-      </w:r>
-      <w:r>
-        <w:t>设计思想</w:t>
+        <w:t>4.1 设计思想</w:t>
       </w:r>
     </w:p>
     <w:p>
       <w:r>
-        <w:t>本项目没有引入</w:t>
-      </w:r>
-      <w:r>
-        <w:t xml:space="preserve"> Spring</w:t>
-      </w:r>
-      <w:r>
-        <w:t>、</w:t>
-      </w:r>
-      <w:r>
-        <w:t xml:space="preserve">MyBatis </w:t>
-      </w:r>
-      <w:r>
-        <w:t>等额外框架，而是直接使用</w:t>
-      </w:r>
-      <w:r>
-        <w:t xml:space="preserve"> Java </w:t>
-      </w:r>
-      <w:r>
-        <w:t>标准库、</w:t>
-      </w:r>
-      <w:r>
-        <w:t xml:space="preserve">JDBC </w:t>
-      </w:r>
-      <w:r>
-        <w:t>和少量工具类完成需求。这样既满足课程对</w:t>
-      </w:r>
-      <w:r>
-        <w:t xml:space="preserve"> Java</w:t>
-      </w:r>
-      <w:r>
-        <w:t>、数据库、控制台和分层架构的要求，也便于在答辩中解释每一层的职责。系统使用</w:t>
-      </w:r>
-      <w:r>
-        <w:t xml:space="preserve"> JDBC </w:t>
-      </w:r>
-      <w:r>
-        <w:t>的</w:t>
-      </w:r>
-      <w:r>
-        <w:t xml:space="preserve"> Connection</w:t>
-      </w:r>
-      <w:r>
-        <w:t>、</w:t>
-      </w:r>
-      <w:r>
-        <w:t>PreparedStatement</w:t>
-      </w:r>
-      <w:r>
-        <w:t>、</w:t>
-      </w:r>
-      <w:r>
-        <w:t xml:space="preserve">ResultSet </w:t>
-      </w:r>
-      <w:r>
-        <w:t>等接口实现数据库访问，利用</w:t>
-      </w:r>
-      <w:r>
-        <w:t xml:space="preserve"> try-with-resources </w:t>
-      </w:r>
-      <w:r>
-        <w:t>自动关闭资源。</w:t>
+        <w:t>本项目没有引入 Spring、MyBatis 等额外框架，而是直接使用 Java 标准库、JDBC 和少量工具类完成需求。这样既满足课程对 Java、数据库、控制台和分层架构的要求，也便于在答辩中解释每一层的职责。系统使用 JDBC 的 Connection、PreparedStatement、ResultSet 等接口实现数据库访问，利用 try-with-resources 自动关闭资源。</w:t>
       </w:r>
     </w:p>
     <w:p>
       <w:r>
-        <w:t>实体集合统一使用</w:t>
-      </w:r>
-      <w:r>
-        <w:t xml:space="preserve"> List&lt;T&gt; </w:t>
-      </w:r>
-      <w:r>
-        <w:t>泛型，例如</w:t>
-      </w:r>
-      <w:r>
-        <w:t xml:space="preserve"> List&lt;Wine&gt;</w:t>
-      </w:r>
-      <w:r>
-        <w:t>、</w:t>
-      </w:r>
-      <w:r>
-        <w:t xml:space="preserve">List&lt;Customer&gt; </w:t>
-      </w:r>
-      <w:r>
-        <w:t>和</w:t>
-      </w:r>
-      <w:r>
-        <w:t xml:space="preserve"> List&lt;SaleOrder&gt;</w:t>
-      </w:r>
-      <w:r>
-        <w:t>。</w:t>
-      </w:r>
-      <w:r>
-        <w:t xml:space="preserve">DAO </w:t>
-      </w:r>
-      <w:r>
-        <w:t>将</w:t>
-      </w:r>
-      <w:r>
-        <w:t xml:space="preserve"> ResultSet </w:t>
-      </w:r>
-      <w:r>
-        <w:t>映射为实体对象，</w:t>
-      </w:r>
-      <w:r>
-        <w:t xml:space="preserve">Service </w:t>
-      </w:r>
-      <w:r>
-        <w:t>返回具有明确元素类型的集合，</w:t>
-      </w:r>
-      <w:r>
-        <w:t xml:space="preserve">ConsoleMenu </w:t>
-      </w:r>
-      <w:r>
-        <w:t>只负责遍历或交给表格方法输出，避免使用无类型集合导致强制转换错误。</w:t>
+        <w:t>实体集合统一使用 List&lt;T&gt; 泛型，例如 List&lt;Wine&gt;、List&lt;Customer&gt; 和 List&lt;SaleOrder&gt;。DAO 将 ResultSet 映射为实体对象，Service 返回具有明确元素类型的集合，ConsoleMenu 只负责遍历或交给表格方法输出，避免使用无类型集合导致强制转换错误。</w:t>
       </w:r>
     </w:p>
     <w:p>
@@ -12275,42 +11609,12 @@
         <w:pStyle w:val="21"/>
       </w:pPr>
       <w:r>
-        <w:t xml:space="preserve">4.2 </w:t>
-      </w:r>
-      <w:r>
-        <w:t>数据库初始化与资源读取</w:t>
+        <w:t>4.2 数据库初始化与资源读取</w:t>
       </w:r>
     </w:p>
     <w:p>
       <w:r>
-        <w:t xml:space="preserve">DBUtil </w:t>
-      </w:r>
-      <w:r>
-        <w:t>统一维护连接地址、表结构和种子数据。</w:t>
-      </w:r>
-      <w:r>
-        <w:t xml:space="preserve">CSV </w:t>
-      </w:r>
-      <w:r>
-        <w:t>文件放在</w:t>
-      </w:r>
-      <w:r>
-        <w:t xml:space="preserve"> src/main/resources/data </w:t>
-      </w:r>
-      <w:r>
-        <w:t>中，以</w:t>
-      </w:r>
-      <w:r>
-        <w:t xml:space="preserve"> UTF-8 </w:t>
-      </w:r>
-      <w:r>
-        <w:t>读取，不依赖开发者电脑上的绝对路径。程序启动时先执行</w:t>
-      </w:r>
-      <w:r>
-        <w:t xml:space="preserve"> CREATE TABLE IF NOT EXISTS</w:t>
-      </w:r>
-      <w:r>
-        <w:t>，再根据表中记录数决定是否导入数据。</w:t>
+        <w:t>DBUtil 统一维护连接地址、表结构和种子数据。CSV 文件放在 src/main/resources/data 中，以 UTF-8 读取，不依赖开发者电脑上的绝对路径。程序启动时先执行 CREATE TABLE IF NOT EXISTS，再根据表中记录数决定是否导入数据。</w:t>
       </w:r>
     </w:p>
     <w:p>
@@ -12332,6 +11636,7 @@
           <w:color w:val="1F2937"/>
           <w:sz w:val="18"/>
         </w:rPr>
+        <w:lastRenderedPageBreak/>
         <w:t>try (Connection conn = getConnection();</w:t>
       </w:r>
       <w:r>
@@ -12428,54 +11733,12 @@
         <w:pStyle w:val="21"/>
       </w:pPr>
       <w:r>
-        <w:t xml:space="preserve">4.3 </w:t>
-      </w:r>
-      <w:r>
-        <w:t>参数化</w:t>
-      </w:r>
-      <w:r>
-        <w:t xml:space="preserve"> SQL </w:t>
-      </w:r>
-      <w:r>
-        <w:t>与对象映射</w:t>
+        <w:t>4.3 参数化 SQL 与对象映射</w:t>
       </w:r>
     </w:p>
     <w:p>
       <w:r>
-        <w:t xml:space="preserve">DAO </w:t>
-      </w:r>
-      <w:r>
-        <w:t>层使用</w:t>
-      </w:r>
-      <w:r>
-        <w:t xml:space="preserve"> PreparedStatement </w:t>
-      </w:r>
-      <w:r>
-        <w:t>的占位符绑定参数，避免把用户输入直接拼接到</w:t>
-      </w:r>
-      <w:r>
-        <w:t xml:space="preserve"> SQL </w:t>
-      </w:r>
-      <w:r>
-        <w:t>中。每个实体对应</w:t>
-      </w:r>
-      <w:r>
-        <w:t xml:space="preserve"> map </w:t>
-      </w:r>
-      <w:r>
-        <w:t>方法，将结果集列转换为</w:t>
-      </w:r>
-      <w:r>
-        <w:t xml:space="preserve"> Java </w:t>
-      </w:r>
-      <w:r>
-        <w:t>字段；重复查询逻辑被收敛到私有</w:t>
-      </w:r>
-      <w:r>
-        <w:t xml:space="preserve"> query </w:t>
-      </w:r>
-      <w:r>
-        <w:t>方法。</w:t>
+        <w:t>DAO 层使用 PreparedStatement 的占位符绑定参数，避免把用户输入直接拼接到 SQL 中。每个实体对应 map 方法，将结果集列转换为 Java 字段；重复查询逻辑被收敛到私有 query 方法。</w:t>
       </w:r>
     </w:p>
     <w:p>
@@ -12629,30 +11892,12 @@
         <w:pStyle w:val="21"/>
       </w:pPr>
       <w:r>
-        <w:t xml:space="preserve">4.4 </w:t>
-      </w:r>
-      <w:r>
-        <w:t>订单事务与库存一致性</w:t>
+        <w:t>4.4 订单事务与库存一致性</w:t>
       </w:r>
     </w:p>
     <w:p>
       <w:r>
-        <w:t xml:space="preserve">OrderService </w:t>
-      </w:r>
-      <w:r>
-        <w:t>是系统最关键的业务类。创建订单时，订单主表写入、明细写入和库存扣减必须作为一个整体成功；取消订单时，库存恢复和状态更新也必须作为一个整体成功。因此代码关闭自动提交，成功时</w:t>
-      </w:r>
-      <w:r>
-        <w:t xml:space="preserve"> commit</w:t>
-      </w:r>
-      <w:r>
-        <w:t>，异常时</w:t>
-      </w:r>
-      <w:r>
-        <w:t xml:space="preserve"> rollback</w:t>
-      </w:r>
-      <w:r>
-        <w:t>。</w:t>
+        <w:t>OrderService 是系统最关键的业务类。创建订单时，订单主表写入、明细写入和库存扣减必须作为一个整体成功；取消订单时，库存恢复和状态更新也必须作为一个整体成功。因此代码关闭自动提交，成功时 commit，异常时 rollback。</w:t>
       </w:r>
     </w:p>
     <w:p>
@@ -12674,6 +11919,7 @@
           <w:color w:val="1F2937"/>
           <w:sz w:val="18"/>
         </w:rPr>
+        <w:lastRenderedPageBreak/>
         <w:t>try (Connection c = DBUtil.getConnection()) {</w:t>
       </w:r>
       <w:r>
@@ -12803,33 +12049,12 @@
         <w:pStyle w:val="21"/>
       </w:pPr>
       <w:r>
-        <w:t xml:space="preserve">4.5 </w:t>
-      </w:r>
-      <w:r>
-        <w:t>会员折扣与精确金额</w:t>
+        <w:t>4.5 会员折扣与精确金额</w:t>
       </w:r>
     </w:p>
     <w:p>
       <w:r>
-        <w:t>金额统一使用</w:t>
-      </w:r>
-      <w:r>
-        <w:t xml:space="preserve"> BigDecimal</w:t>
-      </w:r>
-      <w:r>
-        <w:t>。系统先计算原价</w:t>
-      </w:r>
-      <w:r>
-        <w:t xml:space="preserve"> total</w:t>
-      </w:r>
-      <w:r>
-        <w:t>，再根据会员等级取得折扣率</w:t>
-      </w:r>
-      <w:r>
-        <w:t xml:space="preserve"> rate</w:t>
-      </w:r>
-      <w:r>
-        <w:t>，按四舍五入保留两位小数得到实付金额，最后用原价减实付得到优惠金额。</w:t>
+        <w:t>金额统一使用 BigDecimal。系统先计算原价 total，再根据会员等级取得折扣率 rate，按四舍五入保留两位小数得到实付金额，最后用原价减实付得到优惠金额。</w:t>
       </w:r>
     </w:p>
     <w:p>
@@ -12914,36 +12139,12 @@
         <w:pStyle w:val="21"/>
       </w:pPr>
       <w:r>
-        <w:t xml:space="preserve">4.6 </w:t>
-      </w:r>
-      <w:r>
-        <w:t>输入校验与取消机制</w:t>
+        <w:t>4.6 输入校验与取消机制</w:t>
       </w:r>
     </w:p>
     <w:p>
       <w:r>
-        <w:t xml:space="preserve">InputUtil </w:t>
-      </w:r>
-      <w:r>
-        <w:t>将整数、金额、年份、日期、正则表达式和固定选项等校验封装为可循环重试的方法。所有读取最终都经过</w:t>
-      </w:r>
-      <w:r>
-        <w:t xml:space="preserve"> readString</w:t>
-      </w:r>
-      <w:r>
-        <w:t>，因此用户输入</w:t>
-      </w:r>
-      <w:r>
-        <w:t xml:space="preserve"> q </w:t>
-      </w:r>
-      <w:r>
-        <w:t>时可以统一抛出</w:t>
-      </w:r>
-      <w:r>
-        <w:t xml:space="preserve"> CancelException</w:t>
-      </w:r>
-      <w:r>
-        <w:t>，由当前子菜单捕获并返回，业务方法不会收到半成品数据。</w:t>
+        <w:t>InputUtil 将整数、金额、年份、日期、正则表达式和固定选项等校验封装为可循环重试的方法。所有读取最终都经过 readString，因此用户输入 q 时可以统一抛出 CancelException，由当前子菜单捕获并返回，业务方法不会收到半成品数据。</w:t>
       </w:r>
     </w:p>
     <w:p>
@@ -13050,33 +12251,13 @@
         <w:pStyle w:val="21"/>
       </w:pPr>
       <w:r>
-        <w:t xml:space="preserve">4.7 </w:t>
-      </w:r>
-      <w:r>
-        <w:t>中文表格对齐</w:t>
+        <w:lastRenderedPageBreak/>
+        <w:t>4.7 中文表格对齐</w:t>
       </w:r>
     </w:p>
     <w:p>
       <w:r>
-        <w:t>控制台中汉字通常占两个显示宽度，英文字母和数字占一个显示宽度。</w:t>
-      </w:r>
-      <w:r>
-        <w:t xml:space="preserve">TableUtil </w:t>
-      </w:r>
-      <w:r>
-        <w:t>根据</w:t>
-      </w:r>
-      <w:r>
-        <w:t xml:space="preserve"> UnicodeBlock </w:t>
-      </w:r>
-      <w:r>
-        <w:t>判断字符宽度，再按列宽补空格或截断，避免使用普通</w:t>
-      </w:r>
-      <w:r>
-        <w:t xml:space="preserve"> String.length() </w:t>
-      </w:r>
-      <w:r>
-        <w:t>造成中英文混排错位。红酒、客户、产地、订单、明细和统计均复用同一套表格方法。</w:t>
+        <w:t>控制台中汉字通常占两个显示宽度，英文字母和数字占一个显示宽度。TableUtil 根据 UnicodeBlock 判断字符宽度，再按列宽补空格或截断，避免使用普通 String.length() 造成中英文混排错位。红酒、客户、产地、订单、明细和统计均复用同一套表格方法。</w:t>
       </w:r>
     </w:p>
     <w:p>
@@ -13084,57 +12265,21 @@
         <w:pStyle w:val="21"/>
       </w:pPr>
       <w:r>
-        <w:t xml:space="preserve">4.8 </w:t>
-      </w:r>
-      <w:r>
-        <w:t>删除约束与异常防护</w:t>
+        <w:t>4.8 删除约束与异常防护</w:t>
       </w:r>
     </w:p>
     <w:p>
       <w:r>
-        <w:t>删除操作不直接依赖数据库异常作为正常流程。</w:t>
-      </w:r>
-      <w:r>
-        <w:t xml:space="preserve">Service </w:t>
-      </w:r>
-      <w:r>
-        <w:t>会先调用</w:t>
-      </w:r>
-      <w:r>
-        <w:t xml:space="preserve"> DAO </w:t>
-      </w:r>
-      <w:r>
-        <w:t>查询关联记录数量：产地下有红酒、客户有订单、红酒有订单明细时返回</w:t>
-      </w:r>
-      <w:r>
-        <w:t xml:space="preserve"> false</w:t>
-      </w:r>
-      <w:r>
-        <w:t>，界面输出明确原因。数据库操作使用</w:t>
-      </w:r>
-      <w:r>
-        <w:t xml:space="preserve"> try-with-resources</w:t>
-      </w:r>
-      <w:r>
-        <w:t>，</w:t>
-      </w:r>
-      <w:r>
-        <w:t xml:space="preserve">SQL </w:t>
-      </w:r>
-      <w:r>
-        <w:t>异常转换为运行时异常或业务错误信息，避免连接泄漏。</w:t>
+        <w:t>删除操作不直接依赖数据库异常作为正常流程。Service 会先调用 DAO 查询关联记录数量：产地下有红酒、客户有订单、红酒有订单明细时返回 false，界面输出明确原因。数据库操作使用 try-with-resources，SQL 异常转换为运行时异常或业务错误信息，避免连接泄漏。</w:t>
       </w:r>
     </w:p>
     <w:p>
       <w:pPr>
         <w:pStyle w:val="11"/>
       </w:pPr>
-      <w:bookmarkStart w:id="4" w:name="_Toc235143185"/>
-      <w:r>
-        <w:t xml:space="preserve">5 </w:t>
-      </w:r>
-      <w:r>
-        <w:t>实现界面</w:t>
+      <w:bookmarkStart w:id="4" w:name="_Toc235194135"/>
+      <w:r>
+        <w:t>5 实现界面</w:t>
       </w:r>
       <w:bookmarkEnd w:id="4"/>
     </w:p>
@@ -13143,87 +12288,12 @@
         <w:pStyle w:val="21"/>
       </w:pPr>
       <w:r>
-        <w:t xml:space="preserve">5.1 </w:t>
-      </w:r>
-      <w:r>
-        <w:t>启动方式与演示环境</w:t>
+        <w:t>5.1 启动方式与演示环境</w:t>
       </w:r>
     </w:p>
     <w:p>
       <w:r>
-        <w:t>系统可在</w:t>
-      </w:r>
-      <w:r>
-        <w:t xml:space="preserve"> Windows </w:t>
-      </w:r>
-      <w:r>
-        <w:t>中双击</w:t>
-      </w:r>
-      <w:r>
-        <w:t xml:space="preserve"> run.bat </w:t>
-      </w:r>
-      <w:r>
-        <w:t>一键启动，也可运行</w:t>
-      </w:r>
-      <w:r>
-        <w:t xml:space="preserve"> mvnw.cmd exec:java</w:t>
-      </w:r>
-      <w:r>
-        <w:t>。首次启动自动在项目根目录创建</w:t>
-      </w:r>
-      <w:r>
-        <w:t xml:space="preserve"> wine.db</w:t>
-      </w:r>
-      <w:r>
-        <w:t>。以下界面来自隔离的演示数据库，按照</w:t>
-      </w:r>
-      <w:r>
-        <w:t>“</w:t>
-      </w:r>
-      <w:r>
-        <w:t>启动</w:t>
-      </w:r>
-      <w:r>
-        <w:t>—</w:t>
-      </w:r>
-      <w:r>
-        <w:t>查询红酒</w:t>
-      </w:r>
-      <w:r>
-        <w:t>—</w:t>
-      </w:r>
-      <w:r>
-        <w:t>新增客户</w:t>
-      </w:r>
-      <w:r>
-        <w:t>—</w:t>
-      </w:r>
-      <w:r>
-        <w:t>创建订单</w:t>
-      </w:r>
-      <w:r>
-        <w:t>—</w:t>
-      </w:r>
-      <w:r>
-        <w:t>查询详情</w:t>
-      </w:r>
-      <w:r>
-        <w:t>—</w:t>
-      </w:r>
-      <w:r>
-        <w:t>取消订单</w:t>
-      </w:r>
-      <w:r>
-        <w:t>—</w:t>
-      </w:r>
-      <w:r>
-        <w:t>查看统计</w:t>
-      </w:r>
-      <w:r>
-        <w:t>”</w:t>
-      </w:r>
-      <w:r>
-        <w:t>的完整流程截取。</w:t>
+        <w:t>系统可在 Windows 中双击 run.bat 一键启动，也可运行 mvnw.cmd exec:java。首次启动自动在项目根目录创建 wine.db。以下界面来自隔离的演示数据库，按照“启动—查询红酒—新增客户—创建订单—查询详情—取消订单—查看统计”的完整流程截取。</w:t>
       </w:r>
     </w:p>
     <w:p>
@@ -13235,12 +12305,14 @@
       <w:r>
         <w:rPr>
           <w:noProof/>
+          <w:color w:val="C00000"/>
+          <w:sz w:val="18"/>
         </w:rPr>
         <w:drawing>
-          <wp:inline distT="0" distB="0" distL="0" distR="0" wp14:anchorId="507F9531" wp14:editId="498B6765">
-            <wp:extent cx="5303520" cy="1038606"/>
+          <wp:inline distT="0" distB="0" distL="0" distR="0" wp14:anchorId="54AD197B" wp14:editId="619129D0">
+            <wp:extent cx="2939415" cy="1371600"/>
             <wp:effectExtent l="0" t="0" r="0" b="0"/>
-            <wp:docPr id="4" name="Picture 4" descr="图 5-1  系统启动与主菜单" title="图 5-1  系统启动与主菜单"/>
+            <wp:docPr id="917591903" name="图片 1"/>
             <wp:cNvGraphicFramePr>
               <a:graphicFrameLocks xmlns:a="http://schemas.openxmlformats.org/drawingml/2006/main" noChangeAspect="1"/>
             </wp:cNvGraphicFramePr>
@@ -13248,23 +12320,36 @@
               <a:graphicData uri="http://schemas.openxmlformats.org/drawingml/2006/picture">
                 <pic:pic xmlns:pic="http://schemas.openxmlformats.org/drawingml/2006/picture">
                   <pic:nvPicPr>
-                    <pic:cNvPr id="0" name="console-main.png"/>
-                    <pic:cNvPicPr/>
+                    <pic:cNvPr id="0" name="图片 1"/>
+                    <pic:cNvPicPr>
+                      <a:picLocks noChangeAspect="1" noChangeArrowheads="1"/>
+                    </pic:cNvPicPr>
                   </pic:nvPicPr>
                   <pic:blipFill>
-                    <a:blip r:embed="rId10"/>
+                    <a:blip r:embed="rId10">
+                      <a:extLst>
+                        <a:ext uri="{28A0092B-C50C-407E-A947-70E740481C1C}">
+                          <a14:useLocalDpi xmlns:a14="http://schemas.microsoft.com/office/drawing/2010/main" val="0"/>
+                        </a:ext>
+                      </a:extLst>
+                    </a:blip>
+                    <a:srcRect/>
                     <a:stretch>
                       <a:fillRect/>
                     </a:stretch>
                   </pic:blipFill>
-                  <pic:spPr>
+                  <pic:spPr bwMode="auto">
                     <a:xfrm>
                       <a:off x="0" y="0"/>
-                      <a:ext cx="5303520" cy="1038606"/>
+                      <a:ext cx="2939415" cy="1371600"/>
                     </a:xfrm>
                     <a:prstGeom prst="rect">
                       <a:avLst/>
                     </a:prstGeom>
+                    <a:noFill/>
+                    <a:ln>
+                      <a:noFill/>
+                    </a:ln>
                   </pic:spPr>
                 </pic:pic>
               </a:graphicData>
@@ -13283,127 +12368,12 @@
         <w:rPr>
           <w:sz w:val="21"/>
         </w:rPr>
-        <w:t>图</w:t>
-      </w:r>
-      <w:r>
-        <w:rPr>
-          <w:sz w:val="21"/>
-        </w:rPr>
-        <w:t xml:space="preserve"> 5-1  </w:t>
-      </w:r>
-      <w:r>
-        <w:rPr>
-          <w:sz w:val="21"/>
-        </w:rPr>
-        <w:t>系统启动与主菜单</w:t>
+        <w:t>图 5-1  系统启动与主菜单</w:t>
       </w:r>
     </w:p>
     <w:p>
-      <w:pPr>
-        <w:spacing w:after="120" w:line="276" w:lineRule="auto"/>
-        <w:ind w:left="160" w:right="160" w:firstLine="0"/>
-      </w:pPr>
-      <w:r>
-        <w:rPr>
-          <w:b/>
-          <w:color w:val="C00000"/>
-          <w:sz w:val="18"/>
-        </w:rPr>
-        <w:t>手动截图方法：</w:t>
-      </w:r>
-      <w:r>
-        <w:rPr>
-          <w:color w:val="C00000"/>
-          <w:sz w:val="18"/>
-        </w:rPr>
-        <w:t>如需按图</w:t>
-      </w:r>
-      <w:r>
-        <w:rPr>
-          <w:color w:val="C00000"/>
-          <w:sz w:val="18"/>
-        </w:rPr>
-        <w:t xml:space="preserve"> 5-1 </w:t>
-      </w:r>
-      <w:r>
-        <w:rPr>
-          <w:color w:val="C00000"/>
-          <w:sz w:val="18"/>
-        </w:rPr>
-        <w:t>至图</w:t>
-      </w:r>
-      <w:r>
-        <w:rPr>
-          <w:color w:val="C00000"/>
-          <w:sz w:val="18"/>
-        </w:rPr>
-        <w:t xml:space="preserve"> 5-7 </w:t>
-      </w:r>
-      <w:r>
-        <w:rPr>
-          <w:color w:val="C00000"/>
-          <w:sz w:val="18"/>
-        </w:rPr>
-        <w:t>的顺序复现，先备份需要保留的</w:t>
-      </w:r>
-      <w:r>
-        <w:rPr>
-          <w:color w:val="C00000"/>
-          <w:sz w:val="18"/>
-        </w:rPr>
-        <w:t xml:space="preserve"> wine.db</w:t>
-      </w:r>
-      <w:r>
-        <w:rPr>
-          <w:color w:val="C00000"/>
-          <w:sz w:val="18"/>
-        </w:rPr>
-        <w:t>，关闭程序后双击</w:t>
-      </w:r>
-      <w:r>
-        <w:rPr>
-          <w:color w:val="C00000"/>
-          <w:sz w:val="18"/>
-        </w:rPr>
-        <w:t xml:space="preserve"> reset-database.bat</w:t>
-      </w:r>
-      <w:r>
-        <w:rPr>
-          <w:color w:val="C00000"/>
-          <w:sz w:val="18"/>
-        </w:rPr>
-        <w:t>，再双击</w:t>
-      </w:r>
-      <w:r>
-        <w:rPr>
-          <w:color w:val="C00000"/>
-          <w:sz w:val="18"/>
-        </w:rPr>
-        <w:t xml:space="preserve"> run.bat</w:t>
-      </w:r>
-      <w:r>
-        <w:rPr>
-          <w:color w:val="C00000"/>
-          <w:sz w:val="18"/>
-        </w:rPr>
-        <w:t>；主菜单完整显示后截图。</w:t>
-      </w:r>
-    </w:p>
-    <w:p>
-      <w:r>
-        <w:t>主菜单显示六个业务模块。输入数字进入对应功能，输入</w:t>
-      </w:r>
-      <w:r>
-        <w:t xml:space="preserve"> 0 </w:t>
-      </w:r>
-      <w:r>
-        <w:t>退出系统；顶部提示用户可在任意录入项输入</w:t>
-      </w:r>
-      <w:r>
-        <w:t xml:space="preserve"> q </w:t>
-      </w:r>
-      <w:r>
-        <w:t>取消当前操作。</w:t>
+      <w:r>
+        <w:t>主菜单显示六个业务模块。输入数字进入对应功能，输入 0 退出系统；顶部提示用户可在任意录入项输入 q 取消当前操作。</w:t>
       </w:r>
     </w:p>
     <w:p>
@@ -13411,10 +12381,8 @@
         <w:pStyle w:val="21"/>
       </w:pPr>
       <w:r>
-        <w:t xml:space="preserve">5.2 </w:t>
-      </w:r>
-      <w:r>
-        <w:t>红酒信息查询</w:t>
+        <w:lastRenderedPageBreak/>
+        <w:t>5.2 红酒信息查询</w:t>
       </w:r>
     </w:p>
     <w:p>
@@ -13426,12 +12394,14 @@
       <w:r>
         <w:rPr>
           <w:noProof/>
+          <w:color w:val="C00000"/>
+          <w:sz w:val="18"/>
         </w:rPr>
         <w:drawing>
-          <wp:inline distT="0" distB="0" distL="0" distR="0" wp14:anchorId="040A6B6E" wp14:editId="1EC8175B">
-            <wp:extent cx="5303520" cy="1264006"/>
-            <wp:effectExtent l="0" t="0" r="0" b="0"/>
-            <wp:docPr id="5" name="Picture 5" descr="图 5-2  红酒信息查询结果" title="图 5-2  红酒信息查询结果"/>
+          <wp:inline distT="0" distB="0" distL="0" distR="0" wp14:anchorId="43194FFF" wp14:editId="6D595A6F">
+            <wp:extent cx="5272405" cy="3315970"/>
+            <wp:effectExtent l="0" t="0" r="4445" b="0"/>
+            <wp:docPr id="1503872948" name="图片 2"/>
             <wp:cNvGraphicFramePr>
               <a:graphicFrameLocks xmlns:a="http://schemas.openxmlformats.org/drawingml/2006/main" noChangeAspect="1"/>
             </wp:cNvGraphicFramePr>
@@ -13439,23 +12409,36 @@
               <a:graphicData uri="http://schemas.openxmlformats.org/drawingml/2006/picture">
                 <pic:pic xmlns:pic="http://schemas.openxmlformats.org/drawingml/2006/picture">
                   <pic:nvPicPr>
-                    <pic:cNvPr id="0" name="console-wines.png"/>
-                    <pic:cNvPicPr/>
+                    <pic:cNvPr id="0" name="图片 1"/>
+                    <pic:cNvPicPr>
+                      <a:picLocks noChangeAspect="1" noChangeArrowheads="1"/>
+                    </pic:cNvPicPr>
                   </pic:nvPicPr>
                   <pic:blipFill>
-                    <a:blip r:embed="rId11"/>
+                    <a:blip r:embed="rId11">
+                      <a:extLst>
+                        <a:ext uri="{28A0092B-C50C-407E-A947-70E740481C1C}">
+                          <a14:useLocalDpi xmlns:a14="http://schemas.microsoft.com/office/drawing/2010/main" val="0"/>
+                        </a:ext>
+                      </a:extLst>
+                    </a:blip>
+                    <a:srcRect/>
                     <a:stretch>
                       <a:fillRect/>
                     </a:stretch>
                   </pic:blipFill>
-                  <pic:spPr>
+                  <pic:spPr bwMode="auto">
                     <a:xfrm>
                       <a:off x="0" y="0"/>
-                      <a:ext cx="5303520" cy="1264006"/>
+                      <a:ext cx="5272405" cy="3315970"/>
                     </a:xfrm>
                     <a:prstGeom prst="rect">
                       <a:avLst/>
                     </a:prstGeom>
+                    <a:noFill/>
+                    <a:ln>
+                      <a:noFill/>
+                    </a:ln>
                   </pic:spPr>
                 </pic:pic>
               </a:graphicData>
@@ -13474,82 +12457,7 @@
         <w:rPr>
           <w:sz w:val="21"/>
         </w:rPr>
-        <w:t>图</w:t>
-      </w:r>
-      <w:r>
-        <w:rPr>
-          <w:sz w:val="21"/>
-        </w:rPr>
-        <w:t xml:space="preserve"> 5-2  </w:t>
-      </w:r>
-      <w:r>
-        <w:rPr>
-          <w:sz w:val="21"/>
-        </w:rPr>
-        <w:t>红酒信息查询结果</w:t>
-      </w:r>
-    </w:p>
-    <w:p>
-      <w:pPr>
-        <w:spacing w:after="120" w:line="276" w:lineRule="auto"/>
-        <w:ind w:left="160" w:right="160" w:firstLine="0"/>
-      </w:pPr>
-      <w:r>
-        <w:rPr>
-          <w:b/>
-          <w:color w:val="C00000"/>
-          <w:sz w:val="18"/>
-        </w:rPr>
-        <w:t>手动截图方法：</w:t>
-      </w:r>
-      <w:r>
-        <w:rPr>
-          <w:color w:val="C00000"/>
-          <w:sz w:val="18"/>
-        </w:rPr>
-        <w:t>从主菜单输入</w:t>
-      </w:r>
-      <w:r>
-        <w:rPr>
-          <w:color w:val="C00000"/>
-          <w:sz w:val="18"/>
-        </w:rPr>
-        <w:t xml:space="preserve"> 1</w:t>
-      </w:r>
-      <w:r>
-        <w:rPr>
-          <w:color w:val="C00000"/>
-          <w:sz w:val="18"/>
-        </w:rPr>
-        <w:t>，在红酒信息管理菜单输入</w:t>
-      </w:r>
-      <w:r>
-        <w:rPr>
-          <w:color w:val="C00000"/>
-          <w:sz w:val="18"/>
-        </w:rPr>
-        <w:t xml:space="preserve"> 4</w:t>
-      </w:r>
-      <w:r>
-        <w:rPr>
-          <w:color w:val="C00000"/>
-          <w:sz w:val="18"/>
-        </w:rPr>
-        <w:t>；全部红酒表格显示后截图，再输入</w:t>
-      </w:r>
-      <w:r>
-        <w:rPr>
-          <w:color w:val="C00000"/>
-          <w:sz w:val="18"/>
-        </w:rPr>
-        <w:t xml:space="preserve"> 0 </w:t>
-      </w:r>
-      <w:r>
-        <w:rPr>
-          <w:color w:val="C00000"/>
-          <w:sz w:val="18"/>
-        </w:rPr>
-        <w:t>返回主菜单。</w:t>
+        <w:t>图 5-2  红酒信息查询结果</w:t>
       </w:r>
     </w:p>
     <w:p>
@@ -13562,10 +12470,7 @@
         <w:pStyle w:val="21"/>
       </w:pPr>
       <w:r>
-        <w:t xml:space="preserve">5.3 </w:t>
-      </w:r>
-      <w:r>
-        <w:t>新增客户</w:t>
+        <w:t>5.3 新增客户</w:t>
       </w:r>
     </w:p>
     <w:p>
@@ -13575,14 +12480,11 @@
         <w:jc w:val="center"/>
       </w:pPr>
       <w:r>
-        <w:rPr>
-          <w:noProof/>
-        </w:rPr>
         <w:drawing>
-          <wp:inline distT="0" distB="0" distL="0" distR="0" wp14:anchorId="7D34C0F7" wp14:editId="6BDBCBCC">
-            <wp:extent cx="5303520" cy="662940"/>
+          <wp:inline distT="0" distB="0" distL="0" distR="0" wp14:anchorId="2B74A0CF" wp14:editId="3449DEBF">
+            <wp:extent cx="3378374" cy="1168460"/>
             <wp:effectExtent l="0" t="0" r="0" b="0"/>
-            <wp:docPr id="6" name="Picture 6" descr="图 5-3  新增演示客户" title="图 5-3  新增演示客户"/>
+            <wp:docPr id="1988219790" name="图片 1"/>
             <wp:cNvGraphicFramePr>
               <a:graphicFrameLocks xmlns:a="http://schemas.openxmlformats.org/drawingml/2006/main" noChangeAspect="1"/>
             </wp:cNvGraphicFramePr>
@@ -13590,7 +12492,7 @@
               <a:graphicData uri="http://schemas.openxmlformats.org/drawingml/2006/picture">
                 <pic:pic xmlns:pic="http://schemas.openxmlformats.org/drawingml/2006/picture">
                   <pic:nvPicPr>
-                    <pic:cNvPr id="0" name="console-customer.png"/>
+                    <pic:cNvPr id="1988219790" name=""/>
                     <pic:cNvPicPr/>
                   </pic:nvPicPr>
                   <pic:blipFill>
@@ -13602,7 +12504,7 @@
                   <pic:spPr>
                     <a:xfrm>
                       <a:off x="0" y="0"/>
-                      <a:ext cx="5303520" cy="662940"/>
+                      <a:ext cx="3378374" cy="1168460"/>
                     </a:xfrm>
                     <a:prstGeom prst="rect">
                       <a:avLst/>
@@ -13625,169 +12527,12 @@
         <w:rPr>
           <w:sz w:val="21"/>
         </w:rPr>
-        <w:t>图</w:t>
-      </w:r>
-      <w:r>
-        <w:rPr>
-          <w:sz w:val="21"/>
-        </w:rPr>
-        <w:t xml:space="preserve"> 5-3  </w:t>
-      </w:r>
-      <w:r>
-        <w:rPr>
-          <w:sz w:val="21"/>
-        </w:rPr>
-        <w:t>新增演示客户</w:t>
+        <w:t>图 5-3  新增演示客户</w:t>
       </w:r>
     </w:p>
     <w:p>
-      <w:pPr>
-        <w:spacing w:after="120" w:line="276" w:lineRule="auto"/>
-        <w:ind w:left="160" w:right="160" w:firstLine="0"/>
-      </w:pPr>
-      <w:r>
-        <w:rPr>
-          <w:b/>
-          <w:color w:val="C00000"/>
-          <w:sz w:val="18"/>
-        </w:rPr>
-        <w:t>手动截图方法：</w:t>
-      </w:r>
-      <w:r>
-        <w:rPr>
-          <w:color w:val="C00000"/>
-          <w:sz w:val="18"/>
-        </w:rPr>
-        <w:t>从主菜单输入</w:t>
-      </w:r>
-      <w:r>
-        <w:rPr>
-          <w:color w:val="C00000"/>
-          <w:sz w:val="18"/>
-        </w:rPr>
-        <w:t xml:space="preserve"> 3</w:t>
-      </w:r>
-      <w:r>
-        <w:rPr>
-          <w:color w:val="C00000"/>
-          <w:sz w:val="18"/>
-        </w:rPr>
-        <w:t>，在客户信息管理菜单输入</w:t>
-      </w:r>
-      <w:r>
-        <w:rPr>
-          <w:color w:val="C00000"/>
-          <w:sz w:val="18"/>
-        </w:rPr>
-        <w:t xml:space="preserve"> 1</w:t>
-      </w:r>
-      <w:r>
-        <w:rPr>
-          <w:color w:val="C00000"/>
-          <w:sz w:val="18"/>
-        </w:rPr>
-        <w:t>；依次输入</w:t>
-      </w:r>
-      <w:r>
-        <w:rPr>
-          <w:color w:val="C00000"/>
-          <w:sz w:val="18"/>
-        </w:rPr>
-        <w:t>“</w:t>
-      </w:r>
-      <w:r>
-        <w:rPr>
-          <w:color w:val="C00000"/>
-          <w:sz w:val="18"/>
-        </w:rPr>
-        <w:t>演示客户、男、</w:t>
-      </w:r>
-      <w:r>
-        <w:rPr>
-          <w:color w:val="C00000"/>
-          <w:sz w:val="18"/>
-        </w:rPr>
-        <w:t>13900000006</w:t>
-      </w:r>
-      <w:r>
-        <w:rPr>
-          <w:color w:val="C00000"/>
-          <w:sz w:val="18"/>
-        </w:rPr>
-        <w:t>、安徽合肥、私享会员</w:t>
-      </w:r>
-      <w:r>
-        <w:rPr>
-          <w:color w:val="C00000"/>
-          <w:sz w:val="18"/>
-        </w:rPr>
-        <w:t>”</w:t>
-      </w:r>
-      <w:r>
-        <w:rPr>
-          <w:color w:val="C00000"/>
-          <w:sz w:val="18"/>
-        </w:rPr>
-        <w:t>，出现</w:t>
-      </w:r>
-      <w:r>
-        <w:rPr>
-          <w:color w:val="C00000"/>
-          <w:sz w:val="18"/>
-        </w:rPr>
-        <w:t>“</w:t>
-      </w:r>
-      <w:r>
-        <w:rPr>
-          <w:color w:val="C00000"/>
-          <w:sz w:val="18"/>
-        </w:rPr>
-        <w:t>保存成功。</w:t>
-      </w:r>
-      <w:r>
-        <w:rPr>
-          <w:color w:val="C00000"/>
-          <w:sz w:val="18"/>
-        </w:rPr>
-        <w:t>”</w:t>
-      </w:r>
-      <w:r>
-        <w:rPr>
-          <w:color w:val="C00000"/>
-          <w:sz w:val="18"/>
-        </w:rPr>
-        <w:t>后截图，再输入</w:t>
-      </w:r>
-      <w:r>
-        <w:rPr>
-          <w:color w:val="C00000"/>
-          <w:sz w:val="18"/>
-        </w:rPr>
-        <w:t xml:space="preserve"> 0 </w:t>
-      </w:r>
-      <w:r>
-        <w:rPr>
-          <w:color w:val="C00000"/>
-          <w:sz w:val="18"/>
-        </w:rPr>
-        <w:t>返回主菜单。</w:t>
-      </w:r>
-    </w:p>
-    <w:p>
-      <w:r>
-        <w:t>演示客户选择私享会员。系统对姓名、性别、</w:t>
-      </w:r>
-      <w:r>
-        <w:t xml:space="preserve">11 </w:t>
-      </w:r>
-      <w:r>
-        <w:t>位手机号、地址和会员等级进行校验，注册时间由</w:t>
-      </w:r>
-      <w:r>
-        <w:t xml:space="preserve"> DateUtil </w:t>
-      </w:r>
-      <w:r>
-        <w:t>自动生成。</w:t>
+      <w:r>
+        <w:t>演示客户选择私享会员。系统对姓名、性别、11 位手机号、地址和会员等级进行校验，注册时间由 DateUtil 自动生成。</w:t>
       </w:r>
     </w:p>
     <w:p>
@@ -13795,10 +12540,8 @@
         <w:pStyle w:val="21"/>
       </w:pPr>
       <w:r>
-        <w:t xml:space="preserve">5.4 </w:t>
-      </w:r>
-      <w:r>
-        <w:t>创建购买订单</w:t>
+        <w:lastRenderedPageBreak/>
+        <w:t>5.4 创建购买订单</w:t>
       </w:r>
     </w:p>
     <w:p>
@@ -13812,10 +12555,10 @@
           <w:noProof/>
         </w:rPr>
         <w:drawing>
-          <wp:inline distT="0" distB="0" distL="0" distR="0" wp14:anchorId="6A264BEA" wp14:editId="5A3B451F">
-            <wp:extent cx="5303520" cy="662940"/>
-            <wp:effectExtent l="0" t="0" r="0" b="0"/>
-            <wp:docPr id="7" name="Picture 7" descr="图 5-4  创建购买订单并计算折扣" title="图 5-4  创建购买订单并计算折扣"/>
+          <wp:inline distT="0" distB="0" distL="0" distR="0" wp14:anchorId="71E478E2" wp14:editId="7FA03D5A">
+            <wp:extent cx="5274310" cy="4424045"/>
+            <wp:effectExtent l="0" t="0" r="2540" b="0"/>
+            <wp:docPr id="843993265" name="图片 4"/>
             <wp:cNvGraphicFramePr>
               <a:graphicFrameLocks xmlns:a="http://schemas.openxmlformats.org/drawingml/2006/main" noChangeAspect="1"/>
             </wp:cNvGraphicFramePr>
@@ -13823,23 +12566,36 @@
               <a:graphicData uri="http://schemas.openxmlformats.org/drawingml/2006/picture">
                 <pic:pic xmlns:pic="http://schemas.openxmlformats.org/drawingml/2006/picture">
                   <pic:nvPicPr>
-                    <pic:cNvPr id="0" name="console-order.png"/>
-                    <pic:cNvPicPr/>
+                    <pic:cNvPr id="0" name="图片 1"/>
+                    <pic:cNvPicPr>
+                      <a:picLocks noChangeAspect="1" noChangeArrowheads="1"/>
+                    </pic:cNvPicPr>
                   </pic:nvPicPr>
                   <pic:blipFill>
-                    <a:blip r:embed="rId13"/>
+                    <a:blip r:embed="rId13">
+                      <a:extLst>
+                        <a:ext uri="{28A0092B-C50C-407E-A947-70E740481C1C}">
+                          <a14:useLocalDpi xmlns:a14="http://schemas.microsoft.com/office/drawing/2010/main" val="0"/>
+                        </a:ext>
+                      </a:extLst>
+                    </a:blip>
+                    <a:srcRect/>
                     <a:stretch>
                       <a:fillRect/>
                     </a:stretch>
                   </pic:blipFill>
-                  <pic:spPr>
+                  <pic:spPr bwMode="auto">
                     <a:xfrm>
                       <a:off x="0" y="0"/>
-                      <a:ext cx="5303520" cy="662940"/>
+                      <a:ext cx="5274310" cy="4424045"/>
                     </a:xfrm>
                     <a:prstGeom prst="rect">
                       <a:avLst/>
                     </a:prstGeom>
+                    <a:noFill/>
+                    <a:ln>
+                      <a:noFill/>
+                    </a:ln>
                   </pic:spPr>
                 </pic:pic>
               </a:graphicData>
@@ -13858,193 +12614,12 @@
         <w:rPr>
           <w:sz w:val="21"/>
         </w:rPr>
-        <w:t>图</w:t>
-      </w:r>
-      <w:r>
-        <w:rPr>
-          <w:sz w:val="21"/>
-        </w:rPr>
-        <w:t xml:space="preserve"> 5-4  </w:t>
-      </w:r>
-      <w:r>
-        <w:rPr>
-          <w:sz w:val="21"/>
-        </w:rPr>
-        <w:t>创建购买订单并计算折扣</w:t>
+        <w:t>图 5-4  创建购买订单并计算折扣</w:t>
       </w:r>
     </w:p>
     <w:p>
-      <w:pPr>
-        <w:spacing w:after="120" w:line="276" w:lineRule="auto"/>
-        <w:ind w:left="160" w:right="160" w:firstLine="0"/>
-      </w:pPr>
-      <w:r>
-        <w:rPr>
-          <w:b/>
-          <w:color w:val="C00000"/>
-          <w:sz w:val="18"/>
-        </w:rPr>
-        <w:t>手动截图方法：</w:t>
-      </w:r>
-      <w:r>
-        <w:rPr>
-          <w:color w:val="C00000"/>
-          <w:sz w:val="18"/>
-        </w:rPr>
-        <w:t>从主菜单输入</w:t>
-      </w:r>
-      <w:r>
-        <w:rPr>
-          <w:color w:val="C00000"/>
-          <w:sz w:val="18"/>
-        </w:rPr>
-        <w:t xml:space="preserve"> 4</w:t>
-      </w:r>
-      <w:r>
-        <w:rPr>
-          <w:color w:val="C00000"/>
-          <w:sz w:val="18"/>
-        </w:rPr>
-        <w:t>，在购买结算管理菜单输入</w:t>
-      </w:r>
-      <w:r>
-        <w:rPr>
-          <w:color w:val="C00000"/>
-          <w:sz w:val="18"/>
-        </w:rPr>
-        <w:t xml:space="preserve"> 1</w:t>
-      </w:r>
-      <w:r>
-        <w:rPr>
-          <w:color w:val="C00000"/>
-          <w:sz w:val="18"/>
-        </w:rPr>
-        <w:t>；客户编号输入</w:t>
-      </w:r>
-      <w:r>
-        <w:rPr>
-          <w:color w:val="C00000"/>
-          <w:sz w:val="18"/>
-        </w:rPr>
-        <w:t xml:space="preserve"> 6</w:t>
-      </w:r>
-      <w:r>
-        <w:rPr>
-          <w:color w:val="C00000"/>
-          <w:sz w:val="18"/>
-        </w:rPr>
-        <w:t>、红酒编号输入</w:t>
-      </w:r>
-      <w:r>
-        <w:rPr>
-          <w:color w:val="C00000"/>
-          <w:sz w:val="18"/>
-        </w:rPr>
-        <w:t xml:space="preserve"> 2</w:t>
-      </w:r>
-      <w:r>
-        <w:rPr>
-          <w:color w:val="C00000"/>
-          <w:sz w:val="18"/>
-        </w:rPr>
-        <w:t>、购买数量输入</w:t>
-      </w:r>
-      <w:r>
-        <w:rPr>
-          <w:color w:val="C00000"/>
-          <w:sz w:val="18"/>
-        </w:rPr>
-        <w:t xml:space="preserve"> 2</w:t>
-      </w:r>
-      <w:r>
-        <w:rPr>
-          <w:color w:val="C00000"/>
-          <w:sz w:val="18"/>
-        </w:rPr>
-        <w:t>、支付方式输入</w:t>
-      </w:r>
-      <w:r>
-        <w:rPr>
-          <w:color w:val="C00000"/>
-          <w:sz w:val="18"/>
-        </w:rPr>
-        <w:t>“</w:t>
-      </w:r>
-      <w:r>
-        <w:rPr>
-          <w:color w:val="C00000"/>
-          <w:sz w:val="18"/>
-        </w:rPr>
-        <w:t>支付宝</w:t>
-      </w:r>
-      <w:r>
-        <w:rPr>
-          <w:color w:val="C00000"/>
-          <w:sz w:val="18"/>
-        </w:rPr>
-        <w:t>”</w:t>
-      </w:r>
-      <w:r>
-        <w:rPr>
-          <w:color w:val="C00000"/>
-          <w:sz w:val="18"/>
-        </w:rPr>
-        <w:t>，出现订单创建成功及订单编号后截图，再输入</w:t>
-      </w:r>
-      <w:r>
-        <w:rPr>
-          <w:color w:val="C00000"/>
-          <w:sz w:val="18"/>
-        </w:rPr>
-        <w:t xml:space="preserve"> 0 </w:t>
-      </w:r>
-      <w:r>
-        <w:rPr>
-          <w:color w:val="C00000"/>
-          <w:sz w:val="18"/>
-        </w:rPr>
-        <w:t>返回主菜单。</w:t>
-      </w:r>
-    </w:p>
-    <w:p>
-      <w:r>
-        <w:t>演示客户购买</w:t>
-      </w:r>
-      <w:r>
-        <w:t xml:space="preserve"> 2 </w:t>
-      </w:r>
-      <w:r>
-        <w:t>瓶单价</w:t>
-      </w:r>
-      <w:r>
-        <w:t xml:space="preserve"> 90 </w:t>
-      </w:r>
-      <w:r>
-        <w:t>元的红酒，原价为</w:t>
-      </w:r>
-      <w:r>
-        <w:t xml:space="preserve"> 180 </w:t>
-      </w:r>
-      <w:r>
-        <w:t>元。私享会员按</w:t>
-      </w:r>
-      <w:r>
-        <w:t xml:space="preserve"> 85% </w:t>
-      </w:r>
-      <w:r>
-        <w:t>结算，实付金额为</w:t>
-      </w:r>
-      <w:r>
-        <w:t xml:space="preserve"> 153.00 </w:t>
-      </w:r>
-      <w:r>
-        <w:t>元，优惠</w:t>
-      </w:r>
-      <w:r>
-        <w:t xml:space="preserve"> 27 </w:t>
-      </w:r>
-      <w:r>
-        <w:t>元。订单创建成功后库存同步扣减。</w:t>
+      <w:r>
+        <w:t>演示客户购买 2 瓶单价 90 元的红酒，原价为 180 元。私享会员按 85% 结算，实付金额为 153.00 元，优惠 27 元。订单创建成功后库存同步扣减。</w:t>
       </w:r>
     </w:p>
     <w:p>
@@ -14052,10 +12627,8 @@
         <w:pStyle w:val="21"/>
       </w:pPr>
       <w:r>
-        <w:t xml:space="preserve">5.5 </w:t>
-      </w:r>
-      <w:r>
-        <w:t>查询订单详情</w:t>
+        <w:lastRenderedPageBreak/>
+        <w:t>5.5 查询订单详情</w:t>
       </w:r>
     </w:p>
     <w:p>
@@ -14067,12 +12640,14 @@
       <w:r>
         <w:rPr>
           <w:noProof/>
+          <w:color w:val="C00000"/>
+          <w:sz w:val="18"/>
         </w:rPr>
         <w:drawing>
-          <wp:inline distT="0" distB="0" distL="0" distR="0" wp14:anchorId="2ED78C6E" wp14:editId="1E332D75">
-            <wp:extent cx="5303520" cy="1489405"/>
-            <wp:effectExtent l="0" t="0" r="0" b="0"/>
-            <wp:docPr id="8" name="Picture 8" descr="图 5-5  订单主表与订单明细" title="图 5-5  订单主表与订单明细"/>
+          <wp:inline distT="0" distB="0" distL="0" distR="0" wp14:anchorId="60C6D980" wp14:editId="079796E1">
+            <wp:extent cx="5272405" cy="1649095"/>
+            <wp:effectExtent l="0" t="0" r="4445" b="8255"/>
+            <wp:docPr id="1845250607" name="图片 5"/>
             <wp:cNvGraphicFramePr>
               <a:graphicFrameLocks xmlns:a="http://schemas.openxmlformats.org/drawingml/2006/main" noChangeAspect="1"/>
             </wp:cNvGraphicFramePr>
@@ -14080,23 +12655,36 @@
               <a:graphicData uri="http://schemas.openxmlformats.org/drawingml/2006/picture">
                 <pic:pic xmlns:pic="http://schemas.openxmlformats.org/drawingml/2006/picture">
                   <pic:nvPicPr>
-                    <pic:cNvPr id="0" name="console-order-detail.png"/>
-                    <pic:cNvPicPr/>
+                    <pic:cNvPr id="0" name="图片 1"/>
+                    <pic:cNvPicPr>
+                      <a:picLocks noChangeAspect="1" noChangeArrowheads="1"/>
+                    </pic:cNvPicPr>
                   </pic:nvPicPr>
                   <pic:blipFill>
-                    <a:blip r:embed="rId14"/>
+                    <a:blip r:embed="rId14">
+                      <a:extLst>
+                        <a:ext uri="{28A0092B-C50C-407E-A947-70E740481C1C}">
+                          <a14:useLocalDpi xmlns:a14="http://schemas.microsoft.com/office/drawing/2010/main" val="0"/>
+                        </a:ext>
+                      </a:extLst>
+                    </a:blip>
+                    <a:srcRect/>
                     <a:stretch>
                       <a:fillRect/>
                     </a:stretch>
                   </pic:blipFill>
-                  <pic:spPr>
+                  <pic:spPr bwMode="auto">
                     <a:xfrm>
                       <a:off x="0" y="0"/>
-                      <a:ext cx="5303520" cy="1489405"/>
+                      <a:ext cx="5272405" cy="1649095"/>
                     </a:xfrm>
                     <a:prstGeom prst="rect">
                       <a:avLst/>
                     </a:prstGeom>
+                    <a:noFill/>
+                    <a:ln>
+                      <a:noFill/>
+                    </a:ln>
                   </pic:spPr>
                 </pic:pic>
               </a:graphicData>
@@ -14115,96 +12703,7 @@
         <w:rPr>
           <w:sz w:val="21"/>
         </w:rPr>
-        <w:t>图</w:t>
-      </w:r>
-      <w:r>
-        <w:rPr>
-          <w:sz w:val="21"/>
-        </w:rPr>
-        <w:t xml:space="preserve"> 5-5  </w:t>
-      </w:r>
-      <w:r>
-        <w:rPr>
-          <w:sz w:val="21"/>
-        </w:rPr>
-        <w:t>订单主表与订单明细</w:t>
-      </w:r>
-    </w:p>
-    <w:p>
-      <w:pPr>
-        <w:spacing w:after="120" w:line="276" w:lineRule="auto"/>
-        <w:ind w:left="160" w:right="160" w:firstLine="0"/>
-      </w:pPr>
-      <w:r>
-        <w:rPr>
-          <w:b/>
-          <w:color w:val="C00000"/>
-          <w:sz w:val="18"/>
-        </w:rPr>
-        <w:t>手动截图方法：</w:t>
-      </w:r>
-      <w:r>
-        <w:rPr>
-          <w:color w:val="C00000"/>
-          <w:sz w:val="18"/>
-        </w:rPr>
-        <w:t>从主菜单输入</w:t>
-      </w:r>
-      <w:r>
-        <w:rPr>
-          <w:color w:val="C00000"/>
-          <w:sz w:val="18"/>
-        </w:rPr>
-        <w:t xml:space="preserve"> 5</w:t>
-      </w:r>
-      <w:r>
-        <w:rPr>
-          <w:color w:val="C00000"/>
-          <w:sz w:val="18"/>
-        </w:rPr>
-        <w:t>，在订单查询管理菜单输入</w:t>
-      </w:r>
-      <w:r>
-        <w:rPr>
-          <w:color w:val="C00000"/>
-          <w:sz w:val="18"/>
-        </w:rPr>
-        <w:t xml:space="preserve"> 2</w:t>
-      </w:r>
-      <w:r>
-        <w:rPr>
-          <w:color w:val="C00000"/>
-          <w:sz w:val="18"/>
-        </w:rPr>
-        <w:t>，订单编号输入</w:t>
-      </w:r>
-      <w:r>
-        <w:rPr>
-          <w:color w:val="C00000"/>
-          <w:sz w:val="18"/>
-        </w:rPr>
-        <w:t xml:space="preserve"> 2</w:t>
-      </w:r>
-      <w:r>
-        <w:rPr>
-          <w:color w:val="C00000"/>
-          <w:sz w:val="18"/>
-        </w:rPr>
-        <w:t>；订单主表和订单明细表均显示后截图，再输入</w:t>
-      </w:r>
-      <w:r>
-        <w:rPr>
-          <w:color w:val="C00000"/>
-          <w:sz w:val="18"/>
-        </w:rPr>
-        <w:t xml:space="preserve"> 0 </w:t>
-      </w:r>
-      <w:r>
-        <w:rPr>
-          <w:color w:val="C00000"/>
-          <w:sz w:val="18"/>
-        </w:rPr>
-        <w:t>返回主菜单。</w:t>
+        <w:t>图 5-5  订单主表与订单明细</w:t>
       </w:r>
     </w:p>
     <w:p>
@@ -14217,10 +12716,7 @@
         <w:pStyle w:val="21"/>
       </w:pPr>
       <w:r>
-        <w:t xml:space="preserve">5.6 </w:t>
-      </w:r>
-      <w:r>
-        <w:t>取消订单并恢复库存</w:t>
+        <w:t>5.6 取消订单并恢复库存</w:t>
       </w:r>
     </w:p>
     <w:p>
@@ -14232,12 +12728,14 @@
       <w:r>
         <w:rPr>
           <w:noProof/>
+          <w:color w:val="C00000"/>
+          <w:sz w:val="18"/>
         </w:rPr>
         <w:drawing>
-          <wp:inline distT="0" distB="0" distL="0" distR="0" wp14:anchorId="2C639EA6" wp14:editId="04CA022D">
-            <wp:extent cx="5303520" cy="662940"/>
-            <wp:effectExtent l="0" t="0" r="0" b="0"/>
-            <wp:docPr id="9" name="Picture 9" descr="图 5-6  取消订单并恢复库存" title="图 5-6  取消订单并恢复库存"/>
+          <wp:inline distT="0" distB="0" distL="0" distR="0" wp14:anchorId="56C6B3E6" wp14:editId="4B501E82">
+            <wp:extent cx="3350895" cy="636905"/>
+            <wp:effectExtent l="0" t="0" r="1905" b="0"/>
+            <wp:docPr id="411177986" name="图片 6"/>
             <wp:cNvGraphicFramePr>
               <a:graphicFrameLocks xmlns:a="http://schemas.openxmlformats.org/drawingml/2006/main" noChangeAspect="1"/>
             </wp:cNvGraphicFramePr>
@@ -14245,23 +12743,36 @@
               <a:graphicData uri="http://schemas.openxmlformats.org/drawingml/2006/picture">
                 <pic:pic xmlns:pic="http://schemas.openxmlformats.org/drawingml/2006/picture">
                   <pic:nvPicPr>
-                    <pic:cNvPr id="0" name="console-cancel.png"/>
-                    <pic:cNvPicPr/>
+                    <pic:cNvPr id="0" name="图片 1"/>
+                    <pic:cNvPicPr>
+                      <a:picLocks noChangeAspect="1" noChangeArrowheads="1"/>
+                    </pic:cNvPicPr>
                   </pic:nvPicPr>
                   <pic:blipFill>
-                    <a:blip r:embed="rId15"/>
+                    <a:blip r:embed="rId15">
+                      <a:extLst>
+                        <a:ext uri="{28A0092B-C50C-407E-A947-70E740481C1C}">
+                          <a14:useLocalDpi xmlns:a14="http://schemas.microsoft.com/office/drawing/2010/main" val="0"/>
+                        </a:ext>
+                      </a:extLst>
+                    </a:blip>
+                    <a:srcRect/>
                     <a:stretch>
                       <a:fillRect/>
                     </a:stretch>
                   </pic:blipFill>
-                  <pic:spPr>
+                  <pic:spPr bwMode="auto">
                     <a:xfrm>
                       <a:off x="0" y="0"/>
-                      <a:ext cx="5303520" cy="662940"/>
+                      <a:ext cx="3350895" cy="636905"/>
                     </a:xfrm>
                     <a:prstGeom prst="rect">
                       <a:avLst/>
                     </a:prstGeom>
+                    <a:noFill/>
+                    <a:ln>
+                      <a:noFill/>
+                    </a:ln>
                   </pic:spPr>
                 </pic:pic>
               </a:graphicData>
@@ -14280,124 +12791,7 @@
         <w:rPr>
           <w:sz w:val="21"/>
         </w:rPr>
-        <w:t>图</w:t>
-      </w:r>
-      <w:r>
-        <w:rPr>
-          <w:sz w:val="21"/>
-        </w:rPr>
-        <w:t xml:space="preserve"> 5-6  </w:t>
-      </w:r>
-      <w:r>
-        <w:rPr>
-          <w:sz w:val="21"/>
-        </w:rPr>
-        <w:t>取消订单并恢复库存</w:t>
-      </w:r>
-    </w:p>
-    <w:p>
-      <w:pPr>
-        <w:spacing w:after="120" w:line="276" w:lineRule="auto"/>
-        <w:ind w:left="160" w:right="160" w:firstLine="0"/>
-      </w:pPr>
-      <w:r>
-        <w:rPr>
-          <w:b/>
-          <w:color w:val="C00000"/>
-          <w:sz w:val="18"/>
-        </w:rPr>
-        <w:t>手动截图方法：</w:t>
-      </w:r>
-      <w:r>
-        <w:rPr>
-          <w:color w:val="C00000"/>
-          <w:sz w:val="18"/>
-        </w:rPr>
-        <w:t>从主菜单输入</w:t>
-      </w:r>
-      <w:r>
-        <w:rPr>
-          <w:color w:val="C00000"/>
-          <w:sz w:val="18"/>
-        </w:rPr>
-        <w:t xml:space="preserve"> 4</w:t>
-      </w:r>
-      <w:r>
-        <w:rPr>
-          <w:color w:val="C00000"/>
-          <w:sz w:val="18"/>
-        </w:rPr>
-        <w:t>，在购买结算管理菜单输入</w:t>
-      </w:r>
-      <w:r>
-        <w:rPr>
-          <w:color w:val="C00000"/>
-          <w:sz w:val="18"/>
-        </w:rPr>
-        <w:t xml:space="preserve"> 2</w:t>
-      </w:r>
-      <w:r>
-        <w:rPr>
-          <w:color w:val="C00000"/>
-          <w:sz w:val="18"/>
-        </w:rPr>
-        <w:t>，订单编号输入</w:t>
-      </w:r>
-      <w:r>
-        <w:rPr>
-          <w:color w:val="C00000"/>
-          <w:sz w:val="18"/>
-        </w:rPr>
-        <w:t xml:space="preserve"> 2</w:t>
-      </w:r>
-      <w:r>
-        <w:rPr>
-          <w:color w:val="C00000"/>
-          <w:sz w:val="18"/>
-        </w:rPr>
-        <w:t>；出现</w:t>
-      </w:r>
-      <w:r>
-        <w:rPr>
-          <w:color w:val="C00000"/>
-          <w:sz w:val="18"/>
-        </w:rPr>
-        <w:t>“</w:t>
-      </w:r>
-      <w:r>
-        <w:rPr>
-          <w:color w:val="C00000"/>
-          <w:sz w:val="18"/>
-        </w:rPr>
-        <w:t>订单已取消，库存已恢复。</w:t>
-      </w:r>
-      <w:r>
-        <w:rPr>
-          <w:color w:val="C00000"/>
-          <w:sz w:val="18"/>
-        </w:rPr>
-        <w:t>”</w:t>
-      </w:r>
-      <w:r>
-        <w:rPr>
-          <w:color w:val="C00000"/>
-          <w:sz w:val="18"/>
-        </w:rPr>
-        <w:t>后截图，再输入</w:t>
-      </w:r>
-      <w:r>
-        <w:rPr>
-          <w:color w:val="C00000"/>
-          <w:sz w:val="18"/>
-        </w:rPr>
-        <w:t xml:space="preserve"> 0 </w:t>
-      </w:r>
-      <w:r>
-        <w:rPr>
-          <w:color w:val="C00000"/>
-          <w:sz w:val="18"/>
-        </w:rPr>
-        <w:t>返回主菜单。</w:t>
+        <w:t>图 5-6  取消订单并恢复库存</w:t>
       </w:r>
     </w:p>
     <w:p>
@@ -14410,10 +12804,8 @@
         <w:pStyle w:val="21"/>
       </w:pPr>
       <w:r>
-        <w:t xml:space="preserve">5.7 </w:t>
-      </w:r>
-      <w:r>
-        <w:t>销售统计与库存预警</w:t>
+        <w:lastRenderedPageBreak/>
+        <w:t>5.7 销售统计与库存预警</w:t>
       </w:r>
     </w:p>
     <w:p>
@@ -14425,12 +12817,14 @@
       <w:r>
         <w:rPr>
           <w:noProof/>
+          <w:color w:val="C00000"/>
+          <w:sz w:val="18"/>
         </w:rPr>
         <w:drawing>
-          <wp:inline distT="0" distB="0" distL="0" distR="0" wp14:anchorId="54C230D8" wp14:editId="38D8A6A9">
-            <wp:extent cx="5303520" cy="2240737"/>
-            <wp:effectExtent l="0" t="0" r="0" b="0"/>
-            <wp:docPr id="10" name="Picture 10" descr="图 5-7  销售统计和库存不足查询" title="图 5-7  销售统计和库存不足查询"/>
+          <wp:inline distT="0" distB="0" distL="0" distR="0" wp14:anchorId="684E44BF" wp14:editId="45B49F51">
+            <wp:extent cx="5274310" cy="3192145"/>
+            <wp:effectExtent l="0" t="0" r="2540" b="8255"/>
+            <wp:docPr id="552929360" name="图片 7"/>
             <wp:cNvGraphicFramePr>
               <a:graphicFrameLocks xmlns:a="http://schemas.openxmlformats.org/drawingml/2006/main" noChangeAspect="1"/>
             </wp:cNvGraphicFramePr>
@@ -14438,23 +12832,36 @@
               <a:graphicData uri="http://schemas.openxmlformats.org/drawingml/2006/picture">
                 <pic:pic xmlns:pic="http://schemas.openxmlformats.org/drawingml/2006/picture">
                   <pic:nvPicPr>
-                    <pic:cNvPr id="0" name="console-statistics.png"/>
-                    <pic:cNvPicPr/>
+                    <pic:cNvPr id="0" name="图片 1"/>
+                    <pic:cNvPicPr>
+                      <a:picLocks noChangeAspect="1" noChangeArrowheads="1"/>
+                    </pic:cNvPicPr>
                   </pic:nvPicPr>
                   <pic:blipFill>
-                    <a:blip r:embed="rId16"/>
+                    <a:blip r:embed="rId16">
+                      <a:extLst>
+                        <a:ext uri="{28A0092B-C50C-407E-A947-70E740481C1C}">
+                          <a14:useLocalDpi xmlns:a14="http://schemas.microsoft.com/office/drawing/2010/main" val="0"/>
+                        </a:ext>
+                      </a:extLst>
+                    </a:blip>
+                    <a:srcRect/>
                     <a:stretch>
                       <a:fillRect/>
                     </a:stretch>
                   </pic:blipFill>
-                  <pic:spPr>
+                  <pic:spPr bwMode="auto">
                     <a:xfrm>
                       <a:off x="0" y="0"/>
-                      <a:ext cx="5303520" cy="2240737"/>
+                      <a:ext cx="5274310" cy="3192145"/>
                     </a:xfrm>
                     <a:prstGeom prst="rect">
                       <a:avLst/>
                     </a:prstGeom>
+                    <a:noFill/>
+                    <a:ln>
+                      <a:noFill/>
+                    </a:ln>
                   </pic:spPr>
                 </pic:pic>
               </a:graphicData>
@@ -14473,153 +12880,21 @@
         <w:rPr>
           <w:sz w:val="21"/>
         </w:rPr>
-        <w:t>图</w:t>
-      </w:r>
-      <w:r>
-        <w:rPr>
-          <w:sz w:val="21"/>
-        </w:rPr>
-        <w:t xml:space="preserve"> 5-7  </w:t>
-      </w:r>
-      <w:r>
-        <w:rPr>
-          <w:sz w:val="21"/>
-        </w:rPr>
-        <w:t>销售统计和库存不足查询</w:t>
+        <w:t>图 5-7  销售统计和库存不足查询</w:t>
       </w:r>
     </w:p>
     <w:p>
-      <w:pPr>
-        <w:spacing w:after="120" w:line="276" w:lineRule="auto"/>
-        <w:ind w:left="160" w:right="160" w:firstLine="0"/>
-      </w:pPr>
-      <w:r>
-        <w:rPr>
-          <w:b/>
-          <w:color w:val="C00000"/>
-          <w:sz w:val="18"/>
-        </w:rPr>
-        <w:t>手动截图方法：</w:t>
-      </w:r>
-      <w:r>
-        <w:rPr>
-          <w:color w:val="C00000"/>
-          <w:sz w:val="18"/>
-        </w:rPr>
-        <w:t>从主菜单输入</w:t>
-      </w:r>
-      <w:r>
-        <w:rPr>
-          <w:color w:val="C00000"/>
-          <w:sz w:val="18"/>
-        </w:rPr>
-        <w:t xml:space="preserve"> 6</w:t>
-      </w:r>
-      <w:r>
-        <w:rPr>
-          <w:color w:val="C00000"/>
-          <w:sz w:val="18"/>
-        </w:rPr>
-        <w:t>；依次执行选项</w:t>
-      </w:r>
-      <w:r>
-        <w:rPr>
-          <w:color w:val="C00000"/>
-          <w:sz w:val="18"/>
-        </w:rPr>
-        <w:t xml:space="preserve"> 1</w:t>
-      </w:r>
-      <w:r>
-        <w:rPr>
-          <w:color w:val="C00000"/>
-          <w:sz w:val="18"/>
-        </w:rPr>
-        <w:t>（开始日期输入</w:t>
-      </w:r>
-      <w:r>
-        <w:rPr>
-          <w:color w:val="C00000"/>
-          <w:sz w:val="18"/>
-        </w:rPr>
-        <w:t xml:space="preserve"> 2026-01-01</w:t>
-      </w:r>
-      <w:r>
-        <w:rPr>
-          <w:color w:val="C00000"/>
-          <w:sz w:val="18"/>
-        </w:rPr>
-        <w:t>，结束日期输入</w:t>
-      </w:r>
-      <w:r>
-        <w:rPr>
-          <w:color w:val="C00000"/>
-          <w:sz w:val="18"/>
-        </w:rPr>
-        <w:t xml:space="preserve"> 2026-12-31</w:t>
-      </w:r>
-      <w:r>
-        <w:rPr>
-          <w:color w:val="C00000"/>
-          <w:sz w:val="18"/>
-        </w:rPr>
-        <w:t>）、选项</w:t>
-      </w:r>
-      <w:r>
-        <w:rPr>
-          <w:color w:val="C00000"/>
-          <w:sz w:val="18"/>
-        </w:rPr>
-        <w:t xml:space="preserve"> 2 </w:t>
-      </w:r>
-      <w:r>
-        <w:rPr>
-          <w:color w:val="C00000"/>
-          <w:sz w:val="18"/>
-        </w:rPr>
-        <w:t>和选项</w:t>
-      </w:r>
-      <w:r>
-        <w:rPr>
-          <w:color w:val="C00000"/>
-          <w:sz w:val="18"/>
-        </w:rPr>
-        <w:t xml:space="preserve"> 4</w:t>
-      </w:r>
-      <w:r>
-        <w:rPr>
-          <w:color w:val="C00000"/>
-          <w:sz w:val="18"/>
-        </w:rPr>
-        <w:t>，三个查询结果均显示后截图。</w:t>
-      </w:r>
-    </w:p>
-    <w:p>
-      <w:r>
-        <w:t>取消的演示订单不计入销售统计，因此日期区间销售总额仍为初始订单的</w:t>
-      </w:r>
-      <w:r>
-        <w:t xml:space="preserve"> 190 </w:t>
-      </w:r>
-      <w:r>
-        <w:t>元。销量排行只统计已完成订单；库存不足查询列出库存小于</w:t>
-      </w:r>
-      <w:r>
-        <w:t xml:space="preserve"> 20 </w:t>
-      </w:r>
-      <w:r>
-        <w:t>的红酒，为补货决策提供依据。</w:t>
+      <w:r>
+        <w:t>取消的演示订单不计入销售统计，因此日期区间销售总额仍为初始订单的 190 元。销量排行只统计已完成订单；库存不足查询列出库存小于 20 的红酒，为补货决策提供依据。</w:t>
       </w:r>
     </w:p>
     <w:p>
       <w:pPr>
         <w:pStyle w:val="11"/>
       </w:pPr>
-      <w:bookmarkStart w:id="5" w:name="_Toc235143186"/>
-      <w:r>
-        <w:t xml:space="preserve">6 </w:t>
-      </w:r>
-      <w:r>
-        <w:t>团队分工</w:t>
+      <w:bookmarkStart w:id="5" w:name="_Toc235194136"/>
+      <w:r>
+        <w:t>6 团队分工</w:t>
       </w:r>
       <w:bookmarkEnd w:id="5"/>
     </w:p>
@@ -14832,55 +13107,7 @@
               <w:rPr>
                 <w:sz w:val="18"/>
               </w:rPr>
-              <w:t>负责</w:t>
-            </w:r>
-            <w:r>
-              <w:rPr>
-                <w:sz w:val="18"/>
-              </w:rPr>
-              <w:t xml:space="preserve"> Main</w:t>
-            </w:r>
-            <w:r>
-              <w:rPr>
-                <w:sz w:val="18"/>
-              </w:rPr>
-              <w:t>、</w:t>
-            </w:r>
-            <w:r>
-              <w:rPr>
-                <w:sz w:val="18"/>
-              </w:rPr>
-              <w:t>BaseDao</w:t>
-            </w:r>
-            <w:r>
-              <w:rPr>
-                <w:sz w:val="18"/>
-              </w:rPr>
-              <w:t>、</w:t>
-            </w:r>
-            <w:r>
-              <w:rPr>
-                <w:sz w:val="18"/>
-              </w:rPr>
-              <w:t>DBUtil</w:t>
-            </w:r>
-            <w:r>
-              <w:rPr>
-                <w:sz w:val="18"/>
-              </w:rPr>
-              <w:t>；确定</w:t>
-            </w:r>
-            <w:r>
-              <w:rPr>
-                <w:sz w:val="18"/>
-              </w:rPr>
-              <w:t xml:space="preserve"> Maven/JDBC/SQLite </w:t>
-            </w:r>
-            <w:r>
-              <w:rPr>
-                <w:sz w:val="18"/>
-              </w:rPr>
-              <w:t>技术方案；搭建分层目录；维护仓库并组织联调和文档整合</w:t>
+              <w:t>负责 Main、BaseDao、DBUtil；确定 Maven/JDBC/SQLite 技术方案；搭建分层目录；维护仓库并组织联调和文档整合</w:t>
             </w:r>
           </w:p>
         </w:tc>
@@ -14981,43 +13208,7 @@
               <w:rPr>
                 <w:sz w:val="18"/>
               </w:rPr>
-              <w:t>负责</w:t>
-            </w:r>
-            <w:r>
-              <w:rPr>
-                <w:sz w:val="18"/>
-              </w:rPr>
-              <w:t xml:space="preserve"> Wine </w:t>
-            </w:r>
-            <w:r>
-              <w:rPr>
-                <w:sz w:val="18"/>
-              </w:rPr>
-              <w:t>实体、</w:t>
-            </w:r>
-            <w:r>
-              <w:rPr>
-                <w:sz w:val="18"/>
-              </w:rPr>
-              <w:t>WineDao</w:t>
-            </w:r>
-            <w:r>
-              <w:rPr>
-                <w:sz w:val="18"/>
-              </w:rPr>
-              <w:t>、</w:t>
-            </w:r>
-            <w:r>
-              <w:rPr>
-                <w:sz w:val="18"/>
-              </w:rPr>
-              <w:t>WineService</w:t>
-            </w:r>
-            <w:r>
-              <w:rPr>
-                <w:sz w:val="18"/>
-              </w:rPr>
-              <w:t>；实现红酒增删改查、上下架、库存不足查询；核对红酒种子数据</w:t>
+              <w:t>负责 Wine 实体、WineDao、WineService；实现红酒增删改查、上下架、库存不足查询；核对红酒种子数据</w:t>
             </w:r>
           </w:p>
         </w:tc>
@@ -15070,6 +13261,7 @@
               <w:rPr>
                 <w:sz w:val="18"/>
               </w:rPr>
+              <w:lastRenderedPageBreak/>
               <w:t>王福淇</w:t>
             </w:r>
           </w:p>
@@ -15118,43 +13310,7 @@
               <w:rPr>
                 <w:sz w:val="18"/>
               </w:rPr>
-              <w:t>负责</w:t>
-            </w:r>
-            <w:r>
-              <w:rPr>
-                <w:sz w:val="18"/>
-              </w:rPr>
-              <w:t xml:space="preserve"> Origin </w:t>
-            </w:r>
-            <w:r>
-              <w:rPr>
-                <w:sz w:val="18"/>
-              </w:rPr>
-              <w:t>实体、</w:t>
-            </w:r>
-            <w:r>
-              <w:rPr>
-                <w:sz w:val="18"/>
-              </w:rPr>
-              <w:t>OriginDao</w:t>
-            </w:r>
-            <w:r>
-              <w:rPr>
-                <w:sz w:val="18"/>
-              </w:rPr>
-              <w:t>、</w:t>
-            </w:r>
-            <w:r>
-              <w:rPr>
-                <w:sz w:val="18"/>
-              </w:rPr>
-              <w:t>OriginService</w:t>
-            </w:r>
-            <w:r>
-              <w:rPr>
-                <w:sz w:val="18"/>
-              </w:rPr>
-              <w:t>；实现国内外产地字段规则、关联查询与删除约束；整理产地数据</w:t>
+              <w:t>负责 Origin 实体、OriginDao、OriginService；实现国内外产地字段规则、关联查询与删除约束；整理产地数据</w:t>
             </w:r>
           </w:p>
         </w:tc>
@@ -15255,43 +13411,7 @@
               <w:rPr>
                 <w:sz w:val="18"/>
               </w:rPr>
-              <w:t>负责</w:t>
-            </w:r>
-            <w:r>
-              <w:rPr>
-                <w:sz w:val="18"/>
-              </w:rPr>
-              <w:t xml:space="preserve"> Customer </w:t>
-            </w:r>
-            <w:r>
-              <w:rPr>
-                <w:sz w:val="18"/>
-              </w:rPr>
-              <w:t>实体、</w:t>
-            </w:r>
-            <w:r>
-              <w:rPr>
-                <w:sz w:val="18"/>
-              </w:rPr>
-              <w:t>CustomerDao</w:t>
-            </w:r>
-            <w:r>
-              <w:rPr>
-                <w:sz w:val="18"/>
-              </w:rPr>
-              <w:t>、</w:t>
-            </w:r>
-            <w:r>
-              <w:rPr>
-                <w:sz w:val="18"/>
-              </w:rPr>
-              <w:t>CustomerService</w:t>
-            </w:r>
-            <w:r>
-              <w:rPr>
-                <w:sz w:val="18"/>
-              </w:rPr>
-              <w:t>；实现客户档案、手机号与会员等级校验、客户购买记录查询</w:t>
+              <w:t>负责 Customer 实体、CustomerDao、CustomerService；实现客户档案、手机号与会员等级校验、客户购买记录查询</w:t>
             </w:r>
           </w:p>
         </w:tc>
@@ -15392,43 +13512,7 @@
               <w:rPr>
                 <w:sz w:val="18"/>
               </w:rPr>
-              <w:t>负责</w:t>
-            </w:r>
-            <w:r>
-              <w:rPr>
-                <w:sz w:val="18"/>
-              </w:rPr>
-              <w:t xml:space="preserve"> SaleOrder</w:t>
-            </w:r>
-            <w:r>
-              <w:rPr>
-                <w:sz w:val="18"/>
-              </w:rPr>
-              <w:t>、</w:t>
-            </w:r>
-            <w:r>
-              <w:rPr>
-                <w:sz w:val="18"/>
-              </w:rPr>
-              <w:t>OrderService</w:t>
-            </w:r>
-            <w:r>
-              <w:rPr>
-                <w:sz w:val="18"/>
-              </w:rPr>
-              <w:t>；实现库存校验、四档会员折扣、</w:t>
-            </w:r>
-            <w:r>
-              <w:rPr>
-                <w:sz w:val="18"/>
-              </w:rPr>
-              <w:t xml:space="preserve">BigDecimal </w:t>
-            </w:r>
-            <w:r>
-              <w:rPr>
-                <w:sz w:val="18"/>
-              </w:rPr>
-              <w:t>金额计算、订单事务提交与回滚</w:t>
+              <w:t>负责 SaleOrder、OrderService；实现库存校验、四档会员折扣、BigDecimal 金额计算、订单事务提交与回滚</w:t>
             </w:r>
           </w:p>
         </w:tc>
@@ -15529,43 +13613,7 @@
               <w:rPr>
                 <w:sz w:val="18"/>
               </w:rPr>
-              <w:t>负责</w:t>
-            </w:r>
-            <w:r>
-              <w:rPr>
-                <w:sz w:val="18"/>
-              </w:rPr>
-              <w:t xml:space="preserve"> SaleOrderItem</w:t>
-            </w:r>
-            <w:r>
-              <w:rPr>
-                <w:sz w:val="18"/>
-              </w:rPr>
-              <w:t>、</w:t>
-            </w:r>
-            <w:r>
-              <w:rPr>
-                <w:sz w:val="18"/>
-              </w:rPr>
-              <w:t>SaleOrderDao</w:t>
-            </w:r>
-            <w:r>
-              <w:rPr>
-                <w:sz w:val="18"/>
-              </w:rPr>
-              <w:t>、</w:t>
-            </w:r>
-            <w:r>
-              <w:rPr>
-                <w:sz w:val="18"/>
-              </w:rPr>
-              <w:t>SaleOrderItemDao</w:t>
-            </w:r>
-            <w:r>
-              <w:rPr>
-                <w:sz w:val="18"/>
-              </w:rPr>
-              <w:t>；实现订单详情、条件查询及订单明细的数据访问</w:t>
+              <w:t>负责 SaleOrderItem、SaleOrderDao、SaleOrderItemDao；实现订单详情、条件查询及订单明细的数据访问</w:t>
             </w:r>
           </w:p>
         </w:tc>
@@ -15666,31 +13714,7 @@
               <w:rPr>
                 <w:sz w:val="18"/>
               </w:rPr>
-              <w:t>负责</w:t>
-            </w:r>
-            <w:r>
-              <w:rPr>
-                <w:sz w:val="18"/>
-              </w:rPr>
-              <w:t xml:space="preserve"> StatisticsDao</w:t>
-            </w:r>
-            <w:r>
-              <w:rPr>
-                <w:sz w:val="18"/>
-              </w:rPr>
-              <w:t>、</w:t>
-            </w:r>
-            <w:r>
-              <w:rPr>
-                <w:sz w:val="18"/>
-              </w:rPr>
-              <w:t>StatisticsService</w:t>
-            </w:r>
-            <w:r>
-              <w:rPr>
-                <w:sz w:val="18"/>
-              </w:rPr>
-              <w:t>；实现区间销售总额、销量排行、单品销售、客户消费总额和库存预警</w:t>
+              <w:t>负责 StatisticsDao、StatisticsService；实现区间销售总额、销量排行、单品销售、客户消费总额和库存预警</w:t>
             </w:r>
           </w:p>
         </w:tc>
@@ -15791,55 +13815,7 @@
               <w:rPr>
                 <w:sz w:val="18"/>
               </w:rPr>
-              <w:t>负责</w:t>
-            </w:r>
-            <w:r>
-              <w:rPr>
-                <w:sz w:val="18"/>
-              </w:rPr>
-              <w:t xml:space="preserve"> InputUtil</w:t>
-            </w:r>
-            <w:r>
-              <w:rPr>
-                <w:sz w:val="18"/>
-              </w:rPr>
-              <w:t>、</w:t>
-            </w:r>
-            <w:r>
-              <w:rPr>
-                <w:sz w:val="18"/>
-              </w:rPr>
-              <w:t>TableUtil</w:t>
-            </w:r>
-            <w:r>
-              <w:rPr>
-                <w:sz w:val="18"/>
-              </w:rPr>
-              <w:t>、</w:t>
-            </w:r>
-            <w:r>
-              <w:rPr>
-                <w:sz w:val="18"/>
-              </w:rPr>
-              <w:t>DateUtil</w:t>
-            </w:r>
-            <w:r>
-              <w:rPr>
-                <w:sz w:val="18"/>
-              </w:rPr>
-              <w:t>；完善非法输入循环重试、日期格式校验、</w:t>
-            </w:r>
-            <w:r>
-              <w:rPr>
-                <w:sz w:val="18"/>
-              </w:rPr>
-              <w:t xml:space="preserve">UTF-8 </w:t>
-            </w:r>
-            <w:r>
-              <w:rPr>
-                <w:sz w:val="18"/>
-              </w:rPr>
-              <w:t>编码和中英文表格对齐</w:t>
+              <w:t>负责 InputUtil、TableUtil、DateUtil；完善非法输入循环重试、日期格式校验、UTF-8 编码和中英文表格对齐</w:t>
             </w:r>
           </w:p>
         </w:tc>
@@ -15940,43 +13916,7 @@
               <w:rPr>
                 <w:sz w:val="18"/>
               </w:rPr>
-              <w:t>负责</w:t>
-            </w:r>
-            <w:r>
-              <w:rPr>
-                <w:sz w:val="18"/>
-              </w:rPr>
-              <w:t xml:space="preserve"> ConsoleMenu</w:t>
-            </w:r>
-            <w:r>
-              <w:rPr>
-                <w:sz w:val="18"/>
-              </w:rPr>
-              <w:t>、</w:t>
-            </w:r>
-            <w:r>
-              <w:rPr>
-                <w:sz w:val="18"/>
-              </w:rPr>
-              <w:t>CancelException</w:t>
-            </w:r>
-            <w:r>
-              <w:rPr>
-                <w:sz w:val="18"/>
-              </w:rPr>
-              <w:t>；串联菜单与取消流程；执行回归和边界测试；核对</w:t>
-            </w:r>
-            <w:r>
-              <w:rPr>
-                <w:sz w:val="18"/>
-              </w:rPr>
-              <w:t xml:space="preserve"> README</w:t>
-            </w:r>
-            <w:r>
-              <w:rPr>
-                <w:sz w:val="18"/>
-              </w:rPr>
-              <w:t>、报告格式和截图</w:t>
+              <w:t>负责 ConsoleMenu、CancelException；串联菜单与取消流程；执行回归和边界测试；核对 README、报告格式和截图</w:t>
             </w:r>
           </w:p>
         </w:tc>

</xml_diff>